<commit_message>
PRAKTIKUM 3 – SCRIPT OPTIMIZATION: B. Menggunakan next/script
</commit_message>
<xml_diff>
--- a/Laporan/03_Ahmad Dzul Fadhli Jobsheet 18&19.docx
+++ b/Laporan/03_Ahmad Dzul Fadhli Jobsheet 18&19.docx
@@ -1470,6 +1470,2295 @@
       <w:proofErr w:type="spellEnd"/>
       <w:r>
         <w:t xml:space="preserve"> next/script</w:t>
+      </w:r>
+    </w:p>
+    <w:p>
+      <w:r>
+        <w:t xml:space="preserve">Buka file </w:t>
+      </w:r>
+      <w:proofErr w:type="spellStart"/>
+      <w:r>
+        <w:t>index.tsx</w:t>
+      </w:r>
+      <w:proofErr w:type="spellEnd"/>
+      <w:r>
+        <w:t xml:space="preserve"> pada folder layouts/Navbar dan </w:t>
+      </w:r>
+      <w:proofErr w:type="spellStart"/>
+      <w:r>
+        <w:t>modifikasi</w:t>
+      </w:r>
+      <w:proofErr w:type="spellEnd"/>
+    </w:p>
+    <w:p>
+      <w:r>
+        <w:drawing>
+          <wp:inline distT="0" distB="0" distL="0" distR="0" wp14:anchorId="173D4692" wp14:editId="0034B5A1">
+            <wp:extent cx="2880000" cy="663385"/>
+            <wp:effectExtent l="0" t="0" r="0" b="3810"/>
+            <wp:docPr id="1369688551" name="Picture 1"/>
+            <wp:cNvGraphicFramePr>
+              <a:graphicFrameLocks xmlns:a="http://schemas.openxmlformats.org/drawingml/2006/main" noChangeAspect="1"/>
+            </wp:cNvGraphicFramePr>
+            <a:graphic xmlns:a="http://schemas.openxmlformats.org/drawingml/2006/main">
+              <a:graphicData uri="http://schemas.openxmlformats.org/drawingml/2006/picture">
+                <pic:pic xmlns:pic="http://schemas.openxmlformats.org/drawingml/2006/picture">
+                  <pic:nvPicPr>
+                    <pic:cNvPr id="1369688551" name=""/>
+                    <pic:cNvPicPr/>
+                  </pic:nvPicPr>
+                  <pic:blipFill>
+                    <a:blip r:embed="rId18"/>
+                    <a:stretch>
+                      <a:fillRect/>
+                    </a:stretch>
+                  </pic:blipFill>
+                  <pic:spPr>
+                    <a:xfrm>
+                      <a:off x="0" y="0"/>
+                      <a:ext cx="2880000" cy="663385"/>
+                    </a:xfrm>
+                    <a:prstGeom prst="rect">
+                      <a:avLst/>
+                    </a:prstGeom>
+                  </pic:spPr>
+                </pic:pic>
+              </a:graphicData>
+            </a:graphic>
+          </wp:inline>
+        </w:drawing>
+      </w:r>
+    </w:p>
+    <w:p>
+      <w:r>
+        <w:drawing>
+          <wp:inline distT="0" distB="0" distL="0" distR="0" wp14:anchorId="3A77486F" wp14:editId="028C2715">
+            <wp:extent cx="2880000" cy="1217538"/>
+            <wp:effectExtent l="0" t="0" r="0" b="1905"/>
+            <wp:docPr id="1094558120" name="Picture 1"/>
+            <wp:cNvGraphicFramePr>
+              <a:graphicFrameLocks xmlns:a="http://schemas.openxmlformats.org/drawingml/2006/main" noChangeAspect="1"/>
+            </wp:cNvGraphicFramePr>
+            <a:graphic xmlns:a="http://schemas.openxmlformats.org/drawingml/2006/main">
+              <a:graphicData uri="http://schemas.openxmlformats.org/drawingml/2006/picture">
+                <pic:pic xmlns:pic="http://schemas.openxmlformats.org/drawingml/2006/picture">
+                  <pic:nvPicPr>
+                    <pic:cNvPr id="1094558120" name=""/>
+                    <pic:cNvPicPr/>
+                  </pic:nvPicPr>
+                  <pic:blipFill>
+                    <a:blip r:embed="rId19"/>
+                    <a:stretch>
+                      <a:fillRect/>
+                    </a:stretch>
+                  </pic:blipFill>
+                  <pic:spPr>
+                    <a:xfrm>
+                      <a:off x="0" y="0"/>
+                      <a:ext cx="2880000" cy="1217538"/>
+                    </a:xfrm>
+                    <a:prstGeom prst="rect">
+                      <a:avLst/>
+                    </a:prstGeom>
+                  </pic:spPr>
+                </pic:pic>
+              </a:graphicData>
+            </a:graphic>
+          </wp:inline>
+        </w:drawing>
+      </w:r>
+    </w:p>
+    <w:p>
+      <w:pPr>
+        <w:rPr>
+          <w:lang w:val="en-ID"/>
+        </w:rPr>
+      </w:pPr>
+      <w:r>
+        <w:rPr>
+          <w:lang w:val="en-ID"/>
+        </w:rPr>
+        <w:t xml:space="preserve">Pada </w:t>
+      </w:r>
+      <w:proofErr w:type="spellStart"/>
+      <w:r>
+        <w:rPr>
+          <w:lang w:val="en-ID"/>
+        </w:rPr>
+        <w:t>kasus</w:t>
+      </w:r>
+      <w:proofErr w:type="spellEnd"/>
+      <w:r>
+        <w:rPr>
+          <w:lang w:val="en-ID"/>
+        </w:rPr>
+        <w:t xml:space="preserve"> </w:t>
+      </w:r>
+      <w:proofErr w:type="spellStart"/>
+      <w:r>
+        <w:rPr>
+          <w:lang w:val="en-ID"/>
+        </w:rPr>
+        <w:t>diatas</w:t>
+      </w:r>
+      <w:proofErr w:type="spellEnd"/>
+      <w:r>
+        <w:rPr>
+          <w:lang w:val="en-ID"/>
+        </w:rPr>
+        <w:t xml:space="preserve"> </w:t>
+      </w:r>
+      <w:proofErr w:type="spellStart"/>
+      <w:r>
+        <w:rPr>
+          <w:lang w:val="en-ID"/>
+        </w:rPr>
+        <w:t>kita</w:t>
+      </w:r>
+      <w:proofErr w:type="spellEnd"/>
+      <w:r>
+        <w:rPr>
+          <w:lang w:val="en-ID"/>
+        </w:rPr>
+        <w:t xml:space="preserve"> </w:t>
+      </w:r>
+      <w:proofErr w:type="spellStart"/>
+      <w:r>
+        <w:rPr>
+          <w:lang w:val="en-ID"/>
+        </w:rPr>
+        <w:t>merubah</w:t>
+      </w:r>
+      <w:proofErr w:type="spellEnd"/>
+      <w:r>
+        <w:rPr>
+          <w:lang w:val="en-ID"/>
+        </w:rPr>
+        <w:t xml:space="preserve"> line 11 </w:t>
+      </w:r>
+      <w:proofErr w:type="spellStart"/>
+      <w:r>
+        <w:rPr>
+          <w:lang w:val="en-ID"/>
+        </w:rPr>
+        <w:t>menggunakan</w:t>
+      </w:r>
+      <w:proofErr w:type="spellEnd"/>
+      <w:r>
+        <w:rPr>
+          <w:lang w:val="en-ID"/>
+        </w:rPr>
+        <w:t xml:space="preserve"> model Typescript </w:t>
+      </w:r>
+      <w:proofErr w:type="spellStart"/>
+      <w:r>
+        <w:rPr>
+          <w:lang w:val="en-ID"/>
+        </w:rPr>
+        <w:t>dapat</w:t>
+      </w:r>
+      <w:proofErr w:type="spellEnd"/>
+      <w:r>
+        <w:rPr>
+          <w:lang w:val="en-ID"/>
+        </w:rPr>
+        <w:t xml:space="preserve"> </w:t>
+      </w:r>
+      <w:proofErr w:type="spellStart"/>
+      <w:r>
+        <w:rPr>
+          <w:lang w:val="en-ID"/>
+        </w:rPr>
+        <w:t>terlihat</w:t>
+      </w:r>
+      <w:proofErr w:type="spellEnd"/>
+      <w:r>
+        <w:rPr>
+          <w:lang w:val="en-ID"/>
+        </w:rPr>
+        <w:t xml:space="preserve"> </w:t>
+      </w:r>
+      <w:proofErr w:type="spellStart"/>
+      <w:r>
+        <w:rPr>
+          <w:lang w:val="en-ID"/>
+        </w:rPr>
+        <w:t>ketika</w:t>
+      </w:r>
+      <w:proofErr w:type="spellEnd"/>
+      <w:r>
+        <w:rPr>
+          <w:lang w:val="en-ID"/>
+        </w:rPr>
+        <w:t xml:space="preserve"> </w:t>
+      </w:r>
+      <w:proofErr w:type="spellStart"/>
+      <w:r>
+        <w:rPr>
+          <w:lang w:val="en-ID"/>
+        </w:rPr>
+        <w:t>kita</w:t>
+      </w:r>
+      <w:proofErr w:type="spellEnd"/>
+      <w:r>
+        <w:rPr>
+          <w:lang w:val="en-ID"/>
+        </w:rPr>
+        <w:t xml:space="preserve"> refresh web </w:t>
+      </w:r>
+      <w:proofErr w:type="spellStart"/>
+      <w:r>
+        <w:rPr>
+          <w:lang w:val="en-ID"/>
+        </w:rPr>
+        <w:t>produk</w:t>
+      </w:r>
+      <w:proofErr w:type="spellEnd"/>
+      <w:r>
+        <w:rPr>
+          <w:lang w:val="en-ID"/>
+        </w:rPr>
+        <w:t xml:space="preserve"> tulisan </w:t>
+      </w:r>
+      <w:proofErr w:type="spellStart"/>
+      <w:r>
+        <w:rPr>
+          <w:lang w:val="en-ID"/>
+        </w:rPr>
+        <w:t>myApp</w:t>
+      </w:r>
+      <w:proofErr w:type="spellEnd"/>
+      <w:r>
+        <w:rPr>
+          <w:lang w:val="en-ID"/>
+        </w:rPr>
+        <w:t xml:space="preserve"> </w:t>
+      </w:r>
+      <w:proofErr w:type="spellStart"/>
+      <w:r>
+        <w:rPr>
+          <w:lang w:val="en-ID"/>
+        </w:rPr>
+        <w:t>akan</w:t>
+      </w:r>
+      <w:proofErr w:type="spellEnd"/>
+      <w:r>
+        <w:rPr>
+          <w:lang w:val="en-ID"/>
+        </w:rPr>
+        <w:t xml:space="preserve"> </w:t>
+      </w:r>
+      <w:proofErr w:type="spellStart"/>
+      <w:r>
+        <w:rPr>
+          <w:lang w:val="en-ID"/>
+        </w:rPr>
+        <w:t>terlihat</w:t>
+      </w:r>
+      <w:proofErr w:type="spellEnd"/>
+      <w:r>
+        <w:rPr>
+          <w:lang w:val="en-ID"/>
+        </w:rPr>
+        <w:t xml:space="preserve"> </w:t>
+      </w:r>
+      <w:proofErr w:type="spellStart"/>
+      <w:r>
+        <w:rPr>
+          <w:lang w:val="en-ID"/>
+        </w:rPr>
+        <w:t>berkedip</w:t>
+      </w:r>
+      <w:proofErr w:type="spellEnd"/>
+    </w:p>
+    <w:p>
+      <w:pPr>
+        <w:rPr>
+          <w:lang w:val="en-ID"/>
+        </w:rPr>
+      </w:pPr>
+      <w:proofErr w:type="spellStart"/>
+      <w:r>
+        <w:rPr>
+          <w:lang w:val="en-ID"/>
+        </w:rPr>
+        <w:t>Perbedaan</w:t>
+      </w:r>
+      <w:proofErr w:type="spellEnd"/>
+      <w:r>
+        <w:rPr>
+          <w:lang w:val="en-ID"/>
+        </w:rPr>
+        <w:t xml:space="preserve"> </w:t>
+      </w:r>
+      <w:proofErr w:type="spellStart"/>
+      <w:r>
+        <w:rPr>
+          <w:lang w:val="en-ID"/>
+        </w:rPr>
+        <w:t>mendasar</w:t>
+      </w:r>
+      <w:proofErr w:type="spellEnd"/>
+      <w:r>
+        <w:rPr>
+          <w:lang w:val="en-ID"/>
+        </w:rPr>
+        <w:t xml:space="preserve"> </w:t>
+      </w:r>
+      <w:proofErr w:type="spellStart"/>
+      <w:r>
+        <w:rPr>
+          <w:lang w:val="en-ID"/>
+        </w:rPr>
+        <w:t>antara</w:t>
+      </w:r>
+      <w:proofErr w:type="spellEnd"/>
+      <w:r>
+        <w:rPr>
+          <w:lang w:val="en-ID"/>
+        </w:rPr>
+        <w:t xml:space="preserve"> Line 11-13 dan Line 15-18 pada file </w:t>
+      </w:r>
+      <w:proofErr w:type="spellStart"/>
+      <w:r>
+        <w:rPr>
+          <w:lang w:val="en-ID"/>
+        </w:rPr>
+        <w:t>index.tsx</w:t>
+      </w:r>
+      <w:proofErr w:type="spellEnd"/>
+      <w:r>
+        <w:rPr>
+          <w:lang w:val="en-ID"/>
+        </w:rPr>
+        <w:t xml:space="preserve"> Anda</w:t>
+      </w:r>
+      <w:r>
+        <w:rPr>
+          <w:lang w:val="en-ID"/>
+        </w:rPr>
+        <w:t xml:space="preserve"> </w:t>
+      </w:r>
+      <w:proofErr w:type="spellStart"/>
+      <w:r>
+        <w:rPr>
+          <w:lang w:val="en-ID"/>
+        </w:rPr>
+        <w:t>terletak</w:t>
+      </w:r>
+      <w:proofErr w:type="spellEnd"/>
+      <w:r>
+        <w:rPr>
+          <w:lang w:val="en-ID"/>
+        </w:rPr>
+        <w:t xml:space="preserve"> pada </w:t>
+      </w:r>
+      <w:proofErr w:type="spellStart"/>
+      <w:r>
+        <w:rPr>
+          <w:lang w:val="en-ID"/>
+        </w:rPr>
+        <w:t>metode</w:t>
+      </w:r>
+      <w:proofErr w:type="spellEnd"/>
+      <w:r>
+        <w:rPr>
+          <w:lang w:val="en-ID"/>
+        </w:rPr>
+        <w:t xml:space="preserve"> rendering </w:t>
+      </w:r>
+      <w:proofErr w:type="spellStart"/>
+      <w:r>
+        <w:rPr>
+          <w:lang w:val="en-ID"/>
+        </w:rPr>
+        <w:t>teks</w:t>
+      </w:r>
+      <w:proofErr w:type="spellEnd"/>
+      <w:r>
+        <w:rPr>
+          <w:lang w:val="en-ID"/>
+        </w:rPr>
+        <w:t xml:space="preserve"> dan </w:t>
+      </w:r>
+      <w:proofErr w:type="spellStart"/>
+      <w:r>
+        <w:rPr>
+          <w:lang w:val="en-ID"/>
+        </w:rPr>
+        <w:t>interaksi</w:t>
+      </w:r>
+      <w:proofErr w:type="spellEnd"/>
+      <w:r>
+        <w:rPr>
+          <w:lang w:val="en-ID"/>
+        </w:rPr>
+        <w:t xml:space="preserve"> </w:t>
+      </w:r>
+      <w:proofErr w:type="spellStart"/>
+      <w:r>
+        <w:rPr>
+          <w:lang w:val="en-ID"/>
+        </w:rPr>
+        <w:t>dengan</w:t>
+      </w:r>
+      <w:proofErr w:type="spellEnd"/>
+      <w:r>
+        <w:rPr>
+          <w:lang w:val="en-ID"/>
+        </w:rPr>
+        <w:t xml:space="preserve"> DOM (Document</w:t>
+      </w:r>
+      <w:r>
+        <w:rPr>
+          <w:lang w:val="en-ID"/>
+        </w:rPr>
+        <w:t xml:space="preserve"> </w:t>
+      </w:r>
+      <w:r>
+        <w:rPr>
+          <w:lang w:val="en-ID"/>
+        </w:rPr>
+        <w:t xml:space="preserve">Object Model). </w:t>
+      </w:r>
+      <w:proofErr w:type="spellStart"/>
+      <w:r>
+        <w:rPr>
+          <w:lang w:val="en-ID"/>
+        </w:rPr>
+        <w:t>Berikut</w:t>
+      </w:r>
+      <w:proofErr w:type="spellEnd"/>
+      <w:r>
+        <w:rPr>
+          <w:lang w:val="en-ID"/>
+        </w:rPr>
+        <w:t xml:space="preserve"> </w:t>
+      </w:r>
+      <w:proofErr w:type="spellStart"/>
+      <w:r>
+        <w:rPr>
+          <w:lang w:val="en-ID"/>
+        </w:rPr>
+        <w:t>adalah</w:t>
+      </w:r>
+      <w:proofErr w:type="spellEnd"/>
+      <w:r>
+        <w:rPr>
+          <w:lang w:val="en-ID"/>
+        </w:rPr>
+        <w:t xml:space="preserve"> </w:t>
+      </w:r>
+      <w:proofErr w:type="spellStart"/>
+      <w:r>
+        <w:rPr>
+          <w:lang w:val="en-ID"/>
+        </w:rPr>
+        <w:t>rincian</w:t>
+      </w:r>
+      <w:proofErr w:type="spellEnd"/>
+      <w:r>
+        <w:rPr>
+          <w:lang w:val="en-ID"/>
+        </w:rPr>
+        <w:t xml:space="preserve"> </w:t>
+      </w:r>
+      <w:proofErr w:type="spellStart"/>
+      <w:r>
+        <w:rPr>
+          <w:lang w:val="en-ID"/>
+        </w:rPr>
+        <w:t>perbedaannya</w:t>
+      </w:r>
+      <w:proofErr w:type="spellEnd"/>
+      <w:r>
+        <w:rPr>
+          <w:lang w:val="en-ID"/>
+        </w:rPr>
+        <w:t>:</w:t>
+      </w:r>
+    </w:p>
+    <w:p>
+      <w:pPr>
+        <w:pStyle w:val="ListParagraph"/>
+        <w:numPr>
+          <w:ilvl w:val="0"/>
+          <w:numId w:val="8"/>
+        </w:numPr>
+        <w:rPr>
+          <w:lang w:val="en-ID"/>
+        </w:rPr>
+      </w:pPr>
+      <w:r>
+        <w:rPr>
+          <w:lang w:val="en-ID"/>
+        </w:rPr>
+        <w:t>Metode Rendering</w:t>
+      </w:r>
+    </w:p>
+    <w:p>
+      <w:pPr>
+        <w:pStyle w:val="ListParagraph"/>
+        <w:numPr>
+          <w:ilvl w:val="1"/>
+          <w:numId w:val="10"/>
+        </w:numPr>
+        <w:rPr>
+          <w:lang w:val="en-ID"/>
+        </w:rPr>
+      </w:pPr>
+      <w:r>
+        <w:rPr>
+          <w:lang w:val="en-ID"/>
+        </w:rPr>
+        <w:t xml:space="preserve">Line 11-13 (Standard React/JSX): Ini </w:t>
+      </w:r>
+      <w:proofErr w:type="spellStart"/>
+      <w:r>
+        <w:rPr>
+          <w:lang w:val="en-ID"/>
+        </w:rPr>
+        <w:t>adalah</w:t>
+      </w:r>
+      <w:proofErr w:type="spellEnd"/>
+      <w:r>
+        <w:rPr>
+          <w:lang w:val="en-ID"/>
+        </w:rPr>
+        <w:t xml:space="preserve"> </w:t>
+      </w:r>
+      <w:proofErr w:type="spellStart"/>
+      <w:r>
+        <w:rPr>
+          <w:lang w:val="en-ID"/>
+        </w:rPr>
+        <w:t>cara</w:t>
+      </w:r>
+      <w:proofErr w:type="spellEnd"/>
+      <w:r>
+        <w:rPr>
+          <w:lang w:val="en-ID"/>
+        </w:rPr>
+        <w:t xml:space="preserve"> </w:t>
+      </w:r>
+      <w:proofErr w:type="spellStart"/>
+      <w:r>
+        <w:rPr>
+          <w:lang w:val="en-ID"/>
+        </w:rPr>
+        <w:t>standar</w:t>
+      </w:r>
+      <w:proofErr w:type="spellEnd"/>
+      <w:r>
+        <w:rPr>
+          <w:lang w:val="en-ID"/>
+        </w:rPr>
+        <w:t xml:space="preserve"> React.</w:t>
+      </w:r>
+      <w:r>
+        <w:rPr>
+          <w:lang w:val="en-ID"/>
+        </w:rPr>
+        <w:t xml:space="preserve"> </w:t>
+      </w:r>
+      <w:r>
+        <w:rPr>
+          <w:lang w:val="en-ID"/>
+        </w:rPr>
+        <w:t>Teks "</w:t>
+      </w:r>
+      <w:proofErr w:type="spellStart"/>
+      <w:r>
+        <w:rPr>
+          <w:lang w:val="en-ID"/>
+        </w:rPr>
+        <w:t>MyApp</w:t>
+      </w:r>
+      <w:proofErr w:type="spellEnd"/>
+      <w:r>
+        <w:rPr>
+          <w:lang w:val="en-ID"/>
+        </w:rPr>
+        <w:t xml:space="preserve">" </w:t>
+      </w:r>
+      <w:proofErr w:type="spellStart"/>
+      <w:r>
+        <w:rPr>
+          <w:lang w:val="en-ID"/>
+        </w:rPr>
+        <w:t>ditulis</w:t>
+      </w:r>
+      <w:proofErr w:type="spellEnd"/>
+      <w:r>
+        <w:rPr>
+          <w:lang w:val="en-ID"/>
+        </w:rPr>
+        <w:t xml:space="preserve"> </w:t>
+      </w:r>
+      <w:proofErr w:type="spellStart"/>
+      <w:r>
+        <w:rPr>
+          <w:lang w:val="en-ID"/>
+        </w:rPr>
+        <w:t>langsung</w:t>
+      </w:r>
+      <w:proofErr w:type="spellEnd"/>
+      <w:r>
+        <w:rPr>
+          <w:lang w:val="en-ID"/>
+        </w:rPr>
+        <w:t xml:space="preserve"> di </w:t>
+      </w:r>
+      <w:proofErr w:type="spellStart"/>
+      <w:r>
+        <w:rPr>
+          <w:lang w:val="en-ID"/>
+        </w:rPr>
+        <w:t>dalam</w:t>
+      </w:r>
+      <w:proofErr w:type="spellEnd"/>
+      <w:r>
+        <w:rPr>
+          <w:lang w:val="en-ID"/>
+        </w:rPr>
+        <w:t xml:space="preserve"> tag div. React </w:t>
+      </w:r>
+      <w:proofErr w:type="spellStart"/>
+      <w:r>
+        <w:rPr>
+          <w:lang w:val="en-ID"/>
+        </w:rPr>
+        <w:t>akan</w:t>
+      </w:r>
+      <w:proofErr w:type="spellEnd"/>
+      <w:r>
+        <w:rPr>
+          <w:lang w:val="en-ID"/>
+        </w:rPr>
+        <w:t xml:space="preserve"> </w:t>
+      </w:r>
+      <w:proofErr w:type="spellStart"/>
+      <w:r>
+        <w:rPr>
+          <w:lang w:val="en-ID"/>
+        </w:rPr>
+        <w:t>langsung</w:t>
+      </w:r>
+      <w:proofErr w:type="spellEnd"/>
+      <w:r>
+        <w:rPr>
+          <w:lang w:val="en-ID"/>
+        </w:rPr>
+        <w:t xml:space="preserve"> </w:t>
+      </w:r>
+      <w:proofErr w:type="spellStart"/>
+      <w:r>
+        <w:rPr>
+          <w:lang w:val="en-ID"/>
+        </w:rPr>
+        <w:t>merender</w:t>
+      </w:r>
+      <w:proofErr w:type="spellEnd"/>
+      <w:r>
+        <w:rPr>
+          <w:lang w:val="en-ID"/>
+        </w:rPr>
+        <w:t xml:space="preserve"> </w:t>
+      </w:r>
+      <w:proofErr w:type="spellStart"/>
+      <w:r>
+        <w:rPr>
+          <w:lang w:val="en-ID"/>
+        </w:rPr>
+        <w:t>teks</w:t>
+      </w:r>
+      <w:proofErr w:type="spellEnd"/>
+      <w:r>
+        <w:rPr>
+          <w:lang w:val="en-ID"/>
+        </w:rPr>
+        <w:t xml:space="preserve"> </w:t>
+      </w:r>
+      <w:proofErr w:type="spellStart"/>
+      <w:r>
+        <w:rPr>
+          <w:lang w:val="en-ID"/>
+        </w:rPr>
+        <w:t>ini</w:t>
+      </w:r>
+      <w:proofErr w:type="spellEnd"/>
+      <w:r>
+        <w:rPr>
+          <w:lang w:val="en-ID"/>
+        </w:rPr>
+        <w:t xml:space="preserve"> </w:t>
+      </w:r>
+      <w:proofErr w:type="spellStart"/>
+      <w:r>
+        <w:rPr>
+          <w:lang w:val="en-ID"/>
+        </w:rPr>
+        <w:t>ke</w:t>
+      </w:r>
+      <w:proofErr w:type="spellEnd"/>
+      <w:r>
+        <w:rPr>
+          <w:lang w:val="en-ID"/>
+        </w:rPr>
+        <w:t xml:space="preserve"> </w:t>
+      </w:r>
+      <w:proofErr w:type="spellStart"/>
+      <w:r>
+        <w:rPr>
+          <w:lang w:val="en-ID"/>
+        </w:rPr>
+        <w:t>dalam</w:t>
+      </w:r>
+      <w:proofErr w:type="spellEnd"/>
+      <w:r>
+        <w:rPr>
+          <w:lang w:val="en-ID"/>
+        </w:rPr>
+        <w:t xml:space="preserve"> HTML </w:t>
+      </w:r>
+      <w:proofErr w:type="spellStart"/>
+      <w:r>
+        <w:rPr>
+          <w:lang w:val="en-ID"/>
+        </w:rPr>
+        <w:t>saat</w:t>
+      </w:r>
+      <w:proofErr w:type="spellEnd"/>
+      <w:r>
+        <w:rPr>
+          <w:lang w:val="en-ID"/>
+        </w:rPr>
+        <w:t xml:space="preserve"> </w:t>
+      </w:r>
+      <w:proofErr w:type="spellStart"/>
+      <w:r>
+        <w:rPr>
+          <w:lang w:val="en-ID"/>
+        </w:rPr>
+        <w:t>komponen</w:t>
+      </w:r>
+      <w:proofErr w:type="spellEnd"/>
+      <w:r>
+        <w:rPr>
+          <w:lang w:val="en-ID"/>
+        </w:rPr>
+        <w:t xml:space="preserve"> </w:t>
+      </w:r>
+      <w:proofErr w:type="spellStart"/>
+      <w:r>
+        <w:rPr>
+          <w:lang w:val="en-ID"/>
+        </w:rPr>
+        <w:t>dimuat</w:t>
+      </w:r>
+      <w:proofErr w:type="spellEnd"/>
+      <w:r>
+        <w:rPr>
+          <w:lang w:val="en-ID"/>
+        </w:rPr>
+        <w:t>.</w:t>
+      </w:r>
+    </w:p>
+    <w:p>
+      <w:pPr>
+        <w:pStyle w:val="ListParagraph"/>
+        <w:numPr>
+          <w:ilvl w:val="1"/>
+          <w:numId w:val="10"/>
+        </w:numPr>
+        <w:rPr>
+          <w:lang w:val="en-ID"/>
+        </w:rPr>
+      </w:pPr>
+      <w:r>
+        <w:rPr>
+          <w:lang w:val="en-ID"/>
+        </w:rPr>
+        <w:t xml:space="preserve">Line 15-18 (Next.js Script &amp; Manual DOM): </w:t>
+      </w:r>
+      <w:proofErr w:type="spellStart"/>
+      <w:r>
+        <w:rPr>
+          <w:lang w:val="en-ID"/>
+        </w:rPr>
+        <w:t>Menggunakan</w:t>
+      </w:r>
+      <w:proofErr w:type="spellEnd"/>
+      <w:r>
+        <w:rPr>
+          <w:lang w:val="en-ID"/>
+        </w:rPr>
+        <w:t xml:space="preserve"> </w:t>
+      </w:r>
+      <w:proofErr w:type="spellStart"/>
+      <w:r>
+        <w:rPr>
+          <w:lang w:val="en-ID"/>
+        </w:rPr>
+        <w:t>komponen</w:t>
+      </w:r>
+      <w:proofErr w:type="spellEnd"/>
+      <w:r>
+        <w:rPr>
+          <w:lang w:val="en-ID"/>
+        </w:rPr>
+        <w:t xml:space="preserve"> &lt;Script&gt; </w:t>
+      </w:r>
+      <w:proofErr w:type="spellStart"/>
+      <w:r>
+        <w:rPr>
+          <w:lang w:val="en-ID"/>
+        </w:rPr>
+        <w:t>dari</w:t>
+      </w:r>
+      <w:proofErr w:type="spellEnd"/>
+      <w:r>
+        <w:rPr>
+          <w:lang w:val="en-ID"/>
+        </w:rPr>
+        <w:t xml:space="preserve"> Next.js </w:t>
+      </w:r>
+      <w:proofErr w:type="spellStart"/>
+      <w:r>
+        <w:rPr>
+          <w:lang w:val="en-ID"/>
+        </w:rPr>
+        <w:t>dengan</w:t>
+      </w:r>
+      <w:proofErr w:type="spellEnd"/>
+      <w:r>
+        <w:rPr>
+          <w:lang w:val="en-ID"/>
+        </w:rPr>
+        <w:t xml:space="preserve"> strategi </w:t>
+      </w:r>
+      <w:proofErr w:type="spellStart"/>
+      <w:r>
+        <w:rPr>
+          <w:lang w:val="en-ID"/>
+        </w:rPr>
+        <w:t>lazyOnload</w:t>
+      </w:r>
+      <w:proofErr w:type="spellEnd"/>
+      <w:r>
+        <w:rPr>
+          <w:lang w:val="en-ID"/>
+        </w:rPr>
+        <w:t>. Teks</w:t>
+      </w:r>
+      <w:r>
+        <w:rPr>
+          <w:lang w:val="en-ID"/>
+        </w:rPr>
+        <w:t xml:space="preserve"> </w:t>
+      </w:r>
+      <w:proofErr w:type="spellStart"/>
+      <w:r>
+        <w:rPr>
+          <w:lang w:val="en-ID"/>
+        </w:rPr>
+        <w:t>tidak</w:t>
+      </w:r>
+      <w:proofErr w:type="spellEnd"/>
+      <w:r>
+        <w:rPr>
+          <w:lang w:val="en-ID"/>
+        </w:rPr>
+        <w:t xml:space="preserve"> </w:t>
+      </w:r>
+      <w:proofErr w:type="spellStart"/>
+      <w:r>
+        <w:rPr>
+          <w:lang w:val="en-ID"/>
+        </w:rPr>
+        <w:t>ada</w:t>
+      </w:r>
+      <w:proofErr w:type="spellEnd"/>
+      <w:r>
+        <w:rPr>
+          <w:lang w:val="en-ID"/>
+        </w:rPr>
+        <w:t xml:space="preserve"> di </w:t>
+      </w:r>
+      <w:proofErr w:type="spellStart"/>
+      <w:r>
+        <w:rPr>
+          <w:lang w:val="en-ID"/>
+        </w:rPr>
+        <w:t>dalam</w:t>
+      </w:r>
+      <w:proofErr w:type="spellEnd"/>
+      <w:r>
+        <w:rPr>
+          <w:lang w:val="en-ID"/>
+        </w:rPr>
+        <w:t xml:space="preserve"> HTML </w:t>
+      </w:r>
+      <w:proofErr w:type="spellStart"/>
+      <w:r>
+        <w:rPr>
+          <w:lang w:val="en-ID"/>
+        </w:rPr>
+        <w:t>saat</w:t>
+      </w:r>
+      <w:proofErr w:type="spellEnd"/>
+      <w:r>
+        <w:rPr>
+          <w:lang w:val="en-ID"/>
+        </w:rPr>
+        <w:t xml:space="preserve"> </w:t>
+      </w:r>
+      <w:proofErr w:type="spellStart"/>
+      <w:r>
+        <w:rPr>
+          <w:lang w:val="en-ID"/>
+        </w:rPr>
+        <w:t>awal</w:t>
+      </w:r>
+      <w:proofErr w:type="spellEnd"/>
+      <w:r>
+        <w:rPr>
+          <w:lang w:val="en-ID"/>
+        </w:rPr>
+        <w:t xml:space="preserve"> </w:t>
+      </w:r>
+      <w:proofErr w:type="spellStart"/>
+      <w:r>
+        <w:rPr>
+          <w:lang w:val="en-ID"/>
+        </w:rPr>
+        <w:t>dimuat</w:t>
+      </w:r>
+      <w:proofErr w:type="spellEnd"/>
+      <w:r>
+        <w:rPr>
+          <w:lang w:val="en-ID"/>
+        </w:rPr>
+        <w:t xml:space="preserve">, </w:t>
+      </w:r>
+      <w:proofErr w:type="spellStart"/>
+      <w:r>
+        <w:rPr>
+          <w:lang w:val="en-ID"/>
+        </w:rPr>
+        <w:t>melainkan</w:t>
+      </w:r>
+      <w:proofErr w:type="spellEnd"/>
+      <w:r>
+        <w:rPr>
+          <w:lang w:val="en-ID"/>
+        </w:rPr>
+        <w:t xml:space="preserve"> </w:t>
+      </w:r>
+      <w:proofErr w:type="spellStart"/>
+      <w:r>
+        <w:rPr>
+          <w:lang w:val="en-ID"/>
+        </w:rPr>
+        <w:t>baru</w:t>
+      </w:r>
+      <w:proofErr w:type="spellEnd"/>
+      <w:r>
+        <w:rPr>
+          <w:lang w:val="en-ID"/>
+        </w:rPr>
+        <w:t xml:space="preserve"> </w:t>
+      </w:r>
+      <w:r>
+        <w:rPr>
+          <w:lang w:val="en-ID"/>
+        </w:rPr>
+        <w:t>"</w:t>
+      </w:r>
+      <w:proofErr w:type="spellStart"/>
+      <w:r>
+        <w:rPr>
+          <w:lang w:val="en-ID"/>
+        </w:rPr>
+        <w:t>disuntikkan</w:t>
+      </w:r>
+      <w:proofErr w:type="spellEnd"/>
+      <w:r>
+        <w:rPr>
+          <w:lang w:val="en-ID"/>
+        </w:rPr>
+        <w:t xml:space="preserve">" </w:t>
+      </w:r>
+      <w:proofErr w:type="spellStart"/>
+      <w:r>
+        <w:rPr>
+          <w:lang w:val="en-ID"/>
+        </w:rPr>
+        <w:t>secara</w:t>
+      </w:r>
+      <w:proofErr w:type="spellEnd"/>
+      <w:r>
+        <w:rPr>
+          <w:lang w:val="en-ID"/>
+        </w:rPr>
+        <w:t xml:space="preserve"> manual </w:t>
+      </w:r>
+      <w:proofErr w:type="spellStart"/>
+      <w:r>
+        <w:rPr>
+          <w:lang w:val="en-ID"/>
+        </w:rPr>
+        <w:t>menggunakan</w:t>
+      </w:r>
+      <w:proofErr w:type="spellEnd"/>
+      <w:r>
+        <w:rPr>
+          <w:lang w:val="en-ID"/>
+        </w:rPr>
+        <w:t xml:space="preserve"> </w:t>
+      </w:r>
+      <w:proofErr w:type="spellStart"/>
+      <w:r>
+        <w:rPr>
+          <w:lang w:val="en-ID"/>
+        </w:rPr>
+        <w:t>perintah</w:t>
+      </w:r>
+      <w:proofErr w:type="spellEnd"/>
+      <w:r>
+        <w:rPr>
+          <w:lang w:val="en-ID"/>
+        </w:rPr>
+        <w:t xml:space="preserve"> JavaScript</w:t>
+      </w:r>
+      <w:r>
+        <w:rPr>
+          <w:lang w:val="en-ID"/>
+        </w:rPr>
+        <w:t xml:space="preserve"> </w:t>
+      </w:r>
+      <w:proofErr w:type="spellStart"/>
+      <w:proofErr w:type="gramStart"/>
+      <w:r>
+        <w:rPr>
+          <w:lang w:val="en-ID"/>
+        </w:rPr>
+        <w:t>document.getElementById</w:t>
+      </w:r>
+      <w:proofErr w:type="spellEnd"/>
+      <w:proofErr w:type="gramEnd"/>
+      <w:r>
+        <w:rPr>
+          <w:lang w:val="en-ID"/>
+        </w:rPr>
+        <w:t>('title'</w:t>
+      </w:r>
+      <w:proofErr w:type="gramStart"/>
+      <w:r>
+        <w:rPr>
+          <w:lang w:val="en-ID"/>
+        </w:rPr>
+        <w:t>).</w:t>
+      </w:r>
+      <w:proofErr w:type="spellStart"/>
+      <w:r>
+        <w:rPr>
+          <w:lang w:val="en-ID"/>
+        </w:rPr>
+        <w:t>innerHTML</w:t>
+      </w:r>
+      <w:proofErr w:type="spellEnd"/>
+      <w:proofErr w:type="gramEnd"/>
+      <w:r>
+        <w:rPr>
+          <w:lang w:val="en-ID"/>
+        </w:rPr>
+        <w:t xml:space="preserve"> = '</w:t>
+      </w:r>
+      <w:proofErr w:type="spellStart"/>
+      <w:r>
+        <w:rPr>
+          <w:lang w:val="en-ID"/>
+        </w:rPr>
+        <w:t>MyApp</w:t>
+      </w:r>
+      <w:proofErr w:type="spellEnd"/>
+      <w:r>
+        <w:rPr>
+          <w:lang w:val="en-ID"/>
+        </w:rPr>
+        <w:t xml:space="preserve">'; </w:t>
+      </w:r>
+      <w:proofErr w:type="spellStart"/>
+      <w:r>
+        <w:rPr>
+          <w:lang w:val="en-ID"/>
+        </w:rPr>
+        <w:t>setelah</w:t>
+      </w:r>
+      <w:proofErr w:type="spellEnd"/>
+      <w:r>
+        <w:rPr>
+          <w:lang w:val="en-ID"/>
+        </w:rPr>
+        <w:t xml:space="preserve"> </w:t>
+      </w:r>
+      <w:r>
+        <w:rPr>
+          <w:lang w:val="en-ID"/>
+        </w:rPr>
+        <w:t xml:space="preserve">script </w:t>
+      </w:r>
+      <w:proofErr w:type="spellStart"/>
+      <w:r>
+        <w:rPr>
+          <w:lang w:val="en-ID"/>
+        </w:rPr>
+        <w:t>tersebut</w:t>
+      </w:r>
+      <w:proofErr w:type="spellEnd"/>
+      <w:r>
+        <w:rPr>
+          <w:lang w:val="en-ID"/>
+        </w:rPr>
+        <w:t xml:space="preserve"> </w:t>
+      </w:r>
+      <w:proofErr w:type="spellStart"/>
+      <w:r>
+        <w:rPr>
+          <w:lang w:val="en-ID"/>
+        </w:rPr>
+        <w:t>diunduh</w:t>
+      </w:r>
+      <w:proofErr w:type="spellEnd"/>
+      <w:r>
+        <w:rPr>
+          <w:lang w:val="en-ID"/>
+        </w:rPr>
+        <w:t xml:space="preserve"> di </w:t>
+      </w:r>
+      <w:proofErr w:type="spellStart"/>
+      <w:r>
+        <w:rPr>
+          <w:lang w:val="en-ID"/>
+        </w:rPr>
+        <w:t>latar</w:t>
+      </w:r>
+      <w:proofErr w:type="spellEnd"/>
+      <w:r>
+        <w:rPr>
+          <w:lang w:val="en-ID"/>
+        </w:rPr>
+        <w:t xml:space="preserve"> </w:t>
+      </w:r>
+      <w:proofErr w:type="spellStart"/>
+      <w:r>
+        <w:rPr>
+          <w:lang w:val="en-ID"/>
+        </w:rPr>
+        <w:t>belakang</w:t>
+      </w:r>
+      <w:proofErr w:type="spellEnd"/>
+      <w:r>
+        <w:rPr>
+          <w:lang w:val="en-ID"/>
+        </w:rPr>
+        <w:t>.</w:t>
+      </w:r>
+    </w:p>
+    <w:p>
+      <w:pPr>
+        <w:pStyle w:val="ListParagraph"/>
+        <w:numPr>
+          <w:ilvl w:val="0"/>
+          <w:numId w:val="8"/>
+        </w:numPr>
+        <w:rPr>
+          <w:lang w:val="en-ID"/>
+        </w:rPr>
+      </w:pPr>
+      <w:r>
+        <w:rPr>
+          <w:lang w:val="en-ID"/>
+        </w:rPr>
+        <w:t>Performa dan SEO</w:t>
+      </w:r>
+    </w:p>
+    <w:p>
+      <w:pPr>
+        <w:pStyle w:val="ListParagraph"/>
+        <w:numPr>
+          <w:ilvl w:val="1"/>
+          <w:numId w:val="11"/>
+        </w:numPr>
+        <w:rPr>
+          <w:lang w:val="en-ID"/>
+        </w:rPr>
+      </w:pPr>
+      <w:r>
+        <w:rPr>
+          <w:lang w:val="en-ID"/>
+        </w:rPr>
+        <w:t xml:space="preserve">Line 11-13: Sangat </w:t>
+      </w:r>
+      <w:proofErr w:type="spellStart"/>
+      <w:r>
+        <w:rPr>
+          <w:lang w:val="en-ID"/>
+        </w:rPr>
+        <w:t>baik</w:t>
+      </w:r>
+      <w:proofErr w:type="spellEnd"/>
+      <w:r>
+        <w:rPr>
+          <w:lang w:val="en-ID"/>
+        </w:rPr>
+        <w:t xml:space="preserve"> </w:t>
+      </w:r>
+      <w:proofErr w:type="spellStart"/>
+      <w:r>
+        <w:rPr>
+          <w:lang w:val="en-ID"/>
+        </w:rPr>
+        <w:t>untuk</w:t>
+      </w:r>
+      <w:proofErr w:type="spellEnd"/>
+      <w:r>
+        <w:rPr>
+          <w:lang w:val="en-ID"/>
+        </w:rPr>
+        <w:t xml:space="preserve"> SEO </w:t>
+      </w:r>
+      <w:proofErr w:type="spellStart"/>
+      <w:r>
+        <w:rPr>
+          <w:lang w:val="en-ID"/>
+        </w:rPr>
+        <w:t>karena</w:t>
+      </w:r>
+      <w:proofErr w:type="spellEnd"/>
+      <w:r>
+        <w:rPr>
+          <w:lang w:val="en-ID"/>
+        </w:rPr>
+        <w:t xml:space="preserve"> </w:t>
+      </w:r>
+      <w:proofErr w:type="spellStart"/>
+      <w:r>
+        <w:rPr>
+          <w:lang w:val="en-ID"/>
+        </w:rPr>
+        <w:t>teks</w:t>
+      </w:r>
+      <w:proofErr w:type="spellEnd"/>
+      <w:r>
+        <w:rPr>
+          <w:lang w:val="en-ID"/>
+        </w:rPr>
+        <w:t xml:space="preserve"> "</w:t>
+      </w:r>
+      <w:proofErr w:type="spellStart"/>
+      <w:r>
+        <w:rPr>
+          <w:lang w:val="en-ID"/>
+        </w:rPr>
+        <w:t>MyApp</w:t>
+      </w:r>
+      <w:proofErr w:type="spellEnd"/>
+      <w:r>
+        <w:rPr>
+          <w:lang w:val="en-ID"/>
+        </w:rPr>
+        <w:t xml:space="preserve">" </w:t>
+      </w:r>
+      <w:proofErr w:type="spellStart"/>
+      <w:r>
+        <w:rPr>
+          <w:lang w:val="en-ID"/>
+        </w:rPr>
+        <w:t>langsung</w:t>
+      </w:r>
+      <w:proofErr w:type="spellEnd"/>
+      <w:r>
+        <w:rPr>
+          <w:lang w:val="en-ID"/>
+        </w:rPr>
+        <w:t xml:space="preserve"> </w:t>
+      </w:r>
+      <w:proofErr w:type="spellStart"/>
+      <w:r>
+        <w:rPr>
+          <w:lang w:val="en-ID"/>
+        </w:rPr>
+        <w:t>terbaca</w:t>
+      </w:r>
+      <w:proofErr w:type="spellEnd"/>
+      <w:r>
+        <w:rPr>
+          <w:lang w:val="en-ID"/>
+        </w:rPr>
+        <w:t xml:space="preserve"> oleh robot </w:t>
+      </w:r>
+      <w:proofErr w:type="spellStart"/>
+      <w:r>
+        <w:rPr>
+          <w:lang w:val="en-ID"/>
+        </w:rPr>
+        <w:t>pencari</w:t>
+      </w:r>
+      <w:proofErr w:type="spellEnd"/>
+      <w:r>
+        <w:rPr>
+          <w:lang w:val="en-ID"/>
+        </w:rPr>
+        <w:t xml:space="preserve"> (crawler) </w:t>
+      </w:r>
+      <w:proofErr w:type="spellStart"/>
+      <w:r>
+        <w:rPr>
+          <w:lang w:val="en-ID"/>
+        </w:rPr>
+        <w:t>dalam</w:t>
+      </w:r>
+      <w:proofErr w:type="spellEnd"/>
+      <w:r>
+        <w:rPr>
+          <w:lang w:val="en-ID"/>
+        </w:rPr>
+        <w:t xml:space="preserve"> </w:t>
+      </w:r>
+      <w:proofErr w:type="spellStart"/>
+      <w:r>
+        <w:rPr>
+          <w:lang w:val="en-ID"/>
+        </w:rPr>
+        <w:t>kode</w:t>
+      </w:r>
+      <w:proofErr w:type="spellEnd"/>
+      <w:r>
+        <w:rPr>
+          <w:lang w:val="en-ID"/>
+        </w:rPr>
+        <w:t xml:space="preserve"> </w:t>
+      </w:r>
+      <w:proofErr w:type="spellStart"/>
+      <w:r>
+        <w:rPr>
+          <w:lang w:val="en-ID"/>
+        </w:rPr>
+        <w:t>sumber</w:t>
+      </w:r>
+      <w:proofErr w:type="spellEnd"/>
+      <w:r>
+        <w:rPr>
+          <w:lang w:val="en-ID"/>
+        </w:rPr>
+        <w:t xml:space="preserve"> HTML.</w:t>
+      </w:r>
+    </w:p>
+    <w:p>
+      <w:pPr>
+        <w:pStyle w:val="ListParagraph"/>
+        <w:numPr>
+          <w:ilvl w:val="1"/>
+          <w:numId w:val="11"/>
+        </w:numPr>
+        <w:rPr>
+          <w:lang w:val="en-ID"/>
+        </w:rPr>
+      </w:pPr>
+      <w:r>
+        <w:rPr>
+          <w:lang w:val="en-ID"/>
+        </w:rPr>
+        <w:t xml:space="preserve">Line 15-18: Kurang </w:t>
+      </w:r>
+      <w:proofErr w:type="spellStart"/>
+      <w:r>
+        <w:rPr>
+          <w:lang w:val="en-ID"/>
+        </w:rPr>
+        <w:t>baik</w:t>
+      </w:r>
+      <w:proofErr w:type="spellEnd"/>
+      <w:r>
+        <w:rPr>
+          <w:lang w:val="en-ID"/>
+        </w:rPr>
+        <w:t xml:space="preserve"> </w:t>
+      </w:r>
+      <w:proofErr w:type="spellStart"/>
+      <w:r>
+        <w:rPr>
+          <w:lang w:val="en-ID"/>
+        </w:rPr>
+        <w:t>untuk</w:t>
+      </w:r>
+      <w:proofErr w:type="spellEnd"/>
+      <w:r>
+        <w:rPr>
+          <w:lang w:val="en-ID"/>
+        </w:rPr>
+        <w:t xml:space="preserve"> SEO </w:t>
+      </w:r>
+      <w:proofErr w:type="spellStart"/>
+      <w:r>
+        <w:rPr>
+          <w:lang w:val="en-ID"/>
+        </w:rPr>
+        <w:t>untuk</w:t>
+      </w:r>
+      <w:proofErr w:type="spellEnd"/>
+      <w:r>
+        <w:rPr>
+          <w:lang w:val="en-ID"/>
+        </w:rPr>
+        <w:t xml:space="preserve"> </w:t>
+      </w:r>
+      <w:proofErr w:type="spellStart"/>
+      <w:r>
+        <w:rPr>
+          <w:lang w:val="en-ID"/>
+        </w:rPr>
+        <w:t>konten</w:t>
+      </w:r>
+      <w:proofErr w:type="spellEnd"/>
+      <w:r>
+        <w:rPr>
+          <w:lang w:val="en-ID"/>
+        </w:rPr>
+        <w:t xml:space="preserve"> </w:t>
+      </w:r>
+      <w:proofErr w:type="spellStart"/>
+      <w:r>
+        <w:rPr>
+          <w:lang w:val="en-ID"/>
+        </w:rPr>
+        <w:t>penting</w:t>
+      </w:r>
+      <w:proofErr w:type="spellEnd"/>
+      <w:r>
+        <w:rPr>
+          <w:lang w:val="en-ID"/>
+        </w:rPr>
+        <w:t xml:space="preserve"> </w:t>
+      </w:r>
+      <w:proofErr w:type="spellStart"/>
+      <w:r>
+        <w:rPr>
+          <w:lang w:val="en-ID"/>
+        </w:rPr>
+        <w:t>karena</w:t>
+      </w:r>
+      <w:proofErr w:type="spellEnd"/>
+      <w:r>
+        <w:rPr>
+          <w:lang w:val="en-ID"/>
+        </w:rPr>
+        <w:t xml:space="preserve"> </w:t>
+      </w:r>
+      <w:proofErr w:type="spellStart"/>
+      <w:r>
+        <w:rPr>
+          <w:lang w:val="en-ID"/>
+        </w:rPr>
+        <w:t>teks</w:t>
+      </w:r>
+      <w:proofErr w:type="spellEnd"/>
+      <w:r>
+        <w:rPr>
+          <w:lang w:val="en-ID"/>
+        </w:rPr>
+        <w:t xml:space="preserve"> </w:t>
+      </w:r>
+      <w:proofErr w:type="spellStart"/>
+      <w:r>
+        <w:rPr>
+          <w:lang w:val="en-ID"/>
+        </w:rPr>
+        <w:t>baru</w:t>
+      </w:r>
+      <w:proofErr w:type="spellEnd"/>
+      <w:r>
+        <w:rPr>
+          <w:lang w:val="en-ID"/>
+        </w:rPr>
+        <w:t xml:space="preserve"> </w:t>
+      </w:r>
+      <w:proofErr w:type="spellStart"/>
+      <w:r>
+        <w:rPr>
+          <w:lang w:val="en-ID"/>
+        </w:rPr>
+        <w:t>muncul</w:t>
+      </w:r>
+      <w:proofErr w:type="spellEnd"/>
+      <w:r>
+        <w:rPr>
+          <w:lang w:val="en-ID"/>
+        </w:rPr>
+        <w:t xml:space="preserve"> </w:t>
+      </w:r>
+      <w:proofErr w:type="spellStart"/>
+      <w:r>
+        <w:rPr>
+          <w:lang w:val="en-ID"/>
+        </w:rPr>
+        <w:t>setelah</w:t>
+      </w:r>
+      <w:proofErr w:type="spellEnd"/>
+      <w:r>
+        <w:rPr>
+          <w:lang w:val="en-ID"/>
+        </w:rPr>
+        <w:t xml:space="preserve"> JavaScript </w:t>
+      </w:r>
+      <w:proofErr w:type="spellStart"/>
+      <w:r>
+        <w:rPr>
+          <w:lang w:val="en-ID"/>
+        </w:rPr>
+        <w:t>dijalankan</w:t>
+      </w:r>
+      <w:proofErr w:type="spellEnd"/>
+      <w:r>
+        <w:rPr>
+          <w:lang w:val="en-ID"/>
+        </w:rPr>
+        <w:t xml:space="preserve">. Strategi </w:t>
+      </w:r>
+      <w:proofErr w:type="spellStart"/>
+      <w:r>
+        <w:rPr>
+          <w:lang w:val="en-ID"/>
+        </w:rPr>
+        <w:t>lazyOnload</w:t>
+      </w:r>
+      <w:proofErr w:type="spellEnd"/>
+      <w:r>
+        <w:rPr>
+          <w:lang w:val="en-ID"/>
+        </w:rPr>
+        <w:t xml:space="preserve"> </w:t>
+      </w:r>
+      <w:proofErr w:type="spellStart"/>
+      <w:r>
+        <w:rPr>
+          <w:lang w:val="en-ID"/>
+        </w:rPr>
+        <w:t>berarti</w:t>
+      </w:r>
+      <w:proofErr w:type="spellEnd"/>
+      <w:r>
+        <w:rPr>
+          <w:lang w:val="en-ID"/>
+        </w:rPr>
+        <w:t xml:space="preserve"> script </w:t>
+      </w:r>
+      <w:proofErr w:type="spellStart"/>
+      <w:r>
+        <w:rPr>
+          <w:lang w:val="en-ID"/>
+        </w:rPr>
+        <w:t>ini</w:t>
+      </w:r>
+      <w:proofErr w:type="spellEnd"/>
+      <w:r>
+        <w:rPr>
+          <w:lang w:val="en-ID"/>
+        </w:rPr>
+        <w:t xml:space="preserve"> </w:t>
+      </w:r>
+      <w:proofErr w:type="spellStart"/>
+      <w:r>
+        <w:rPr>
+          <w:lang w:val="en-ID"/>
+        </w:rPr>
+        <w:t>dijalankan</w:t>
+      </w:r>
+      <w:proofErr w:type="spellEnd"/>
+      <w:r>
+        <w:rPr>
+          <w:lang w:val="en-ID"/>
+        </w:rPr>
+        <w:t xml:space="preserve"> paling </w:t>
+      </w:r>
+      <w:proofErr w:type="spellStart"/>
+      <w:r>
+        <w:rPr>
+          <w:lang w:val="en-ID"/>
+        </w:rPr>
+        <w:lastRenderedPageBreak/>
+        <w:t>akhir</w:t>
+      </w:r>
+      <w:proofErr w:type="spellEnd"/>
+      <w:r>
+        <w:rPr>
+          <w:lang w:val="en-ID"/>
+        </w:rPr>
+        <w:t xml:space="preserve"> </w:t>
+      </w:r>
+      <w:proofErr w:type="spellStart"/>
+      <w:r>
+        <w:rPr>
+          <w:lang w:val="en-ID"/>
+        </w:rPr>
+        <w:t>setelah</w:t>
+      </w:r>
+      <w:proofErr w:type="spellEnd"/>
+      <w:r>
+        <w:rPr>
+          <w:lang w:val="en-ID"/>
+        </w:rPr>
+        <w:t xml:space="preserve"> </w:t>
+      </w:r>
+      <w:proofErr w:type="spellStart"/>
+      <w:r>
+        <w:rPr>
+          <w:lang w:val="en-ID"/>
+        </w:rPr>
+        <w:t>semua</w:t>
+      </w:r>
+      <w:proofErr w:type="spellEnd"/>
+      <w:r>
+        <w:rPr>
+          <w:lang w:val="en-ID"/>
+        </w:rPr>
+        <w:t xml:space="preserve"> </w:t>
+      </w:r>
+      <w:proofErr w:type="spellStart"/>
+      <w:r>
+        <w:rPr>
+          <w:lang w:val="en-ID"/>
+        </w:rPr>
+        <w:t>sumber</w:t>
+      </w:r>
+      <w:proofErr w:type="spellEnd"/>
+      <w:r>
+        <w:rPr>
+          <w:lang w:val="en-ID"/>
+        </w:rPr>
+        <w:t xml:space="preserve"> </w:t>
+      </w:r>
+      <w:proofErr w:type="spellStart"/>
+      <w:r>
+        <w:rPr>
+          <w:lang w:val="en-ID"/>
+        </w:rPr>
+        <w:t>daya</w:t>
+      </w:r>
+      <w:proofErr w:type="spellEnd"/>
+      <w:r>
+        <w:rPr>
+          <w:lang w:val="en-ID"/>
+        </w:rPr>
+        <w:t xml:space="preserve"> </w:t>
+      </w:r>
+      <w:proofErr w:type="spellStart"/>
+      <w:r>
+        <w:rPr>
+          <w:lang w:val="en-ID"/>
+        </w:rPr>
+        <w:t>utama</w:t>
+      </w:r>
+      <w:proofErr w:type="spellEnd"/>
+      <w:r>
+        <w:rPr>
+          <w:lang w:val="en-ID"/>
+        </w:rPr>
+        <w:t xml:space="preserve"> </w:t>
+      </w:r>
+      <w:proofErr w:type="spellStart"/>
+      <w:r>
+        <w:rPr>
+          <w:lang w:val="en-ID"/>
+        </w:rPr>
+        <w:t>selesai</w:t>
+      </w:r>
+      <w:proofErr w:type="spellEnd"/>
+      <w:r>
+        <w:rPr>
+          <w:lang w:val="en-ID"/>
+        </w:rPr>
+        <w:t xml:space="preserve"> </w:t>
+      </w:r>
+      <w:proofErr w:type="spellStart"/>
+      <w:r>
+        <w:rPr>
+          <w:lang w:val="en-ID"/>
+        </w:rPr>
+        <w:t>dimuat</w:t>
+      </w:r>
+      <w:proofErr w:type="spellEnd"/>
+      <w:r>
+        <w:rPr>
+          <w:lang w:val="en-ID"/>
+        </w:rPr>
+        <w:t xml:space="preserve">, </w:t>
+      </w:r>
+      <w:proofErr w:type="spellStart"/>
+      <w:r>
+        <w:rPr>
+          <w:lang w:val="en-ID"/>
+        </w:rPr>
+        <w:t>sehingga</w:t>
+      </w:r>
+      <w:proofErr w:type="spellEnd"/>
+      <w:r>
+        <w:rPr>
+          <w:lang w:val="en-ID"/>
+        </w:rPr>
+        <w:t xml:space="preserve"> </w:t>
+      </w:r>
+      <w:proofErr w:type="spellStart"/>
+      <w:r>
+        <w:rPr>
+          <w:lang w:val="en-ID"/>
+        </w:rPr>
+        <w:t>mungkin</w:t>
+      </w:r>
+      <w:proofErr w:type="spellEnd"/>
+      <w:r>
+        <w:rPr>
+          <w:lang w:val="en-ID"/>
+        </w:rPr>
+        <w:t xml:space="preserve"> </w:t>
+      </w:r>
+      <w:proofErr w:type="spellStart"/>
+      <w:r>
+        <w:rPr>
+          <w:lang w:val="en-ID"/>
+        </w:rPr>
+        <w:t>ada</w:t>
+      </w:r>
+      <w:proofErr w:type="spellEnd"/>
+      <w:r>
+        <w:rPr>
+          <w:lang w:val="en-ID"/>
+        </w:rPr>
+        <w:t xml:space="preserve"> </w:t>
+      </w:r>
+      <w:proofErr w:type="spellStart"/>
+      <w:r>
+        <w:rPr>
+          <w:lang w:val="en-ID"/>
+        </w:rPr>
+        <w:t>jeda</w:t>
+      </w:r>
+      <w:proofErr w:type="spellEnd"/>
+      <w:r>
+        <w:rPr>
+          <w:lang w:val="en-ID"/>
+        </w:rPr>
+        <w:t xml:space="preserve"> </w:t>
+      </w:r>
+      <w:proofErr w:type="spellStart"/>
+      <w:r>
+        <w:rPr>
+          <w:lang w:val="en-ID"/>
+        </w:rPr>
+        <w:t>waktu</w:t>
+      </w:r>
+      <w:proofErr w:type="spellEnd"/>
+      <w:r>
+        <w:rPr>
+          <w:lang w:val="en-ID"/>
+        </w:rPr>
+        <w:t xml:space="preserve"> </w:t>
+      </w:r>
+      <w:r>
+        <w:rPr>
+          <w:lang w:val="en-ID"/>
+        </w:rPr>
+        <w:t xml:space="preserve">(delay) </w:t>
+      </w:r>
+      <w:proofErr w:type="spellStart"/>
+      <w:r>
+        <w:rPr>
+          <w:lang w:val="en-ID"/>
+        </w:rPr>
+        <w:t>sebelum</w:t>
+      </w:r>
+      <w:proofErr w:type="spellEnd"/>
+      <w:r>
+        <w:rPr>
+          <w:lang w:val="en-ID"/>
+        </w:rPr>
+        <w:t xml:space="preserve"> </w:t>
+      </w:r>
+      <w:proofErr w:type="spellStart"/>
+      <w:r>
+        <w:rPr>
+          <w:lang w:val="en-ID"/>
+        </w:rPr>
+        <w:t>teks</w:t>
+      </w:r>
+      <w:proofErr w:type="spellEnd"/>
+      <w:r>
+        <w:rPr>
+          <w:lang w:val="en-ID"/>
+        </w:rPr>
+        <w:t xml:space="preserve"> </w:t>
+      </w:r>
+      <w:proofErr w:type="spellStart"/>
+      <w:r>
+        <w:rPr>
+          <w:lang w:val="en-ID"/>
+        </w:rPr>
+        <w:t>muncul</w:t>
+      </w:r>
+      <w:proofErr w:type="spellEnd"/>
+      <w:r>
+        <w:rPr>
+          <w:lang w:val="en-ID"/>
+        </w:rPr>
+        <w:t xml:space="preserve"> di </w:t>
+      </w:r>
+      <w:proofErr w:type="spellStart"/>
+      <w:r>
+        <w:rPr>
+          <w:lang w:val="en-ID"/>
+        </w:rPr>
+        <w:t>layar</w:t>
+      </w:r>
+      <w:proofErr w:type="spellEnd"/>
+      <w:r>
+        <w:rPr>
+          <w:lang w:val="en-ID"/>
+        </w:rPr>
+        <w:t>.</w:t>
+      </w:r>
+    </w:p>
+    <w:p>
+      <w:pPr>
+        <w:pStyle w:val="ListParagraph"/>
+        <w:numPr>
+          <w:ilvl w:val="0"/>
+          <w:numId w:val="8"/>
+        </w:numPr>
+        <w:rPr>
+          <w:lang w:val="en-ID"/>
+        </w:rPr>
+      </w:pPr>
+      <w:proofErr w:type="spellStart"/>
+      <w:r>
+        <w:rPr>
+          <w:lang w:val="en-ID"/>
+        </w:rPr>
+        <w:t>Keamanan</w:t>
+      </w:r>
+      <w:proofErr w:type="spellEnd"/>
+      <w:r>
+        <w:rPr>
+          <w:lang w:val="en-ID"/>
+        </w:rPr>
+        <w:t xml:space="preserve"> (XSS)</w:t>
+      </w:r>
+    </w:p>
+    <w:p>
+      <w:pPr>
+        <w:pStyle w:val="ListParagraph"/>
+        <w:numPr>
+          <w:ilvl w:val="1"/>
+          <w:numId w:val="12"/>
+        </w:numPr>
+        <w:rPr>
+          <w:lang w:val="en-ID"/>
+        </w:rPr>
+      </w:pPr>
+      <w:r>
+        <w:rPr>
+          <w:lang w:val="en-ID"/>
+        </w:rPr>
+        <w:t xml:space="preserve">Line 11-13: Aman </w:t>
+      </w:r>
+      <w:proofErr w:type="spellStart"/>
+      <w:r>
+        <w:rPr>
+          <w:lang w:val="en-ID"/>
+        </w:rPr>
+        <w:t>karena</w:t>
+      </w:r>
+      <w:proofErr w:type="spellEnd"/>
+      <w:r>
+        <w:rPr>
+          <w:lang w:val="en-ID"/>
+        </w:rPr>
+        <w:t xml:space="preserve"> React </w:t>
+      </w:r>
+      <w:proofErr w:type="spellStart"/>
+      <w:r>
+        <w:rPr>
+          <w:lang w:val="en-ID"/>
+        </w:rPr>
+        <w:t>secara</w:t>
+      </w:r>
+      <w:proofErr w:type="spellEnd"/>
+      <w:r>
+        <w:rPr>
+          <w:lang w:val="en-ID"/>
+        </w:rPr>
+        <w:t xml:space="preserve"> </w:t>
+      </w:r>
+      <w:proofErr w:type="spellStart"/>
+      <w:r>
+        <w:rPr>
+          <w:lang w:val="en-ID"/>
+        </w:rPr>
+        <w:t>otomatis</w:t>
+      </w:r>
+      <w:proofErr w:type="spellEnd"/>
+      <w:r>
+        <w:rPr>
+          <w:lang w:val="en-ID"/>
+        </w:rPr>
+        <w:t xml:space="preserve"> </w:t>
+      </w:r>
+      <w:proofErr w:type="spellStart"/>
+      <w:r>
+        <w:rPr>
+          <w:lang w:val="en-ID"/>
+        </w:rPr>
+        <w:t>melakukan</w:t>
+      </w:r>
+      <w:proofErr w:type="spellEnd"/>
+      <w:r>
+        <w:rPr>
+          <w:lang w:val="en-ID"/>
+        </w:rPr>
+        <w:t xml:space="preserve"> escape</w:t>
+      </w:r>
+      <w:r>
+        <w:rPr>
+          <w:lang w:val="en-ID"/>
+        </w:rPr>
+        <w:t xml:space="preserve"> </w:t>
+      </w:r>
+      <w:r>
+        <w:rPr>
+          <w:lang w:val="en-ID"/>
+        </w:rPr>
+        <w:t xml:space="preserve">pada string </w:t>
+      </w:r>
+      <w:proofErr w:type="spellStart"/>
+      <w:r>
+        <w:rPr>
+          <w:lang w:val="en-ID"/>
+        </w:rPr>
+        <w:t>untuk</w:t>
+      </w:r>
+      <w:proofErr w:type="spellEnd"/>
+      <w:r>
+        <w:rPr>
+          <w:lang w:val="en-ID"/>
+        </w:rPr>
+        <w:t xml:space="preserve"> </w:t>
+      </w:r>
+      <w:proofErr w:type="spellStart"/>
+      <w:r>
+        <w:rPr>
+          <w:lang w:val="en-ID"/>
+        </w:rPr>
+        <w:t>mencegah</w:t>
+      </w:r>
+      <w:proofErr w:type="spellEnd"/>
+      <w:r>
+        <w:rPr>
+          <w:lang w:val="en-ID"/>
+        </w:rPr>
+        <w:t xml:space="preserve"> </w:t>
+      </w:r>
+      <w:proofErr w:type="spellStart"/>
+      <w:r>
+        <w:rPr>
+          <w:lang w:val="en-ID"/>
+        </w:rPr>
+        <w:t>serangan</w:t>
+      </w:r>
+      <w:proofErr w:type="spellEnd"/>
+      <w:r>
+        <w:rPr>
+          <w:lang w:val="en-ID"/>
+        </w:rPr>
+        <w:t xml:space="preserve"> Cross-Site Scripting (XSS).</w:t>
+      </w:r>
+    </w:p>
+    <w:p>
+      <w:pPr>
+        <w:pStyle w:val="ListParagraph"/>
+        <w:numPr>
+          <w:ilvl w:val="1"/>
+          <w:numId w:val="12"/>
+        </w:numPr>
+        <w:rPr>
+          <w:lang w:val="en-ID"/>
+        </w:rPr>
+      </w:pPr>
+      <w:r>
+        <w:rPr>
+          <w:lang w:val="en-ID"/>
+        </w:rPr>
+        <w:t xml:space="preserve">Line 15-18: </w:t>
+      </w:r>
+      <w:proofErr w:type="spellStart"/>
+      <w:r>
+        <w:rPr>
+          <w:lang w:val="en-ID"/>
+        </w:rPr>
+        <w:t>Memiliki</w:t>
+      </w:r>
+      <w:proofErr w:type="spellEnd"/>
+      <w:r>
+        <w:rPr>
+          <w:lang w:val="en-ID"/>
+        </w:rPr>
+        <w:t xml:space="preserve"> </w:t>
+      </w:r>
+      <w:proofErr w:type="spellStart"/>
+      <w:r>
+        <w:rPr>
+          <w:lang w:val="en-ID"/>
+        </w:rPr>
+        <w:t>risiko</w:t>
+      </w:r>
+      <w:proofErr w:type="spellEnd"/>
+      <w:r>
+        <w:rPr>
+          <w:lang w:val="en-ID"/>
+        </w:rPr>
+        <w:t xml:space="preserve"> </w:t>
+      </w:r>
+      <w:proofErr w:type="spellStart"/>
+      <w:r>
+        <w:rPr>
+          <w:lang w:val="en-ID"/>
+        </w:rPr>
+        <w:t>keamanan</w:t>
+      </w:r>
+      <w:proofErr w:type="spellEnd"/>
+      <w:r>
+        <w:rPr>
+          <w:lang w:val="en-ID"/>
+        </w:rPr>
+        <w:t xml:space="preserve"> </w:t>
+      </w:r>
+      <w:proofErr w:type="spellStart"/>
+      <w:r>
+        <w:rPr>
+          <w:lang w:val="en-ID"/>
+        </w:rPr>
+        <w:t>lebih</w:t>
+      </w:r>
+      <w:proofErr w:type="spellEnd"/>
+      <w:r>
+        <w:rPr>
+          <w:lang w:val="en-ID"/>
+        </w:rPr>
+        <w:t xml:space="preserve"> </w:t>
+      </w:r>
+      <w:proofErr w:type="spellStart"/>
+      <w:r>
+        <w:rPr>
+          <w:lang w:val="en-ID"/>
+        </w:rPr>
+        <w:t>tinggi</w:t>
+      </w:r>
+      <w:proofErr w:type="spellEnd"/>
+      <w:r>
+        <w:rPr>
+          <w:lang w:val="en-ID"/>
+        </w:rPr>
+        <w:t xml:space="preserve"> </w:t>
+      </w:r>
+      <w:proofErr w:type="spellStart"/>
+      <w:r>
+        <w:rPr>
+          <w:lang w:val="en-ID"/>
+        </w:rPr>
+        <w:t>karena</w:t>
+      </w:r>
+      <w:proofErr w:type="spellEnd"/>
+      <w:r>
+        <w:rPr>
+          <w:lang w:val="en-ID"/>
+        </w:rPr>
+        <w:t xml:space="preserve"> </w:t>
+      </w:r>
+      <w:proofErr w:type="spellStart"/>
+      <w:proofErr w:type="gramStart"/>
+      <w:r>
+        <w:rPr>
+          <w:lang w:val="en-ID"/>
+        </w:rPr>
+        <w:t>menggunakan</w:t>
+      </w:r>
+      <w:proofErr w:type="spellEnd"/>
+      <w:r>
+        <w:rPr>
+          <w:lang w:val="en-ID"/>
+        </w:rPr>
+        <w:t xml:space="preserve"> .</w:t>
+      </w:r>
+      <w:proofErr w:type="spellStart"/>
+      <w:r>
+        <w:rPr>
+          <w:lang w:val="en-ID"/>
+        </w:rPr>
+        <w:t>innerHTML</w:t>
+      </w:r>
+      <w:proofErr w:type="spellEnd"/>
+      <w:proofErr w:type="gramEnd"/>
+      <w:r>
+        <w:rPr>
+          <w:lang w:val="en-ID"/>
+        </w:rPr>
+        <w:t xml:space="preserve">. Jika data yang </w:t>
+      </w:r>
+      <w:proofErr w:type="spellStart"/>
+      <w:r>
+        <w:rPr>
+          <w:lang w:val="en-ID"/>
+        </w:rPr>
+        <w:t>dimasukkan</w:t>
+      </w:r>
+      <w:proofErr w:type="spellEnd"/>
+      <w:r>
+        <w:rPr>
+          <w:lang w:val="en-ID"/>
+        </w:rPr>
+        <w:t xml:space="preserve"> </w:t>
+      </w:r>
+      <w:proofErr w:type="spellStart"/>
+      <w:r>
+        <w:rPr>
+          <w:lang w:val="en-ID"/>
+        </w:rPr>
+        <w:t>berasal</w:t>
+      </w:r>
+      <w:proofErr w:type="spellEnd"/>
+      <w:r>
+        <w:rPr>
+          <w:lang w:val="en-ID"/>
+        </w:rPr>
+        <w:t xml:space="preserve"> </w:t>
+      </w:r>
+      <w:proofErr w:type="spellStart"/>
+      <w:r>
+        <w:rPr>
+          <w:lang w:val="en-ID"/>
+        </w:rPr>
+        <w:t>dari</w:t>
+      </w:r>
+      <w:proofErr w:type="spellEnd"/>
+      <w:r>
+        <w:rPr>
+          <w:lang w:val="en-ID"/>
+        </w:rPr>
+        <w:t xml:space="preserve"> </w:t>
+      </w:r>
+      <w:r>
+        <w:rPr>
+          <w:lang w:val="en-ID"/>
+        </w:rPr>
+        <w:t xml:space="preserve">input user, </w:t>
+      </w:r>
+      <w:proofErr w:type="spellStart"/>
+      <w:r>
+        <w:rPr>
+          <w:lang w:val="en-ID"/>
+        </w:rPr>
+        <w:t>ini</w:t>
+      </w:r>
+      <w:proofErr w:type="spellEnd"/>
+      <w:r>
+        <w:rPr>
+          <w:lang w:val="en-ID"/>
+        </w:rPr>
+        <w:t xml:space="preserve"> </w:t>
+      </w:r>
+      <w:proofErr w:type="spellStart"/>
+      <w:r>
+        <w:rPr>
+          <w:lang w:val="en-ID"/>
+        </w:rPr>
+        <w:t>bisa</w:t>
+      </w:r>
+      <w:proofErr w:type="spellEnd"/>
+      <w:r>
+        <w:rPr>
+          <w:lang w:val="en-ID"/>
+        </w:rPr>
+        <w:t xml:space="preserve"> </w:t>
+      </w:r>
+      <w:proofErr w:type="spellStart"/>
+      <w:r>
+        <w:rPr>
+          <w:lang w:val="en-ID"/>
+        </w:rPr>
+        <w:t>dimanfaatkan</w:t>
+      </w:r>
+      <w:proofErr w:type="spellEnd"/>
+      <w:r>
+        <w:rPr>
+          <w:lang w:val="en-ID"/>
+        </w:rPr>
+        <w:t xml:space="preserve"> </w:t>
+      </w:r>
+      <w:proofErr w:type="spellStart"/>
+      <w:r>
+        <w:rPr>
+          <w:lang w:val="en-ID"/>
+        </w:rPr>
+        <w:t>untuk</w:t>
+      </w:r>
+      <w:proofErr w:type="spellEnd"/>
+      <w:r>
+        <w:rPr>
+          <w:lang w:val="en-ID"/>
+        </w:rPr>
+        <w:t xml:space="preserve"> </w:t>
+      </w:r>
+      <w:proofErr w:type="spellStart"/>
+      <w:r>
+        <w:rPr>
+          <w:lang w:val="en-ID"/>
+        </w:rPr>
+        <w:t>menyuntikkan</w:t>
+      </w:r>
+      <w:proofErr w:type="spellEnd"/>
+      <w:r>
+        <w:rPr>
+          <w:lang w:val="en-ID"/>
+        </w:rPr>
+        <w:t xml:space="preserve"> </w:t>
+      </w:r>
+      <w:proofErr w:type="spellStart"/>
+      <w:r>
+        <w:rPr>
+          <w:lang w:val="en-ID"/>
+        </w:rPr>
+        <w:t>skrip</w:t>
+      </w:r>
+      <w:proofErr w:type="spellEnd"/>
+      <w:r>
+        <w:rPr>
+          <w:lang w:val="en-ID"/>
+        </w:rPr>
+        <w:t xml:space="preserve"> </w:t>
+      </w:r>
+      <w:proofErr w:type="spellStart"/>
+      <w:r>
+        <w:rPr>
+          <w:lang w:val="en-ID"/>
+        </w:rPr>
+        <w:t>berbahaya</w:t>
+      </w:r>
+      <w:proofErr w:type="spellEnd"/>
+      <w:r>
+        <w:rPr>
+          <w:lang w:val="en-ID"/>
+        </w:rPr>
+        <w:t>.</w:t>
       </w:r>
     </w:p>
     <w:p>
@@ -2356,6 +4645,7 @@
         <w:rPr>
           <w:lang w:val="en-ID"/>
         </w:rPr>
+        <w:lastRenderedPageBreak/>
         <w:t xml:space="preserve">3. </w:t>
       </w:r>
       <w:proofErr w:type="spellStart"/>
@@ -2426,7 +4716,6 @@
         <w:rPr>
           <w:lang w:val="en-ID"/>
         </w:rPr>
-        <w:lastRenderedPageBreak/>
         <w:t xml:space="preserve">4. Kapan </w:t>
       </w:r>
       <w:proofErr w:type="spellStart"/>
@@ -2993,6 +5282,92 @@
 <file path=word/numbering.xml><?xml version="1.0" encoding="utf-8"?>
 <w:numbering xmlns:wpc="http://schemas.microsoft.com/office/word/2010/wordprocessingCanvas" xmlns:cx="http://schemas.microsoft.com/office/drawing/2014/chartex" xmlns:cx1="http://schemas.microsoft.com/office/drawing/2015/9/8/chartex" xmlns:cx2="http://schemas.microsoft.com/office/drawing/2015/10/21/chartex" xmlns:cx3="http://schemas.microsoft.com/office/drawing/2016/5/9/chartex" xmlns:cx4="http://schemas.microsoft.com/office/drawing/2016/5/10/chartex" xmlns:cx5="http://schemas.microsoft.com/office/drawing/2016/5/11/chartex" xmlns:cx6="http://schemas.microsoft.com/office/drawing/2016/5/12/chartex" xmlns:cx7="http://schemas.microsoft.com/office/drawing/2016/5/13/chartex" xmlns:cx8="http://schemas.microsoft.com/office/drawing/2016/5/14/chartex" xmlns:mc="http://schemas.openxmlformats.org/markup-compatibility/2006" xmlns:aink="http://schemas.microsoft.com/office/drawing/2016/ink" xmlns:am3d="http://schemas.microsoft.com/office/drawing/2017/model3d" xmlns:o="urn:schemas-microsoft-com:office:office" xmlns:oel="http://schemas.microsoft.com/office/2019/extlst" xmlns:r="http://schemas.openxmlformats.org/officeDocument/2006/relationships" xmlns:m="http://schemas.openxmlformats.org/officeDocument/2006/math" xmlns:v="urn:schemas-microsoft-com:vml" xmlns:wp14="http://schemas.microsoft.com/office/word/2010/wordprocessingDrawing" xmlns:wp="http://schemas.openxmlformats.org/drawingml/2006/wordprocessingDrawing" xmlns:w10="urn:schemas-microsoft-com:office:word" xmlns:w="http://schemas.openxmlformats.org/wordprocessingml/2006/main" xmlns:w14="http://schemas.microsoft.com/office/word/2010/wordml" xmlns:w15="http://schemas.microsoft.com/office/word/2012/wordml" xmlns:w16cex="http://schemas.microsoft.com/office/word/2018/wordml/cex" xmlns:w16cid="http://schemas.microsoft.com/office/word/2016/wordml/cid" xmlns:w16="http://schemas.microsoft.com/office/word/2018/wordml" xmlns:w16du="http://schemas.microsoft.com/office/word/2023/wordml/word16du" xmlns:w16sdtdh="http://schemas.microsoft.com/office/word/2020/wordml/sdtdatahash" xmlns:w16sdtfl="http://schemas.microsoft.com/office/word/2024/wordml/sdtformatlock" xmlns:w16se="http://schemas.microsoft.com/office/word/2015/wordml/symex" xmlns:wpg="http://schemas.microsoft.com/office/word/2010/wordprocessingGroup" xmlns:wpi="http://schemas.microsoft.com/office/word/2010/wordprocessingInk" xmlns:wne="http://schemas.microsoft.com/office/word/2006/wordml" xmlns:wps="http://schemas.microsoft.com/office/word/2010/wordprocessingShape" mc:Ignorable="w14 w15 w16se w16cid w16 w16cex w16sdtdh w16sdtfl w16du wp14">
   <w:abstractNum w:abstractNumId="0" w15:restartNumberingAfterBreak="0">
+    <w:nsid w:val="004D3CC4"/>
+    <w:multiLevelType w:val="hybridMultilevel"/>
+    <w:tmpl w:val="7A24134C"/>
+    <w:lvl w:ilvl="0" w:tplc="38090019">
+      <w:start w:val="1"/>
+      <w:numFmt w:val="lowerLetter"/>
+      <w:lvlText w:val="%1."/>
+      <w:lvlJc w:val="left"/>
+      <w:pPr>
+        <w:ind w:left="720" w:hanging="360"/>
+      </w:pPr>
+    </w:lvl>
+    <w:lvl w:ilvl="1" w:tplc="38090019">
+      <w:start w:val="1"/>
+      <w:numFmt w:val="lowerLetter"/>
+      <w:lvlText w:val="%2."/>
+      <w:lvlJc w:val="left"/>
+      <w:pPr>
+        <w:ind w:left="786" w:hanging="360"/>
+      </w:pPr>
+    </w:lvl>
+    <w:lvl w:ilvl="2" w:tplc="3809001B" w:tentative="1">
+      <w:start w:val="1"/>
+      <w:numFmt w:val="lowerRoman"/>
+      <w:lvlText w:val="%3."/>
+      <w:lvlJc w:val="right"/>
+      <w:pPr>
+        <w:ind w:left="2160" w:hanging="180"/>
+      </w:pPr>
+    </w:lvl>
+    <w:lvl w:ilvl="3" w:tplc="3809000F" w:tentative="1">
+      <w:start w:val="1"/>
+      <w:numFmt w:val="decimal"/>
+      <w:lvlText w:val="%4."/>
+      <w:lvlJc w:val="left"/>
+      <w:pPr>
+        <w:ind w:left="2880" w:hanging="360"/>
+      </w:pPr>
+    </w:lvl>
+    <w:lvl w:ilvl="4" w:tplc="38090019" w:tentative="1">
+      <w:start w:val="1"/>
+      <w:numFmt w:val="lowerLetter"/>
+      <w:lvlText w:val="%5."/>
+      <w:lvlJc w:val="left"/>
+      <w:pPr>
+        <w:ind w:left="3600" w:hanging="360"/>
+      </w:pPr>
+    </w:lvl>
+    <w:lvl w:ilvl="5" w:tplc="3809001B" w:tentative="1">
+      <w:start w:val="1"/>
+      <w:numFmt w:val="lowerRoman"/>
+      <w:lvlText w:val="%6."/>
+      <w:lvlJc w:val="right"/>
+      <w:pPr>
+        <w:ind w:left="4320" w:hanging="180"/>
+      </w:pPr>
+    </w:lvl>
+    <w:lvl w:ilvl="6" w:tplc="3809000F" w:tentative="1">
+      <w:start w:val="1"/>
+      <w:numFmt w:val="decimal"/>
+      <w:lvlText w:val="%7."/>
+      <w:lvlJc w:val="left"/>
+      <w:pPr>
+        <w:ind w:left="5040" w:hanging="360"/>
+      </w:pPr>
+    </w:lvl>
+    <w:lvl w:ilvl="7" w:tplc="38090019" w:tentative="1">
+      <w:start w:val="1"/>
+      <w:numFmt w:val="lowerLetter"/>
+      <w:lvlText w:val="%8."/>
+      <w:lvlJc w:val="left"/>
+      <w:pPr>
+        <w:ind w:left="5760" w:hanging="360"/>
+      </w:pPr>
+    </w:lvl>
+    <w:lvl w:ilvl="8" w:tplc="3809001B" w:tentative="1">
+      <w:start w:val="1"/>
+      <w:numFmt w:val="lowerRoman"/>
+      <w:lvlText w:val="%9."/>
+      <w:lvlJc w:val="right"/>
+      <w:pPr>
+        <w:ind w:left="6480" w:hanging="180"/>
+      </w:pPr>
+    </w:lvl>
+  </w:abstractNum>
+  <w:abstractNum w:abstractNumId="1" w15:restartNumberingAfterBreak="0">
     <w:nsid w:val="0C123735"/>
     <w:multiLevelType w:val="hybridMultilevel"/>
     <w:tmpl w:val="460218A0"/>
@@ -3104,7 +5479,7 @@
       </w:rPr>
     </w:lvl>
   </w:abstractNum>
-  <w:abstractNum w:abstractNumId="1" w15:restartNumberingAfterBreak="0">
+  <w:abstractNum w:abstractNumId="2" w15:restartNumberingAfterBreak="0">
     <w:nsid w:val="1F565CD5"/>
     <w:multiLevelType w:val="hybridMultilevel"/>
     <w:tmpl w:val="4DF63646"/>
@@ -3193,7 +5568,7 @@
       </w:pPr>
     </w:lvl>
   </w:abstractNum>
-  <w:abstractNum w:abstractNumId="2" w15:restartNumberingAfterBreak="0">
+  <w:abstractNum w:abstractNumId="3" w15:restartNumberingAfterBreak="0">
     <w:nsid w:val="26832CE7"/>
     <w:multiLevelType w:val="hybridMultilevel"/>
     <w:tmpl w:val="A1AAA22C"/>
@@ -3279,7 +5654,179 @@
       </w:pPr>
     </w:lvl>
   </w:abstractNum>
-  <w:abstractNum w:abstractNumId="3" w15:restartNumberingAfterBreak="0">
+  <w:abstractNum w:abstractNumId="4" w15:restartNumberingAfterBreak="0">
+    <w:nsid w:val="36AF0EBE"/>
+    <w:multiLevelType w:val="hybridMultilevel"/>
+    <w:tmpl w:val="94EEFD28"/>
+    <w:lvl w:ilvl="0" w:tplc="38090019">
+      <w:start w:val="1"/>
+      <w:numFmt w:val="lowerLetter"/>
+      <w:lvlText w:val="%1."/>
+      <w:lvlJc w:val="left"/>
+      <w:pPr>
+        <w:ind w:left="720" w:hanging="360"/>
+      </w:pPr>
+    </w:lvl>
+    <w:lvl w:ilvl="1" w:tplc="38090019">
+      <w:start w:val="1"/>
+      <w:numFmt w:val="lowerLetter"/>
+      <w:lvlText w:val="%2."/>
+      <w:lvlJc w:val="left"/>
+      <w:pPr>
+        <w:ind w:left="786" w:hanging="360"/>
+      </w:pPr>
+    </w:lvl>
+    <w:lvl w:ilvl="2" w:tplc="3809001B" w:tentative="1">
+      <w:start w:val="1"/>
+      <w:numFmt w:val="lowerRoman"/>
+      <w:lvlText w:val="%3."/>
+      <w:lvlJc w:val="right"/>
+      <w:pPr>
+        <w:ind w:left="2160" w:hanging="180"/>
+      </w:pPr>
+    </w:lvl>
+    <w:lvl w:ilvl="3" w:tplc="3809000F" w:tentative="1">
+      <w:start w:val="1"/>
+      <w:numFmt w:val="decimal"/>
+      <w:lvlText w:val="%4."/>
+      <w:lvlJc w:val="left"/>
+      <w:pPr>
+        <w:ind w:left="2880" w:hanging="360"/>
+      </w:pPr>
+    </w:lvl>
+    <w:lvl w:ilvl="4" w:tplc="38090019" w:tentative="1">
+      <w:start w:val="1"/>
+      <w:numFmt w:val="lowerLetter"/>
+      <w:lvlText w:val="%5."/>
+      <w:lvlJc w:val="left"/>
+      <w:pPr>
+        <w:ind w:left="3600" w:hanging="360"/>
+      </w:pPr>
+    </w:lvl>
+    <w:lvl w:ilvl="5" w:tplc="3809001B" w:tentative="1">
+      <w:start w:val="1"/>
+      <w:numFmt w:val="lowerRoman"/>
+      <w:lvlText w:val="%6."/>
+      <w:lvlJc w:val="right"/>
+      <w:pPr>
+        <w:ind w:left="4320" w:hanging="180"/>
+      </w:pPr>
+    </w:lvl>
+    <w:lvl w:ilvl="6" w:tplc="3809000F" w:tentative="1">
+      <w:start w:val="1"/>
+      <w:numFmt w:val="decimal"/>
+      <w:lvlText w:val="%7."/>
+      <w:lvlJc w:val="left"/>
+      <w:pPr>
+        <w:ind w:left="5040" w:hanging="360"/>
+      </w:pPr>
+    </w:lvl>
+    <w:lvl w:ilvl="7" w:tplc="38090019" w:tentative="1">
+      <w:start w:val="1"/>
+      <w:numFmt w:val="lowerLetter"/>
+      <w:lvlText w:val="%8."/>
+      <w:lvlJc w:val="left"/>
+      <w:pPr>
+        <w:ind w:left="5760" w:hanging="360"/>
+      </w:pPr>
+    </w:lvl>
+    <w:lvl w:ilvl="8" w:tplc="3809001B" w:tentative="1">
+      <w:start w:val="1"/>
+      <w:numFmt w:val="lowerRoman"/>
+      <w:lvlText w:val="%9."/>
+      <w:lvlJc w:val="right"/>
+      <w:pPr>
+        <w:ind w:left="6480" w:hanging="180"/>
+      </w:pPr>
+    </w:lvl>
+  </w:abstractNum>
+  <w:abstractNum w:abstractNumId="5" w15:restartNumberingAfterBreak="0">
+    <w:nsid w:val="3A10290E"/>
+    <w:multiLevelType w:val="hybridMultilevel"/>
+    <w:tmpl w:val="9D566C26"/>
+    <w:lvl w:ilvl="0" w:tplc="38090019">
+      <w:start w:val="1"/>
+      <w:numFmt w:val="lowerLetter"/>
+      <w:lvlText w:val="%1."/>
+      <w:lvlJc w:val="left"/>
+      <w:pPr>
+        <w:ind w:left="720" w:hanging="360"/>
+      </w:pPr>
+    </w:lvl>
+    <w:lvl w:ilvl="1" w:tplc="38090019">
+      <w:start w:val="1"/>
+      <w:numFmt w:val="lowerLetter"/>
+      <w:lvlText w:val="%2."/>
+      <w:lvlJc w:val="left"/>
+      <w:pPr>
+        <w:ind w:left="786" w:hanging="360"/>
+      </w:pPr>
+    </w:lvl>
+    <w:lvl w:ilvl="2" w:tplc="3809001B" w:tentative="1">
+      <w:start w:val="1"/>
+      <w:numFmt w:val="lowerRoman"/>
+      <w:lvlText w:val="%3."/>
+      <w:lvlJc w:val="right"/>
+      <w:pPr>
+        <w:ind w:left="2160" w:hanging="180"/>
+      </w:pPr>
+    </w:lvl>
+    <w:lvl w:ilvl="3" w:tplc="3809000F" w:tentative="1">
+      <w:start w:val="1"/>
+      <w:numFmt w:val="decimal"/>
+      <w:lvlText w:val="%4."/>
+      <w:lvlJc w:val="left"/>
+      <w:pPr>
+        <w:ind w:left="2880" w:hanging="360"/>
+      </w:pPr>
+    </w:lvl>
+    <w:lvl w:ilvl="4" w:tplc="38090019" w:tentative="1">
+      <w:start w:val="1"/>
+      <w:numFmt w:val="lowerLetter"/>
+      <w:lvlText w:val="%5."/>
+      <w:lvlJc w:val="left"/>
+      <w:pPr>
+        <w:ind w:left="3600" w:hanging="360"/>
+      </w:pPr>
+    </w:lvl>
+    <w:lvl w:ilvl="5" w:tplc="3809001B" w:tentative="1">
+      <w:start w:val="1"/>
+      <w:numFmt w:val="lowerRoman"/>
+      <w:lvlText w:val="%6."/>
+      <w:lvlJc w:val="right"/>
+      <w:pPr>
+        <w:ind w:left="4320" w:hanging="180"/>
+      </w:pPr>
+    </w:lvl>
+    <w:lvl w:ilvl="6" w:tplc="3809000F" w:tentative="1">
+      <w:start w:val="1"/>
+      <w:numFmt w:val="decimal"/>
+      <w:lvlText w:val="%7."/>
+      <w:lvlJc w:val="left"/>
+      <w:pPr>
+        <w:ind w:left="5040" w:hanging="360"/>
+      </w:pPr>
+    </w:lvl>
+    <w:lvl w:ilvl="7" w:tplc="38090019" w:tentative="1">
+      <w:start w:val="1"/>
+      <w:numFmt w:val="lowerLetter"/>
+      <w:lvlText w:val="%8."/>
+      <w:lvlJc w:val="left"/>
+      <w:pPr>
+        <w:ind w:left="5760" w:hanging="360"/>
+      </w:pPr>
+    </w:lvl>
+    <w:lvl w:ilvl="8" w:tplc="3809001B" w:tentative="1">
+      <w:start w:val="1"/>
+      <w:numFmt w:val="lowerRoman"/>
+      <w:lvlText w:val="%9."/>
+      <w:lvlJc w:val="right"/>
+      <w:pPr>
+        <w:ind w:left="6480" w:hanging="180"/>
+      </w:pPr>
+    </w:lvl>
+  </w:abstractNum>
+  <w:abstractNum w:abstractNumId="6" w15:restartNumberingAfterBreak="0">
     <w:nsid w:val="3DD54B1A"/>
     <w:multiLevelType w:val="hybridMultilevel"/>
     <w:tmpl w:val="72F0C010"/>
@@ -3368,7 +5915,7 @@
       </w:pPr>
     </w:lvl>
   </w:abstractNum>
-  <w:abstractNum w:abstractNumId="4" w15:restartNumberingAfterBreak="0">
+  <w:abstractNum w:abstractNumId="7" w15:restartNumberingAfterBreak="0">
     <w:nsid w:val="46C838B5"/>
     <w:multiLevelType w:val="hybridMultilevel"/>
     <w:tmpl w:val="3C027148"/>
@@ -3457,7 +6004,7 @@
       </w:pPr>
     </w:lvl>
   </w:abstractNum>
-  <w:abstractNum w:abstractNumId="5" w15:restartNumberingAfterBreak="0">
+  <w:abstractNum w:abstractNumId="8" w15:restartNumberingAfterBreak="0">
     <w:nsid w:val="4A653950"/>
     <w:multiLevelType w:val="hybridMultilevel"/>
     <w:tmpl w:val="CB30A4D0"/>
@@ -3570,7 +6117,96 @@
       </w:rPr>
     </w:lvl>
   </w:abstractNum>
-  <w:abstractNum w:abstractNumId="6" w15:restartNumberingAfterBreak="0">
+  <w:abstractNum w:abstractNumId="9" w15:restartNumberingAfterBreak="0">
+    <w:nsid w:val="5244453D"/>
+    <w:multiLevelType w:val="hybridMultilevel"/>
+    <w:tmpl w:val="EE32B398"/>
+    <w:lvl w:ilvl="0" w:tplc="8EB06F80">
+      <w:start w:val="1"/>
+      <w:numFmt w:val="upperRoman"/>
+      <w:lvlText w:val="%1."/>
+      <w:lvlJc w:val="left"/>
+      <w:pPr>
+        <w:ind w:left="1080" w:hanging="720"/>
+      </w:pPr>
+      <w:rPr>
+        <w:rFonts w:hint="default"/>
+      </w:rPr>
+    </w:lvl>
+    <w:lvl w:ilvl="1" w:tplc="38090019" w:tentative="1">
+      <w:start w:val="1"/>
+      <w:numFmt w:val="lowerLetter"/>
+      <w:lvlText w:val="%2."/>
+      <w:lvlJc w:val="left"/>
+      <w:pPr>
+        <w:ind w:left="1440" w:hanging="360"/>
+      </w:pPr>
+    </w:lvl>
+    <w:lvl w:ilvl="2" w:tplc="3809001B" w:tentative="1">
+      <w:start w:val="1"/>
+      <w:numFmt w:val="lowerRoman"/>
+      <w:lvlText w:val="%3."/>
+      <w:lvlJc w:val="right"/>
+      <w:pPr>
+        <w:ind w:left="2160" w:hanging="180"/>
+      </w:pPr>
+    </w:lvl>
+    <w:lvl w:ilvl="3" w:tplc="3809000F" w:tentative="1">
+      <w:start w:val="1"/>
+      <w:numFmt w:val="decimal"/>
+      <w:lvlText w:val="%4."/>
+      <w:lvlJc w:val="left"/>
+      <w:pPr>
+        <w:ind w:left="2880" w:hanging="360"/>
+      </w:pPr>
+    </w:lvl>
+    <w:lvl w:ilvl="4" w:tplc="38090019" w:tentative="1">
+      <w:start w:val="1"/>
+      <w:numFmt w:val="lowerLetter"/>
+      <w:lvlText w:val="%5."/>
+      <w:lvlJc w:val="left"/>
+      <w:pPr>
+        <w:ind w:left="3600" w:hanging="360"/>
+      </w:pPr>
+    </w:lvl>
+    <w:lvl w:ilvl="5" w:tplc="3809001B" w:tentative="1">
+      <w:start w:val="1"/>
+      <w:numFmt w:val="lowerRoman"/>
+      <w:lvlText w:val="%6."/>
+      <w:lvlJc w:val="right"/>
+      <w:pPr>
+        <w:ind w:left="4320" w:hanging="180"/>
+      </w:pPr>
+    </w:lvl>
+    <w:lvl w:ilvl="6" w:tplc="3809000F" w:tentative="1">
+      <w:start w:val="1"/>
+      <w:numFmt w:val="decimal"/>
+      <w:lvlText w:val="%7."/>
+      <w:lvlJc w:val="left"/>
+      <w:pPr>
+        <w:ind w:left="5040" w:hanging="360"/>
+      </w:pPr>
+    </w:lvl>
+    <w:lvl w:ilvl="7" w:tplc="38090019" w:tentative="1">
+      <w:start w:val="1"/>
+      <w:numFmt w:val="lowerLetter"/>
+      <w:lvlText w:val="%8."/>
+      <w:lvlJc w:val="left"/>
+      <w:pPr>
+        <w:ind w:left="5760" w:hanging="360"/>
+      </w:pPr>
+    </w:lvl>
+    <w:lvl w:ilvl="8" w:tplc="3809001B" w:tentative="1">
+      <w:start w:val="1"/>
+      <w:numFmt w:val="lowerRoman"/>
+      <w:lvlText w:val="%9."/>
+      <w:lvlJc w:val="right"/>
+      <w:pPr>
+        <w:ind w:left="6480" w:hanging="180"/>
+      </w:pPr>
+    </w:lvl>
+  </w:abstractNum>
+  <w:abstractNum w:abstractNumId="10" w15:restartNumberingAfterBreak="0">
     <w:nsid w:val="67B843D5"/>
     <w:multiLevelType w:val="hybridMultilevel"/>
     <w:tmpl w:val="2934F868"/>
@@ -3656,26 +6292,130 @@
       </w:pPr>
     </w:lvl>
   </w:abstractNum>
+  <w:abstractNum w:abstractNumId="11" w15:restartNumberingAfterBreak="0">
+    <w:nsid w:val="6A1E3CA5"/>
+    <w:multiLevelType w:val="hybridMultilevel"/>
+    <w:tmpl w:val="ED3E1E70"/>
+    <w:lvl w:ilvl="0" w:tplc="38090013">
+      <w:start w:val="1"/>
+      <w:numFmt w:val="upperRoman"/>
+      <w:lvlText w:val="%1."/>
+      <w:lvlJc w:val="right"/>
+      <w:pPr>
+        <w:ind w:left="720" w:hanging="360"/>
+      </w:pPr>
+    </w:lvl>
+    <w:lvl w:ilvl="1" w:tplc="89866C26">
+      <w:start w:val="1"/>
+      <w:numFmt w:val="lowerLetter"/>
+      <w:lvlText w:val="%2."/>
+      <w:lvlJc w:val="left"/>
+      <w:pPr>
+        <w:ind w:left="1440" w:hanging="360"/>
+      </w:pPr>
+      <w:rPr>
+        <w:rFonts w:hint="default"/>
+      </w:rPr>
+    </w:lvl>
+    <w:lvl w:ilvl="2" w:tplc="3809001B" w:tentative="1">
+      <w:start w:val="1"/>
+      <w:numFmt w:val="lowerRoman"/>
+      <w:lvlText w:val="%3."/>
+      <w:lvlJc w:val="right"/>
+      <w:pPr>
+        <w:ind w:left="2160" w:hanging="180"/>
+      </w:pPr>
+    </w:lvl>
+    <w:lvl w:ilvl="3" w:tplc="3809000F" w:tentative="1">
+      <w:start w:val="1"/>
+      <w:numFmt w:val="decimal"/>
+      <w:lvlText w:val="%4."/>
+      <w:lvlJc w:val="left"/>
+      <w:pPr>
+        <w:ind w:left="2880" w:hanging="360"/>
+      </w:pPr>
+    </w:lvl>
+    <w:lvl w:ilvl="4" w:tplc="38090019" w:tentative="1">
+      <w:start w:val="1"/>
+      <w:numFmt w:val="lowerLetter"/>
+      <w:lvlText w:val="%5."/>
+      <w:lvlJc w:val="left"/>
+      <w:pPr>
+        <w:ind w:left="3600" w:hanging="360"/>
+      </w:pPr>
+    </w:lvl>
+    <w:lvl w:ilvl="5" w:tplc="3809001B" w:tentative="1">
+      <w:start w:val="1"/>
+      <w:numFmt w:val="lowerRoman"/>
+      <w:lvlText w:val="%6."/>
+      <w:lvlJc w:val="right"/>
+      <w:pPr>
+        <w:ind w:left="4320" w:hanging="180"/>
+      </w:pPr>
+    </w:lvl>
+    <w:lvl w:ilvl="6" w:tplc="3809000F" w:tentative="1">
+      <w:start w:val="1"/>
+      <w:numFmt w:val="decimal"/>
+      <w:lvlText w:val="%7."/>
+      <w:lvlJc w:val="left"/>
+      <w:pPr>
+        <w:ind w:left="5040" w:hanging="360"/>
+      </w:pPr>
+    </w:lvl>
+    <w:lvl w:ilvl="7" w:tplc="38090019" w:tentative="1">
+      <w:start w:val="1"/>
+      <w:numFmt w:val="lowerLetter"/>
+      <w:lvlText w:val="%8."/>
+      <w:lvlJc w:val="left"/>
+      <w:pPr>
+        <w:ind w:left="5760" w:hanging="360"/>
+      </w:pPr>
+    </w:lvl>
+    <w:lvl w:ilvl="8" w:tplc="3809001B" w:tentative="1">
+      <w:start w:val="1"/>
+      <w:numFmt w:val="lowerRoman"/>
+      <w:lvlText w:val="%9."/>
+      <w:lvlJc w:val="right"/>
+      <w:pPr>
+        <w:ind w:left="6480" w:hanging="180"/>
+      </w:pPr>
+    </w:lvl>
+  </w:abstractNum>
   <w:num w:numId="1" w16cid:durableId="1932663321">
-    <w:abstractNumId w:val="0"/>
+    <w:abstractNumId w:val="1"/>
   </w:num>
   <w:num w:numId="2" w16cid:durableId="267928234">
-    <w:abstractNumId w:val="1"/>
+    <w:abstractNumId w:val="2"/>
   </w:num>
   <w:num w:numId="3" w16cid:durableId="2021731811">
-    <w:abstractNumId w:val="2"/>
+    <w:abstractNumId w:val="3"/>
   </w:num>
   <w:num w:numId="4" w16cid:durableId="1913074882">
-    <w:abstractNumId w:val="3"/>
+    <w:abstractNumId w:val="6"/>
   </w:num>
   <w:num w:numId="5" w16cid:durableId="1741516475">
+    <w:abstractNumId w:val="8"/>
+  </w:num>
+  <w:num w:numId="6" w16cid:durableId="1561865070">
+    <w:abstractNumId w:val="7"/>
+  </w:num>
+  <w:num w:numId="7" w16cid:durableId="753816043">
+    <w:abstractNumId w:val="10"/>
+  </w:num>
+  <w:num w:numId="8" w16cid:durableId="1210456468">
+    <w:abstractNumId w:val="11"/>
+  </w:num>
+  <w:num w:numId="9" w16cid:durableId="1384138858">
+    <w:abstractNumId w:val="9"/>
+  </w:num>
+  <w:num w:numId="10" w16cid:durableId="707492099">
     <w:abstractNumId w:val="5"/>
   </w:num>
-  <w:num w:numId="6" w16cid:durableId="1561865070">
+  <w:num w:numId="11" w16cid:durableId="1228030284">
     <w:abstractNumId w:val="4"/>
   </w:num>
-  <w:num w:numId="7" w16cid:durableId="753816043">
-    <w:abstractNumId w:val="6"/>
+  <w:num w:numId="12" w16cid:durableId="1027826030">
+    <w:abstractNumId w:val="0"/>
   </w:num>
 </w:numbering>
 </file>

</xml_diff>

<commit_message>
5. Dokumentasikan perubahan performa (screenshot Lighthouse)
</commit_message>
<xml_diff>
--- a/Laporan/03_Ahmad Dzul Fadhli Jobsheet 18&19.docx
+++ b/Laporan/03_Ahmad Dzul Fadhli Jobsheet 18&19.docx
@@ -148,6 +148,9 @@
     </w:p>
     <w:p>
       <w:r>
+        <w:rPr>
+          <w:noProof/>
+        </w:rPr>
         <w:drawing>
           <wp:inline distT="0" distB="0" distL="0" distR="0" wp14:anchorId="7E3E9632" wp14:editId="3BBBD379">
             <wp:extent cx="2880000" cy="2013231"/>
@@ -206,6 +209,7 @@
       </w:pPr>
       <w:r>
         <w:rPr>
+          <w:noProof/>
           <w:lang w:val="en-ID"/>
         </w:rPr>
         <w:drawing>
@@ -402,6 +406,9 @@
     </w:p>
     <w:p>
       <w:r>
+        <w:rPr>
+          <w:noProof/>
+        </w:rPr>
         <w:drawing>
           <wp:inline distT="0" distB="0" distL="0" distR="0" wp14:anchorId="0D670E3A" wp14:editId="6CF59631">
             <wp:extent cx="2880000" cy="663385"/>
@@ -441,6 +448,9 @@
     </w:p>
     <w:p>
       <w:r>
+        <w:rPr>
+          <w:noProof/>
+        </w:rPr>
         <w:drawing>
           <wp:inline distT="0" distB="0" distL="0" distR="0" wp14:anchorId="546ACE02" wp14:editId="5E4C3B25">
             <wp:extent cx="2880000" cy="233846"/>
@@ -575,154 +585,163 @@
           <w:bCs/>
         </w:rPr>
       </w:pPr>
+      <w:proofErr w:type="gramStart"/>
       <w:r>
         <w:rPr>
           <w:b/>
           <w:bCs/>
         </w:rPr>
-        <w:t xml:space="preserve">Note : </w:t>
-      </w:r>
-      <w:proofErr w:type="spellStart"/>
+        <w:t>Note :</w:t>
+      </w:r>
+      <w:proofErr w:type="gramEnd"/>
       <w:r>
         <w:rPr>
           <w:b/>
           <w:bCs/>
         </w:rPr>
-        <w:t>dikarenakan</w:t>
-      </w:r>
-      <w:proofErr w:type="spellEnd"/>
+        <w:t xml:space="preserve"> </w:t>
+      </w:r>
+      <w:proofErr w:type="spellStart"/>
       <w:r>
         <w:rPr>
           <w:b/>
           <w:bCs/>
         </w:rPr>
-        <w:t xml:space="preserve"> </w:t>
-      </w:r>
-      <w:proofErr w:type="spellStart"/>
+        <w:t>dikarenakan</w:t>
+      </w:r>
+      <w:proofErr w:type="spellEnd"/>
       <w:r>
         <w:rPr>
           <w:b/>
           <w:bCs/>
         </w:rPr>
-        <w:t>gambar</w:t>
-      </w:r>
-      <w:proofErr w:type="spellEnd"/>
+        <w:t xml:space="preserve"> </w:t>
+      </w:r>
+      <w:proofErr w:type="spellStart"/>
       <w:r>
         <w:rPr>
           <w:b/>
           <w:bCs/>
         </w:rPr>
-        <w:t xml:space="preserve"> </w:t>
-      </w:r>
-      <w:proofErr w:type="spellStart"/>
+        <w:t>gambar</w:t>
+      </w:r>
+      <w:proofErr w:type="spellEnd"/>
       <w:r>
         <w:rPr>
           <w:b/>
           <w:bCs/>
         </w:rPr>
-        <w:t>diambil</w:t>
-      </w:r>
-      <w:proofErr w:type="spellEnd"/>
+        <w:t xml:space="preserve"> </w:t>
+      </w:r>
+      <w:proofErr w:type="spellStart"/>
       <w:r>
         <w:rPr>
           <w:b/>
           <w:bCs/>
         </w:rPr>
-        <w:t xml:space="preserve"> </w:t>
-      </w:r>
-      <w:proofErr w:type="spellStart"/>
+        <w:t>diambil</w:t>
+      </w:r>
+      <w:proofErr w:type="spellEnd"/>
       <w:r>
         <w:rPr>
           <w:b/>
           <w:bCs/>
         </w:rPr>
-        <w:t>dari</w:t>
-      </w:r>
-      <w:proofErr w:type="spellEnd"/>
+        <w:t xml:space="preserve"> </w:t>
+      </w:r>
+      <w:proofErr w:type="spellStart"/>
       <w:r>
         <w:rPr>
           <w:b/>
           <w:bCs/>
         </w:rPr>
-        <w:t xml:space="preserve"> </w:t>
-      </w:r>
-      <w:proofErr w:type="spellStart"/>
+        <w:t>dari</w:t>
+      </w:r>
+      <w:proofErr w:type="spellEnd"/>
       <w:r>
         <w:rPr>
           <w:b/>
           <w:bCs/>
         </w:rPr>
-        <w:t>url</w:t>
-      </w:r>
-      <w:proofErr w:type="spellEnd"/>
+        <w:t xml:space="preserve"> </w:t>
+      </w:r>
+      <w:proofErr w:type="spellStart"/>
       <w:r>
         <w:rPr>
           <w:b/>
           <w:bCs/>
         </w:rPr>
-        <w:t xml:space="preserve"> </w:t>
-      </w:r>
-      <w:proofErr w:type="spellStart"/>
+        <w:t>url</w:t>
+      </w:r>
+      <w:proofErr w:type="spellEnd"/>
       <w:r>
         <w:rPr>
           <w:b/>
           <w:bCs/>
         </w:rPr>
-        <w:t>tertentu</w:t>
-      </w:r>
-      <w:proofErr w:type="spellEnd"/>
+        <w:t xml:space="preserve"> </w:t>
+      </w:r>
+      <w:proofErr w:type="spellStart"/>
       <w:r>
         <w:rPr>
           <w:b/>
           <w:bCs/>
         </w:rPr>
-        <w:t xml:space="preserve"> </w:t>
-      </w:r>
-      <w:proofErr w:type="spellStart"/>
+        <w:t>tertentu</w:t>
+      </w:r>
+      <w:proofErr w:type="spellEnd"/>
       <w:r>
         <w:rPr>
           <w:b/>
           <w:bCs/>
         </w:rPr>
-        <w:t>maka</w:t>
-      </w:r>
-      <w:proofErr w:type="spellEnd"/>
+        <w:t xml:space="preserve"> </w:t>
+      </w:r>
+      <w:proofErr w:type="spellStart"/>
       <w:r>
         <w:rPr>
           <w:b/>
           <w:bCs/>
         </w:rPr>
-        <w:t xml:space="preserve"> </w:t>
-      </w:r>
-      <w:proofErr w:type="spellStart"/>
+        <w:t>maka</w:t>
+      </w:r>
+      <w:proofErr w:type="spellEnd"/>
       <w:r>
         <w:rPr>
           <w:b/>
           <w:bCs/>
         </w:rPr>
-        <w:t>konfigurasi</w:t>
-      </w:r>
-      <w:proofErr w:type="spellEnd"/>
+        <w:t xml:space="preserve"> </w:t>
+      </w:r>
+      <w:proofErr w:type="spellStart"/>
       <w:r>
         <w:rPr>
           <w:b/>
           <w:bCs/>
         </w:rPr>
-        <w:t xml:space="preserve"> </w:t>
-      </w:r>
-      <w:proofErr w:type="spellStart"/>
+        <w:t>konfigurasi</w:t>
+      </w:r>
+      <w:proofErr w:type="spellEnd"/>
       <w:r>
         <w:rPr>
           <w:b/>
           <w:bCs/>
         </w:rPr>
-        <w:t>berbed</w:t>
-      </w:r>
+        <w:t xml:space="preserve"> </w:t>
+      </w:r>
+      <w:proofErr w:type="spellStart"/>
       <w:r>
         <w:rPr>
           <w:b/>
           <w:bCs/>
         </w:rPr>
+        <w:t>berbed</w:t>
+      </w:r>
+      <w:r>
+        <w:rPr>
+          <w:b/>
+          <w:bCs/>
+        </w:rPr>
         <w:t>a</w:t>
       </w:r>
       <w:proofErr w:type="spellEnd"/>
@@ -734,6 +753,9 @@
     </w:p>
     <w:p>
       <w:r>
+        <w:rPr>
+          <w:noProof/>
+        </w:rPr>
         <w:drawing>
           <wp:inline distT="0" distB="0" distL="0" distR="0" wp14:anchorId="460F9ABE" wp14:editId="7B893285">
             <wp:extent cx="2880000" cy="2520923"/>
@@ -792,6 +814,7 @@
       </w:pPr>
       <w:r>
         <w:rPr>
+          <w:noProof/>
           <w:lang w:val="en-ID"/>
         </w:rPr>
         <w:drawing>
@@ -976,6 +999,9 @@
     </w:p>
     <w:p>
       <w:r>
+        <w:rPr>
+          <w:noProof/>
+        </w:rPr>
         <w:drawing>
           <wp:inline distT="0" distB="0" distL="0" distR="0" wp14:anchorId="1F182EF7" wp14:editId="7A846795">
             <wp:extent cx="2880000" cy="663385"/>
@@ -1015,6 +1041,9 @@
     </w:p>
     <w:p>
       <w:r>
+        <w:rPr>
+          <w:noProof/>
+        </w:rPr>
         <w:drawing>
           <wp:inline distT="0" distB="0" distL="0" distR="0" wp14:anchorId="17C377CD" wp14:editId="0D81CF6D">
             <wp:extent cx="2880000" cy="1065846"/>
@@ -1054,6 +1083,9 @@
     </w:p>
     <w:p>
       <w:r>
+        <w:rPr>
+          <w:noProof/>
+        </w:rPr>
         <w:drawing>
           <wp:inline distT="0" distB="0" distL="0" distR="0" wp14:anchorId="4448CC5A" wp14:editId="30F6A7CB">
             <wp:extent cx="2880000" cy="663385"/>
@@ -1277,6 +1309,9 @@
     </w:p>
     <w:p>
       <w:r>
+        <w:rPr>
+          <w:noProof/>
+        </w:rPr>
         <w:drawing>
           <wp:inline distT="0" distB="0" distL="0" distR="0" wp14:anchorId="20B79C0E" wp14:editId="542D2C4E">
             <wp:extent cx="2880000" cy="1685231"/>
@@ -1483,6 +1518,9 @@
     </w:p>
     <w:p>
       <w:r>
+        <w:rPr>
+          <w:noProof/>
+        </w:rPr>
         <w:drawing>
           <wp:inline distT="0" distB="0" distL="0" distR="0" wp14:anchorId="39818453" wp14:editId="26D4296C">
             <wp:extent cx="2880000" cy="641538"/>
@@ -1522,6 +1560,9 @@
     </w:p>
     <w:p>
       <w:r>
+        <w:rPr>
+          <w:noProof/>
+        </w:rPr>
         <w:drawing>
           <wp:inline distT="0" distB="0" distL="0" distR="0" wp14:anchorId="3A77486F" wp14:editId="028C2715">
             <wp:extent cx="2880000" cy="1217538"/>
@@ -2520,15 +2561,10 @@
         <w:rPr>
           <w:lang w:val="en-ID"/>
         </w:rPr>
-        <w:t xml:space="preserve"> JavaScript</w:t>
-      </w:r>
-      <w:r>
-        <w:rPr>
-          <w:lang w:val="en-ID"/>
-        </w:rPr>
-        <w:t xml:space="preserve"> </w:t>
-      </w:r>
-      <w:proofErr w:type="spellStart"/>
+        <w:t xml:space="preserve"> JavaScript </w:t>
+      </w:r>
+      <w:proofErr w:type="spellStart"/>
+      <w:proofErr w:type="gramStart"/>
       <w:r>
         <w:rPr>
           <w:lang w:val="en-ID"/>
@@ -2536,11 +2572,19 @@
         <w:t>document.getElementById</w:t>
       </w:r>
       <w:proofErr w:type="spellEnd"/>
-      <w:r>
-        <w:rPr>
-          <w:lang w:val="en-ID"/>
-        </w:rPr>
-        <w:t>('title').</w:t>
+      <w:proofErr w:type="gramEnd"/>
+      <w:r>
+        <w:rPr>
+          <w:lang w:val="en-ID"/>
+        </w:rPr>
+        <w:t>('title'</w:t>
+      </w:r>
+      <w:proofErr w:type="gramStart"/>
+      <w:r>
+        <w:rPr>
+          <w:lang w:val="en-ID"/>
+        </w:rPr>
+        <w:t>).</w:t>
       </w:r>
       <w:proofErr w:type="spellStart"/>
       <w:r>
@@ -2550,6 +2594,7 @@
         <w:t>innerHTML</w:t>
       </w:r>
       <w:proofErr w:type="spellEnd"/>
+      <w:proofErr w:type="gramEnd"/>
       <w:r>
         <w:rPr>
           <w:lang w:val="en-ID"/>
@@ -2582,13 +2627,7 @@
         <w:rPr>
           <w:lang w:val="en-ID"/>
         </w:rPr>
-        <w:t xml:space="preserve"> </w:t>
-      </w:r>
-      <w:r>
-        <w:rPr>
-          <w:lang w:val="en-ID"/>
-        </w:rPr>
-        <w:t xml:space="preserve">script </w:t>
+        <w:t xml:space="preserve"> script </w:t>
       </w:r>
       <w:proofErr w:type="spellStart"/>
       <w:r>
@@ -3566,6 +3605,7 @@
         <w:t xml:space="preserve"> </w:t>
       </w:r>
       <w:proofErr w:type="spellStart"/>
+      <w:proofErr w:type="gramStart"/>
       <w:r>
         <w:rPr>
           <w:lang w:val="en-ID"/>
@@ -3587,6 +3627,7 @@
         <w:t>innerHTML</w:t>
       </w:r>
       <w:proofErr w:type="spellEnd"/>
+      <w:proofErr w:type="gramEnd"/>
       <w:r>
         <w:rPr>
           <w:lang w:val="en-ID"/>
@@ -4247,6 +4288,7 @@
         <w:t xml:space="preserve"> pada folder layouts/navbar dan </w:t>
       </w:r>
       <w:proofErr w:type="spellStart"/>
+      <w:proofErr w:type="gramStart"/>
       <w:r>
         <w:t>modifikasi</w:t>
       </w:r>
@@ -4254,9 +4296,13 @@
       <w:r>
         <w:t xml:space="preserve"> :</w:t>
       </w:r>
-    </w:p>
-    <w:p>
-      <w:r>
+      <w:proofErr w:type="gramEnd"/>
+    </w:p>
+    <w:p>
+      <w:r>
+        <w:rPr>
+          <w:noProof/>
+        </w:rPr>
         <w:drawing>
           <wp:inline distT="0" distB="0" distL="0" distR="0" wp14:anchorId="49C0ABE4" wp14:editId="7F8F3379">
             <wp:extent cx="2880000" cy="641538"/>
@@ -4296,6 +4342,9 @@
     </w:p>
     <w:p>
       <w:r>
+        <w:rPr>
+          <w:noProof/>
+        </w:rPr>
         <w:drawing>
           <wp:inline distT="0" distB="0" distL="0" distR="0" wp14:anchorId="173ECC33" wp14:editId="005537E1">
             <wp:extent cx="2880000" cy="1621231"/>
@@ -4357,6 +4406,9 @@
     </w:p>
     <w:p>
       <w:r>
+        <w:rPr>
+          <w:noProof/>
+        </w:rPr>
         <w:drawing>
           <wp:inline distT="0" distB="0" distL="0" distR="0" wp14:anchorId="7F43EFF4" wp14:editId="10CA28C3">
             <wp:extent cx="2880000" cy="3735385"/>
@@ -4398,19 +4450,9 @@
       <w:pPr>
         <w:pStyle w:val="Heading2"/>
       </w:pPr>
-      <w:proofErr w:type="spellStart"/>
-      <w:r>
-        <w:t>Tugas</w:t>
-      </w:r>
-      <w:proofErr w:type="spellEnd"/>
-      <w:r>
-        <w:t xml:space="preserve"> </w:t>
-      </w:r>
-      <w:proofErr w:type="spellStart"/>
-      <w:r>
-        <w:t>Praktikum</w:t>
-      </w:r>
-      <w:proofErr w:type="spellEnd"/>
+      <w:r>
+        <w:t>Tugas Praktikum</w:t>
+      </w:r>
     </w:p>
     <w:p>
       <w:pPr>
@@ -4510,6 +4552,7 @@
       </w:pPr>
       <w:r>
         <w:rPr>
+          <w:noProof/>
           <w:lang w:val="en-ID"/>
         </w:rPr>
         <w:drawing>
@@ -4605,6 +4648,7 @@
       </w:pPr>
       <w:r>
         <w:rPr>
+          <w:noProof/>
           <w:lang w:val="en-ID"/>
         </w:rPr>
         <w:drawing>
@@ -4700,6 +4744,7 @@
       </w:pPr>
       <w:r>
         <w:rPr>
+          <w:noProof/>
           <w:lang w:val="en-ID"/>
         </w:rPr>
         <w:drawing>
@@ -4796,6 +4841,7 @@
       </w:pPr>
       <w:r>
         <w:rPr>
+          <w:noProof/>
           <w:lang w:val="en-ID"/>
         </w:rPr>
         <w:drawing>
@@ -4905,6 +4951,7 @@
       </w:pPr>
       <w:r>
         <w:rPr>
+          <w:noProof/>
           <w:lang w:val="en-ID"/>
         </w:rPr>
         <w:drawing>
@@ -4978,6 +5025,7 @@
       </w:pPr>
       <w:r>
         <w:rPr>
+          <w:noProof/>
           <w:lang w:val="en-ID"/>
         </w:rPr>
         <w:drawing>
@@ -5059,6 +5107,7 @@
       </w:pPr>
       <w:r>
         <w:rPr>
+          <w:noProof/>
           <w:lang w:val="en-ID"/>
         </w:rPr>
         <w:drawing>
@@ -5183,6 +5232,7 @@
       </w:pPr>
       <w:r>
         <w:rPr>
+          <w:noProof/>
           <w:lang w:val="en-ID"/>
         </w:rPr>
         <w:drawing>
@@ -5322,13 +5372,14 @@
       </w:pPr>
       <w:r>
         <w:rPr>
+          <w:noProof/>
           <w:lang w:val="en-ID"/>
         </w:rPr>
         <w:lastRenderedPageBreak/>
         <w:drawing>
-          <wp:inline distT="0" distB="0" distL="0" distR="0" wp14:anchorId="23C885B7" wp14:editId="0DE89FBA">
-            <wp:extent cx="2880000" cy="4240009"/>
-            <wp:effectExtent l="0" t="0" r="0" b="8255"/>
+          <wp:inline distT="0" distB="0" distL="0" distR="0" wp14:anchorId="23C885B7" wp14:editId="71A8B386">
+            <wp:extent cx="2520000" cy="3710008"/>
+            <wp:effectExtent l="0" t="0" r="0" b="5080"/>
             <wp:docPr id="1711440511" name="Picture 1"/>
             <wp:cNvGraphicFramePr>
               <a:graphicFrameLocks xmlns:a="http://schemas.openxmlformats.org/drawingml/2006/main" noChangeAspect="1"/>
@@ -5349,7 +5400,7 @@
                   <pic:spPr>
                     <a:xfrm>
                       <a:off x="0" y="0"/>
-                      <a:ext cx="2880000" cy="4240009"/>
+                      <a:ext cx="2520000" cy="3710008"/>
                     </a:xfrm>
                     <a:prstGeom prst="rect">
                       <a:avLst/>
@@ -5406,12 +5457,13 @@
       </w:pPr>
       <w:r>
         <w:rPr>
+          <w:noProof/>
           <w:lang w:val="en-ID"/>
         </w:rPr>
         <w:drawing>
-          <wp:inline distT="0" distB="0" distL="0" distR="0" wp14:anchorId="4791E053" wp14:editId="4809213D">
-            <wp:extent cx="2880000" cy="1656615"/>
-            <wp:effectExtent l="0" t="0" r="0" b="1270"/>
+          <wp:inline distT="0" distB="0" distL="0" distR="0" wp14:anchorId="4791E053" wp14:editId="46A49967">
+            <wp:extent cx="2520000" cy="1449538"/>
+            <wp:effectExtent l="0" t="0" r="0" b="0"/>
             <wp:docPr id="398947213" name="Picture 1"/>
             <wp:cNvGraphicFramePr>
               <a:graphicFrameLocks xmlns:a="http://schemas.openxmlformats.org/drawingml/2006/main" noChangeAspect="1"/>
@@ -5432,7 +5484,7 @@
                   <pic:spPr>
                     <a:xfrm>
                       <a:off x="0" y="0"/>
-                      <a:ext cx="2880000" cy="1656615"/>
+                      <a:ext cx="2520000" cy="1449538"/>
                     </a:xfrm>
                     <a:prstGeom prst="rect">
                       <a:avLst/>
@@ -5539,7 +5591,39 @@
         <w:rPr>
           <w:lang w:val="en-ID"/>
         </w:rPr>
-        <w:t xml:space="preserve"> pada branch pertemuan-6 </w:t>
+        <w:t xml:space="preserve"> agar </w:t>
+      </w:r>
+      <w:proofErr w:type="spellStart"/>
+      <w:r>
+        <w:rPr>
+          <w:lang w:val="en-ID"/>
+        </w:rPr>
+        <w:t>adil</w:t>
+      </w:r>
+      <w:proofErr w:type="spellEnd"/>
+      <w:r>
+        <w:rPr>
+          <w:lang w:val="en-ID"/>
+        </w:rPr>
+        <w:t>:</w:t>
+      </w:r>
+    </w:p>
+    <w:p>
+      <w:pPr>
+        <w:pStyle w:val="ListParagraph"/>
+        <w:numPr>
+          <w:ilvl w:val="2"/>
+          <w:numId w:val="11"/>
+        </w:numPr>
+        <w:rPr>
+          <w:lang w:val="en-ID"/>
+        </w:rPr>
+      </w:pPr>
+      <w:r>
+        <w:rPr>
+          <w:lang w:val="en-ID"/>
+        </w:rPr>
+        <w:t xml:space="preserve">pada branch pertemuan-6 </w:t>
       </w:r>
       <w:proofErr w:type="spellStart"/>
       <w:r>
@@ -5679,8 +5763,106 @@
         <w:rPr>
           <w:lang w:val="en-ID"/>
         </w:rPr>
-        <w:t xml:space="preserve">, dan </w:t>
-      </w:r>
+        <w:t xml:space="preserve">, </w:t>
+      </w:r>
+    </w:p>
+    <w:p>
+      <w:pPr>
+        <w:pStyle w:val="ListParagraph"/>
+        <w:numPr>
+          <w:ilvl w:val="2"/>
+          <w:numId w:val="11"/>
+        </w:numPr>
+        <w:rPr>
+          <w:lang w:val="en-ID"/>
+        </w:rPr>
+      </w:pPr>
+      <w:proofErr w:type="spellStart"/>
+      <w:r>
+        <w:rPr>
+          <w:lang w:val="en-ID"/>
+        </w:rPr>
+        <w:t>semua</w:t>
+      </w:r>
+      <w:proofErr w:type="spellEnd"/>
+      <w:r>
+        <w:rPr>
+          <w:lang w:val="en-ID"/>
+        </w:rPr>
+        <w:t xml:space="preserve"> </w:t>
+      </w:r>
+      <w:proofErr w:type="spellStart"/>
+      <w:r>
+        <w:rPr>
+          <w:lang w:val="en-ID"/>
+        </w:rPr>
+        <w:t>ekstensi</w:t>
+      </w:r>
+      <w:proofErr w:type="spellEnd"/>
+      <w:r>
+        <w:rPr>
+          <w:lang w:val="en-ID"/>
+        </w:rPr>
+        <w:t xml:space="preserve"> browser </w:t>
+      </w:r>
+      <w:proofErr w:type="spellStart"/>
+      <w:r>
+        <w:rPr>
+          <w:lang w:val="en-ID"/>
+        </w:rPr>
+        <w:t>menyala</w:t>
+      </w:r>
+      <w:proofErr w:type="spellEnd"/>
+      <w:r>
+        <w:rPr>
+          <w:lang w:val="en-ID"/>
+        </w:rPr>
+        <w:t xml:space="preserve">, </w:t>
+      </w:r>
+    </w:p>
+    <w:p>
+      <w:pPr>
+        <w:pStyle w:val="ListParagraph"/>
+        <w:numPr>
+          <w:ilvl w:val="2"/>
+          <w:numId w:val="11"/>
+        </w:numPr>
+        <w:rPr>
+          <w:lang w:val="en-ID"/>
+        </w:rPr>
+      </w:pPr>
+      <w:r>
+        <w:rPr>
+          <w:lang w:val="en-ID"/>
+        </w:rPr>
+        <w:t>route ke /, dan /</w:t>
+      </w:r>
+      <w:proofErr w:type="spellStart"/>
+      <w:r>
+        <w:rPr>
+          <w:lang w:val="en-ID"/>
+        </w:rPr>
+        <w:t>produk</w:t>
+      </w:r>
+      <w:proofErr w:type="spellEnd"/>
+      <w:r>
+        <w:rPr>
+          <w:lang w:val="en-ID"/>
+        </w:rPr>
+        <w:t xml:space="preserve">, </w:t>
+      </w:r>
+    </w:p>
+    <w:p>
+      <w:pPr>
+        <w:pStyle w:val="ListParagraph"/>
+        <w:numPr>
+          <w:ilvl w:val="2"/>
+          <w:numId w:val="11"/>
+        </w:numPr>
+        <w:rPr>
+          <w:lang w:val="en-ID"/>
+        </w:rPr>
+      </w:pPr>
       <w:proofErr w:type="spellStart"/>
       <w:r>
         <w:rPr>
@@ -5740,6 +5922,66 @@
     </w:p>
     <w:p>
       <w:pPr>
+        <w:pStyle w:val="ListParagraph"/>
+        <w:numPr>
+          <w:ilvl w:val="2"/>
+          <w:numId w:val="11"/>
+        </w:numPr>
+        <w:rPr>
+          <w:lang w:val="en-ID"/>
+        </w:rPr>
+      </w:pPr>
+      <w:r>
+        <w:rPr>
+          <w:lang w:val="en-ID"/>
+        </w:rPr>
+        <w:t xml:space="preserve">Pada </w:t>
+      </w:r>
+      <w:proofErr w:type="spellStart"/>
+      <w:proofErr w:type="gramStart"/>
+      <w:r>
+        <w:rPr>
+          <w:lang w:val="en-ID"/>
+        </w:rPr>
+        <w:t>env.local</w:t>
+      </w:r>
+      <w:proofErr w:type="spellEnd"/>
+      <w:proofErr w:type="gramEnd"/>
+      <w:r>
+        <w:rPr>
+          <w:lang w:val="en-ID"/>
+        </w:rPr>
+        <w:t xml:space="preserve"> </w:t>
+      </w:r>
+      <w:r>
+        <w:rPr>
+          <w:lang w:val="en-ID"/>
+        </w:rPr>
+        <w:t>NEXT_PUBLIC_GA_ID=</w:t>
+      </w:r>
+      <w:r>
+        <w:rPr>
+          <w:lang w:val="en-ID"/>
+        </w:rPr>
+        <w:t xml:space="preserve"> </w:t>
+      </w:r>
+      <w:proofErr w:type="spellStart"/>
+      <w:r>
+        <w:rPr>
+          <w:lang w:val="en-ID"/>
+        </w:rPr>
+        <w:t>dihapus</w:t>
+      </w:r>
+      <w:proofErr w:type="spellEnd"/>
+      <w:r>
+        <w:rPr>
+          <w:lang w:val="en-ID"/>
+        </w:rPr>
+        <w:t xml:space="preserve"> </w:t>
+      </w:r>
+    </w:p>
+    <w:p>
+      <w:pPr>
         <w:pStyle w:val="Heading4"/>
         <w:rPr>
           <w:lang w:val="en-ID"/>
@@ -5750,6 +5992,7 @@
         <w:rPr>
           <w:lang w:val="en-ID"/>
         </w:rPr>
+        <w:lastRenderedPageBreak/>
         <w:t>Sebelum</w:t>
       </w:r>
       <w:proofErr w:type="spellEnd"/>
@@ -5760,25 +6003,678 @@
           <w:lang w:val="en-ID"/>
         </w:rPr>
       </w:pPr>
+      <w:r>
+        <w:rPr>
+          <w:lang w:val="en-ID"/>
+        </w:rPr>
+        <w:drawing>
+          <wp:inline distT="0" distB="0" distL="0" distR="0" wp14:anchorId="208B63E6" wp14:editId="6D6FF01B">
+            <wp:extent cx="5580000" cy="7899161"/>
+            <wp:effectExtent l="0" t="0" r="1905" b="6985"/>
+            <wp:docPr id="2088537774" name="Picture 1"/>
+            <wp:cNvGraphicFramePr>
+              <a:graphicFrameLocks xmlns:a="http://schemas.openxmlformats.org/drawingml/2006/main" noChangeAspect="1"/>
+            </wp:cNvGraphicFramePr>
+            <a:graphic xmlns:a="http://schemas.openxmlformats.org/drawingml/2006/main">
+              <a:graphicData uri="http://schemas.openxmlformats.org/drawingml/2006/picture">
+                <pic:pic xmlns:pic="http://schemas.openxmlformats.org/drawingml/2006/picture">
+                  <pic:nvPicPr>
+                    <pic:cNvPr id="2088537774" name=""/>
+                    <pic:cNvPicPr/>
+                  </pic:nvPicPr>
+                  <pic:blipFill>
+                    <a:blip r:embed="rId31"/>
+                    <a:stretch>
+                      <a:fillRect/>
+                    </a:stretch>
+                  </pic:blipFill>
+                  <pic:spPr>
+                    <a:xfrm>
+                      <a:off x="0" y="0"/>
+                      <a:ext cx="5580000" cy="7899161"/>
+                    </a:xfrm>
+                    <a:prstGeom prst="rect">
+                      <a:avLst/>
+                    </a:prstGeom>
+                  </pic:spPr>
+                </pic:pic>
+              </a:graphicData>
+            </a:graphic>
+          </wp:inline>
+        </w:drawing>
+      </w:r>
+    </w:p>
+    <w:p>
+      <w:pPr>
+        <w:pStyle w:val="Heading4"/>
+        <w:rPr>
+          <w:lang w:val="en-ID"/>
+        </w:rPr>
+      </w:pPr>
+      <w:proofErr w:type="spellStart"/>
+      <w:r>
+        <w:rPr>
+          <w:lang w:val="en-ID"/>
+        </w:rPr>
+        <w:lastRenderedPageBreak/>
+        <w:t>Sesudah</w:t>
+      </w:r>
+      <w:proofErr w:type="spellEnd"/>
+    </w:p>
+    <w:p>
+      <w:pPr>
+        <w:rPr>
+          <w:lang w:val="en-ID"/>
+        </w:rPr>
+      </w:pPr>
+      <w:r>
+        <w:rPr>
+          <w:lang w:val="en-ID"/>
+        </w:rPr>
+        <w:drawing>
+          <wp:inline distT="0" distB="0" distL="0" distR="0" wp14:anchorId="30F41F75" wp14:editId="4410591B">
+            <wp:extent cx="5580000" cy="7899161"/>
+            <wp:effectExtent l="0" t="0" r="1905" b="6985"/>
+            <wp:docPr id="1851367063" name="Picture 1"/>
+            <wp:cNvGraphicFramePr>
+              <a:graphicFrameLocks xmlns:a="http://schemas.openxmlformats.org/drawingml/2006/main" noChangeAspect="1"/>
+            </wp:cNvGraphicFramePr>
+            <a:graphic xmlns:a="http://schemas.openxmlformats.org/drawingml/2006/main">
+              <a:graphicData uri="http://schemas.openxmlformats.org/drawingml/2006/picture">
+                <pic:pic xmlns:pic="http://schemas.openxmlformats.org/drawingml/2006/picture">
+                  <pic:nvPicPr>
+                    <pic:cNvPr id="1851367063" name=""/>
+                    <pic:cNvPicPr/>
+                  </pic:nvPicPr>
+                  <pic:blipFill>
+                    <a:blip r:embed="rId32"/>
+                    <a:stretch>
+                      <a:fillRect/>
+                    </a:stretch>
+                  </pic:blipFill>
+                  <pic:spPr>
+                    <a:xfrm>
+                      <a:off x="0" y="0"/>
+                      <a:ext cx="5580000" cy="7899161"/>
+                    </a:xfrm>
+                    <a:prstGeom prst="rect">
+                      <a:avLst/>
+                    </a:prstGeom>
+                  </pic:spPr>
+                </pic:pic>
+              </a:graphicData>
+            </a:graphic>
+          </wp:inline>
+        </w:drawing>
+      </w:r>
+    </w:p>
+    <w:p>
+      <w:pPr>
+        <w:pStyle w:val="Heading4"/>
+        <w:rPr>
+          <w:lang w:val="en-ID"/>
+        </w:rPr>
+      </w:pPr>
+      <w:r>
+        <w:rPr>
+          <w:lang w:val="en-ID"/>
+        </w:rPr>
+        <w:lastRenderedPageBreak/>
+        <w:t>Kesimpulan</w:t>
+      </w:r>
+    </w:p>
+    <w:p>
+      <w:pPr>
+        <w:rPr>
+          <w:lang w:val="en-ID"/>
+        </w:rPr>
+      </w:pPr>
+      <w:proofErr w:type="spellStart"/>
+      <w:r>
+        <w:rPr>
+          <w:lang w:val="en-ID"/>
+        </w:rPr>
+        <w:t>Optimasi</w:t>
+      </w:r>
+      <w:proofErr w:type="spellEnd"/>
+      <w:r>
+        <w:rPr>
+          <w:lang w:val="en-ID"/>
+        </w:rPr>
+        <w:t xml:space="preserve"> yang </w:t>
+      </w:r>
+      <w:proofErr w:type="spellStart"/>
+      <w:r>
+        <w:rPr>
+          <w:lang w:val="en-ID"/>
+        </w:rPr>
+        <w:t>dilakukan</w:t>
+      </w:r>
+      <w:proofErr w:type="spellEnd"/>
+      <w:r>
+        <w:rPr>
+          <w:lang w:val="en-ID"/>
+        </w:rPr>
+        <w:t xml:space="preserve"> </w:t>
+      </w:r>
+      <w:proofErr w:type="spellStart"/>
+      <w:r>
+        <w:rPr>
+          <w:lang w:val="en-ID"/>
+        </w:rPr>
+        <w:t>berhasil</w:t>
+      </w:r>
+      <w:proofErr w:type="spellEnd"/>
+      <w:r>
+        <w:rPr>
+          <w:lang w:val="en-ID"/>
+        </w:rPr>
+        <w:t xml:space="preserve"> </w:t>
+      </w:r>
+      <w:proofErr w:type="spellStart"/>
+      <w:r>
+        <w:rPr>
+          <w:lang w:val="en-ID"/>
+        </w:rPr>
+        <w:t>meningkatkan</w:t>
+      </w:r>
+      <w:proofErr w:type="spellEnd"/>
+      <w:r>
+        <w:rPr>
+          <w:lang w:val="en-ID"/>
+        </w:rPr>
+        <w:t xml:space="preserve"> </w:t>
+      </w:r>
+      <w:proofErr w:type="spellStart"/>
+      <w:r>
+        <w:rPr>
+          <w:lang w:val="en-ID"/>
+        </w:rPr>
+        <w:t>performa</w:t>
+      </w:r>
+      <w:proofErr w:type="spellEnd"/>
+      <w:r>
+        <w:rPr>
+          <w:lang w:val="en-ID"/>
+        </w:rPr>
+        <w:t xml:space="preserve"> </w:t>
+      </w:r>
+      <w:proofErr w:type="spellStart"/>
+      <w:r>
+        <w:rPr>
+          <w:lang w:val="en-ID"/>
+        </w:rPr>
+        <w:t>halaman</w:t>
+      </w:r>
+      <w:proofErr w:type="spellEnd"/>
+      <w:r>
+        <w:rPr>
+          <w:lang w:val="en-ID"/>
+        </w:rPr>
+        <w:t xml:space="preserve"> /</w:t>
+      </w:r>
+      <w:proofErr w:type="spellStart"/>
+      <w:r>
+        <w:rPr>
+          <w:lang w:val="en-ID"/>
+        </w:rPr>
+        <w:t>produk</w:t>
+      </w:r>
+      <w:proofErr w:type="spellEnd"/>
+      <w:r>
+        <w:rPr>
+          <w:lang w:val="en-ID"/>
+        </w:rPr>
+        <w:t xml:space="preserve">, </w:t>
+      </w:r>
+      <w:proofErr w:type="spellStart"/>
+      <w:r>
+        <w:rPr>
+          <w:lang w:val="en-ID"/>
+        </w:rPr>
+        <w:t>meskipun</w:t>
+      </w:r>
+      <w:proofErr w:type="spellEnd"/>
+      <w:r>
+        <w:rPr>
+          <w:lang w:val="en-ID"/>
+        </w:rPr>
+        <w:t xml:space="preserve"> </w:t>
+      </w:r>
+      <w:proofErr w:type="spellStart"/>
+      <w:r>
+        <w:rPr>
+          <w:lang w:val="en-ID"/>
+        </w:rPr>
+        <w:t>peningkatannya</w:t>
+      </w:r>
+      <w:proofErr w:type="spellEnd"/>
+      <w:r>
+        <w:rPr>
+          <w:lang w:val="en-ID"/>
+        </w:rPr>
+        <w:t xml:space="preserve"> </w:t>
+      </w:r>
+      <w:proofErr w:type="spellStart"/>
+      <w:r>
+        <w:rPr>
+          <w:lang w:val="en-ID"/>
+        </w:rPr>
+        <w:t>tidak</w:t>
+      </w:r>
+      <w:proofErr w:type="spellEnd"/>
+      <w:r>
+        <w:rPr>
+          <w:lang w:val="en-ID"/>
+        </w:rPr>
+        <w:t xml:space="preserve"> </w:t>
+      </w:r>
+      <w:proofErr w:type="spellStart"/>
+      <w:r>
+        <w:rPr>
+          <w:lang w:val="en-ID"/>
+        </w:rPr>
+        <w:t>terlalu</w:t>
+      </w:r>
+      <w:proofErr w:type="spellEnd"/>
+      <w:r>
+        <w:rPr>
+          <w:lang w:val="en-ID"/>
+        </w:rPr>
+        <w:t xml:space="preserve"> </w:t>
+      </w:r>
+      <w:proofErr w:type="spellStart"/>
+      <w:r>
+        <w:rPr>
+          <w:lang w:val="en-ID"/>
+        </w:rPr>
+        <w:t>besar</w:t>
+      </w:r>
+      <w:proofErr w:type="spellEnd"/>
+      <w:r>
+        <w:rPr>
+          <w:lang w:val="en-ID"/>
+        </w:rPr>
+        <w:t xml:space="preserve">. Skor Lighthouse naik </w:t>
+      </w:r>
+      <w:proofErr w:type="spellStart"/>
+      <w:r>
+        <w:rPr>
+          <w:lang w:val="en-ID"/>
+        </w:rPr>
+        <w:t>dari</w:t>
+      </w:r>
+      <w:proofErr w:type="spellEnd"/>
+      <w:r>
+        <w:rPr>
+          <w:lang w:val="en-ID"/>
+        </w:rPr>
+        <w:t xml:space="preserve"> 95 </w:t>
+      </w:r>
+      <w:proofErr w:type="spellStart"/>
+      <w:r>
+        <w:rPr>
+          <w:lang w:val="en-ID"/>
+        </w:rPr>
+        <w:t>menjadi</w:t>
+      </w:r>
+      <w:proofErr w:type="spellEnd"/>
+      <w:r>
+        <w:rPr>
+          <w:lang w:val="en-ID"/>
+        </w:rPr>
+        <w:t xml:space="preserve"> 96.</w:t>
+      </w:r>
+    </w:p>
+    <w:p>
+      <w:pPr>
+        <w:rPr>
+          <w:lang w:val="en-ID"/>
+        </w:rPr>
+      </w:pPr>
+      <w:proofErr w:type="spellStart"/>
+      <w:r>
+        <w:rPr>
+          <w:lang w:val="en-ID"/>
+        </w:rPr>
+        <w:t>Beberapa</w:t>
+      </w:r>
+      <w:proofErr w:type="spellEnd"/>
+      <w:r>
+        <w:rPr>
+          <w:lang w:val="en-ID"/>
+        </w:rPr>
+        <w:t xml:space="preserve"> </w:t>
+      </w:r>
+      <w:proofErr w:type="spellStart"/>
+      <w:r>
+        <w:rPr>
+          <w:lang w:val="en-ID"/>
+        </w:rPr>
+        <w:t>metrik</w:t>
+      </w:r>
+      <w:proofErr w:type="spellEnd"/>
+      <w:r>
+        <w:rPr>
+          <w:lang w:val="en-ID"/>
+        </w:rPr>
+        <w:t xml:space="preserve"> </w:t>
+      </w:r>
+      <w:proofErr w:type="spellStart"/>
+      <w:r>
+        <w:rPr>
+          <w:lang w:val="en-ID"/>
+        </w:rPr>
+        <w:t>menunjukkan</w:t>
+      </w:r>
+      <w:proofErr w:type="spellEnd"/>
+      <w:r>
+        <w:rPr>
+          <w:lang w:val="en-ID"/>
+        </w:rPr>
+        <w:t xml:space="preserve"> </w:t>
+      </w:r>
+      <w:proofErr w:type="spellStart"/>
+      <w:r>
+        <w:rPr>
+          <w:lang w:val="en-ID"/>
+        </w:rPr>
+        <w:t>perbaikan</w:t>
+      </w:r>
+      <w:proofErr w:type="spellEnd"/>
+      <w:r>
+        <w:rPr>
+          <w:lang w:val="en-ID"/>
+        </w:rPr>
+        <w:t>:</w:t>
+      </w:r>
+    </w:p>
+    <w:p>
+      <w:pPr>
+        <w:numPr>
+          <w:ilvl w:val="0"/>
+          <w:numId w:val="14"/>
+        </w:numPr>
+        <w:rPr>
+          <w:lang w:val="en-ID"/>
+        </w:rPr>
+      </w:pPr>
+      <w:r>
+        <w:rPr>
+          <w:lang w:val="en-ID"/>
+        </w:rPr>
+        <w:t xml:space="preserve">LCP </w:t>
+      </w:r>
+      <w:proofErr w:type="spellStart"/>
+      <w:r>
+        <w:rPr>
+          <w:lang w:val="en-ID"/>
+        </w:rPr>
+        <w:t>turun</w:t>
+      </w:r>
+      <w:proofErr w:type="spellEnd"/>
+      <w:r>
+        <w:rPr>
+          <w:lang w:val="en-ID"/>
+        </w:rPr>
+        <w:t xml:space="preserve"> </w:t>
+      </w:r>
+      <w:proofErr w:type="spellStart"/>
+      <w:r>
+        <w:rPr>
+          <w:lang w:val="en-ID"/>
+        </w:rPr>
+        <w:t>dari</w:t>
+      </w:r>
+      <w:proofErr w:type="spellEnd"/>
+      <w:r>
+        <w:rPr>
+          <w:lang w:val="en-ID"/>
+        </w:rPr>
+        <w:t xml:space="preserve"> 1.4s </w:t>
+      </w:r>
+      <w:proofErr w:type="spellStart"/>
+      <w:r>
+        <w:rPr>
+          <w:lang w:val="en-ID"/>
+        </w:rPr>
+        <w:t>menjadi</w:t>
+      </w:r>
+      <w:proofErr w:type="spellEnd"/>
+      <w:r>
+        <w:rPr>
+          <w:lang w:val="en-ID"/>
+        </w:rPr>
+        <w:t xml:space="preserve"> 1.3s </w:t>
+      </w:r>
+    </w:p>
+    <w:p>
+      <w:pPr>
+        <w:numPr>
+          <w:ilvl w:val="0"/>
+          <w:numId w:val="14"/>
+        </w:numPr>
+        <w:rPr>
+          <w:lang w:val="en-ID"/>
+        </w:rPr>
+      </w:pPr>
+      <w:r>
+        <w:rPr>
+          <w:lang w:val="en-ID"/>
+        </w:rPr>
+        <w:t xml:space="preserve">TTI </w:t>
+      </w:r>
+      <w:proofErr w:type="spellStart"/>
+      <w:r>
+        <w:rPr>
+          <w:lang w:val="en-ID"/>
+        </w:rPr>
+        <w:t>turun</w:t>
+      </w:r>
+      <w:proofErr w:type="spellEnd"/>
+      <w:r>
+        <w:rPr>
+          <w:lang w:val="en-ID"/>
+        </w:rPr>
+        <w:t xml:space="preserve"> </w:t>
+      </w:r>
+      <w:proofErr w:type="spellStart"/>
+      <w:r>
+        <w:rPr>
+          <w:lang w:val="en-ID"/>
+        </w:rPr>
+        <w:t>dari</w:t>
+      </w:r>
+      <w:proofErr w:type="spellEnd"/>
+      <w:r>
+        <w:rPr>
+          <w:lang w:val="en-ID"/>
+        </w:rPr>
+        <w:t xml:space="preserve"> 1.4s </w:t>
+      </w:r>
+      <w:proofErr w:type="spellStart"/>
+      <w:r>
+        <w:rPr>
+          <w:lang w:val="en-ID"/>
+        </w:rPr>
+        <w:t>menjadi</w:t>
+      </w:r>
+      <w:proofErr w:type="spellEnd"/>
+      <w:r>
+        <w:rPr>
+          <w:lang w:val="en-ID"/>
+        </w:rPr>
+        <w:t xml:space="preserve"> 1.3s </w:t>
+      </w:r>
+    </w:p>
+    <w:p>
+      <w:pPr>
+        <w:numPr>
+          <w:ilvl w:val="0"/>
+          <w:numId w:val="14"/>
+        </w:numPr>
+        <w:rPr>
+          <w:lang w:val="en-ID"/>
+        </w:rPr>
+      </w:pPr>
+      <w:r>
+        <w:rPr>
+          <w:lang w:val="en-ID"/>
+        </w:rPr>
+        <w:t xml:space="preserve">CLS </w:t>
+      </w:r>
+      <w:proofErr w:type="spellStart"/>
+      <w:r>
+        <w:rPr>
+          <w:lang w:val="en-ID"/>
+        </w:rPr>
+        <w:t>sedikit</w:t>
+      </w:r>
+      <w:proofErr w:type="spellEnd"/>
+      <w:r>
+        <w:rPr>
+          <w:lang w:val="en-ID"/>
+        </w:rPr>
+        <w:t xml:space="preserve"> </w:t>
+      </w:r>
+      <w:proofErr w:type="spellStart"/>
+      <w:r>
+        <w:rPr>
+          <w:lang w:val="en-ID"/>
+        </w:rPr>
+        <w:t>lebih</w:t>
+      </w:r>
+      <w:proofErr w:type="spellEnd"/>
+      <w:r>
+        <w:rPr>
+          <w:lang w:val="en-ID"/>
+        </w:rPr>
+        <w:t xml:space="preserve"> </w:t>
+      </w:r>
+      <w:proofErr w:type="spellStart"/>
+      <w:r>
+        <w:rPr>
+          <w:lang w:val="en-ID"/>
+        </w:rPr>
+        <w:t>stabil</w:t>
+      </w:r>
+      <w:proofErr w:type="spellEnd"/>
+      <w:r>
+        <w:rPr>
+          <w:lang w:val="en-ID"/>
+        </w:rPr>
+        <w:t xml:space="preserve">, </w:t>
+      </w:r>
+      <w:proofErr w:type="spellStart"/>
+      <w:r>
+        <w:rPr>
+          <w:lang w:val="en-ID"/>
+        </w:rPr>
+        <w:t>dari</w:t>
+      </w:r>
+      <w:proofErr w:type="spellEnd"/>
+      <w:r>
+        <w:rPr>
+          <w:lang w:val="en-ID"/>
+        </w:rPr>
+        <w:t xml:space="preserve"> 0.049 </w:t>
+      </w:r>
+      <w:proofErr w:type="spellStart"/>
+      <w:r>
+        <w:rPr>
+          <w:lang w:val="en-ID"/>
+        </w:rPr>
+        <w:t>menjadi</w:t>
+      </w:r>
+      <w:proofErr w:type="spellEnd"/>
+      <w:r>
+        <w:rPr>
+          <w:lang w:val="en-ID"/>
+        </w:rPr>
+        <w:t xml:space="preserve"> 0.048 </w:t>
+      </w:r>
+    </w:p>
+    <w:p>
+      <w:pPr>
+        <w:numPr>
+          <w:ilvl w:val="0"/>
+          <w:numId w:val="14"/>
+        </w:numPr>
+        <w:rPr>
+          <w:lang w:val="en-ID"/>
+        </w:rPr>
+      </w:pPr>
+      <w:r>
+        <w:rPr>
+          <w:lang w:val="en-ID"/>
+        </w:rPr>
+        <w:t xml:space="preserve">TBT </w:t>
+      </w:r>
+      <w:proofErr w:type="spellStart"/>
+      <w:r>
+        <w:rPr>
+          <w:lang w:val="en-ID"/>
+        </w:rPr>
+        <w:t>tetap</w:t>
+      </w:r>
+      <w:proofErr w:type="spellEnd"/>
+      <w:r>
+        <w:rPr>
+          <w:lang w:val="en-ID"/>
+        </w:rPr>
+        <w:t xml:space="preserve"> sangat </w:t>
+      </w:r>
+      <w:proofErr w:type="spellStart"/>
+      <w:r>
+        <w:rPr>
+          <w:lang w:val="en-ID"/>
+        </w:rPr>
+        <w:t>baik</w:t>
+      </w:r>
+      <w:proofErr w:type="spellEnd"/>
+      <w:r>
+        <w:rPr>
+          <w:lang w:val="en-ID"/>
+        </w:rPr>
+        <w:t xml:space="preserve"> di </w:t>
+      </w:r>
+      <w:proofErr w:type="spellStart"/>
+      <w:r>
+        <w:rPr>
+          <w:lang w:val="en-ID"/>
+        </w:rPr>
+        <w:t>angka</w:t>
+      </w:r>
+      <w:proofErr w:type="spellEnd"/>
+      <w:r>
+        <w:rPr>
+          <w:lang w:val="en-ID"/>
+        </w:rPr>
+        <w:t xml:space="preserve"> 0 </w:t>
+      </w:r>
+      <w:proofErr w:type="spellStart"/>
+      <w:r>
+        <w:rPr>
+          <w:lang w:val="en-ID"/>
+        </w:rPr>
+        <w:t>ms</w:t>
+      </w:r>
+      <w:proofErr w:type="spellEnd"/>
+    </w:p>
+    <w:p>
+      <w:pPr>
+        <w:rPr>
+          <w:lang w:val="en-ID"/>
+        </w:rPr>
+      </w:pPr>
     </w:p>
     <w:p>
       <w:pPr>
         <w:pStyle w:val="Heading2"/>
       </w:pPr>
-      <w:proofErr w:type="spellStart"/>
-      <w:r>
-        <w:lastRenderedPageBreak/>
-        <w:t>Refleksi</w:t>
-      </w:r>
-      <w:proofErr w:type="spellEnd"/>
-      <w:r>
-        <w:t xml:space="preserve"> &amp; </w:t>
-      </w:r>
-      <w:proofErr w:type="spellStart"/>
-      <w:r>
-        <w:t>Diskusi</w:t>
-      </w:r>
-      <w:proofErr w:type="spellEnd"/>
+      <w:r>
+        <w:t>Refleksi &amp; Diskusi</w:t>
+      </w:r>
     </w:p>
     <w:p>
       <w:pPr>
@@ -6900,7 +7796,7 @@
   <w:abstractNum w:abstractNumId="4" w15:restartNumberingAfterBreak="0">
     <w:nsid w:val="36AF0EBE"/>
     <w:multiLevelType w:val="hybridMultilevel"/>
-    <w:tmpl w:val="94EEFD28"/>
+    <w:tmpl w:val="CCF8BD9C"/>
     <w:lvl w:ilvl="0" w:tplc="38090019">
       <w:start w:val="1"/>
       <w:numFmt w:val="lowerLetter"/>
@@ -6919,14 +7815,17 @@
         <w:ind w:left="786" w:hanging="360"/>
       </w:pPr>
     </w:lvl>
-    <w:lvl w:ilvl="2" w:tplc="3809001B" w:tentative="1">
-      <w:start w:val="1"/>
-      <w:numFmt w:val="lowerRoman"/>
-      <w:lvlText w:val="%3."/>
-      <w:lvlJc w:val="right"/>
-      <w:pPr>
-        <w:ind w:left="2160" w:hanging="180"/>
-      </w:pPr>
+    <w:lvl w:ilvl="2" w:tplc="9D7400E2">
+      <w:start w:val="5"/>
+      <w:numFmt w:val="bullet"/>
+      <w:lvlText w:val="-"/>
+      <w:lvlJc w:val="left"/>
+      <w:pPr>
+        <w:ind w:left="644" w:hanging="360"/>
+      </w:pPr>
+      <w:rPr>
+        <w:rFonts w:ascii="Aptos" w:eastAsiaTheme="minorEastAsia" w:hAnsi="Aptos" w:cstheme="minorBidi" w:hint="default"/>
+      </w:rPr>
     </w:lvl>
     <w:lvl w:ilvl="3" w:tplc="3809000F" w:tentative="1">
       <w:start w:val="1"/>
@@ -7563,6 +8462,155 @@
     </w:lvl>
   </w:abstractNum>
   <w:abstractNum w:abstractNumId="11" w15:restartNumberingAfterBreak="0">
+    <w:nsid w:val="65827D09"/>
+    <w:multiLevelType w:val="multilevel"/>
+    <w:tmpl w:val="100E5280"/>
+    <w:lvl w:ilvl="0">
+      <w:start w:val="1"/>
+      <w:numFmt w:val="bullet"/>
+      <w:lvlText w:val=""/>
+      <w:lvlJc w:val="left"/>
+      <w:pPr>
+        <w:tabs>
+          <w:tab w:val="num" w:pos="720"/>
+        </w:tabs>
+        <w:ind w:left="720" w:hanging="360"/>
+      </w:pPr>
+      <w:rPr>
+        <w:rFonts w:ascii="Symbol" w:hAnsi="Symbol" w:hint="default"/>
+        <w:sz w:val="20"/>
+      </w:rPr>
+    </w:lvl>
+    <w:lvl w:ilvl="1" w:tentative="1">
+      <w:start w:val="1"/>
+      <w:numFmt w:val="bullet"/>
+      <w:lvlText w:val="o"/>
+      <w:lvlJc w:val="left"/>
+      <w:pPr>
+        <w:tabs>
+          <w:tab w:val="num" w:pos="1440"/>
+        </w:tabs>
+        <w:ind w:left="1440" w:hanging="360"/>
+      </w:pPr>
+      <w:rPr>
+        <w:rFonts w:ascii="Courier New" w:hAnsi="Courier New" w:hint="default"/>
+        <w:sz w:val="20"/>
+      </w:rPr>
+    </w:lvl>
+    <w:lvl w:ilvl="2" w:tentative="1">
+      <w:start w:val="1"/>
+      <w:numFmt w:val="bullet"/>
+      <w:lvlText w:val=""/>
+      <w:lvlJc w:val="left"/>
+      <w:pPr>
+        <w:tabs>
+          <w:tab w:val="num" w:pos="2160"/>
+        </w:tabs>
+        <w:ind w:left="2160" w:hanging="360"/>
+      </w:pPr>
+      <w:rPr>
+        <w:rFonts w:ascii="Wingdings" w:hAnsi="Wingdings" w:hint="default"/>
+        <w:sz w:val="20"/>
+      </w:rPr>
+    </w:lvl>
+    <w:lvl w:ilvl="3" w:tentative="1">
+      <w:start w:val="1"/>
+      <w:numFmt w:val="bullet"/>
+      <w:lvlText w:val=""/>
+      <w:lvlJc w:val="left"/>
+      <w:pPr>
+        <w:tabs>
+          <w:tab w:val="num" w:pos="2880"/>
+        </w:tabs>
+        <w:ind w:left="2880" w:hanging="360"/>
+      </w:pPr>
+      <w:rPr>
+        <w:rFonts w:ascii="Wingdings" w:hAnsi="Wingdings" w:hint="default"/>
+        <w:sz w:val="20"/>
+      </w:rPr>
+    </w:lvl>
+    <w:lvl w:ilvl="4" w:tentative="1">
+      <w:start w:val="1"/>
+      <w:numFmt w:val="bullet"/>
+      <w:lvlText w:val=""/>
+      <w:lvlJc w:val="left"/>
+      <w:pPr>
+        <w:tabs>
+          <w:tab w:val="num" w:pos="3600"/>
+        </w:tabs>
+        <w:ind w:left="3600" w:hanging="360"/>
+      </w:pPr>
+      <w:rPr>
+        <w:rFonts w:ascii="Wingdings" w:hAnsi="Wingdings" w:hint="default"/>
+        <w:sz w:val="20"/>
+      </w:rPr>
+    </w:lvl>
+    <w:lvl w:ilvl="5" w:tentative="1">
+      <w:start w:val="1"/>
+      <w:numFmt w:val="bullet"/>
+      <w:lvlText w:val=""/>
+      <w:lvlJc w:val="left"/>
+      <w:pPr>
+        <w:tabs>
+          <w:tab w:val="num" w:pos="4320"/>
+        </w:tabs>
+        <w:ind w:left="4320" w:hanging="360"/>
+      </w:pPr>
+      <w:rPr>
+        <w:rFonts w:ascii="Wingdings" w:hAnsi="Wingdings" w:hint="default"/>
+        <w:sz w:val="20"/>
+      </w:rPr>
+    </w:lvl>
+    <w:lvl w:ilvl="6" w:tentative="1">
+      <w:start w:val="1"/>
+      <w:numFmt w:val="bullet"/>
+      <w:lvlText w:val=""/>
+      <w:lvlJc w:val="left"/>
+      <w:pPr>
+        <w:tabs>
+          <w:tab w:val="num" w:pos="5040"/>
+        </w:tabs>
+        <w:ind w:left="5040" w:hanging="360"/>
+      </w:pPr>
+      <w:rPr>
+        <w:rFonts w:ascii="Wingdings" w:hAnsi="Wingdings" w:hint="default"/>
+        <w:sz w:val="20"/>
+      </w:rPr>
+    </w:lvl>
+    <w:lvl w:ilvl="7" w:tentative="1">
+      <w:start w:val="1"/>
+      <w:numFmt w:val="bullet"/>
+      <w:lvlText w:val=""/>
+      <w:lvlJc w:val="left"/>
+      <w:pPr>
+        <w:tabs>
+          <w:tab w:val="num" w:pos="5760"/>
+        </w:tabs>
+        <w:ind w:left="5760" w:hanging="360"/>
+      </w:pPr>
+      <w:rPr>
+        <w:rFonts w:ascii="Wingdings" w:hAnsi="Wingdings" w:hint="default"/>
+        <w:sz w:val="20"/>
+      </w:rPr>
+    </w:lvl>
+    <w:lvl w:ilvl="8" w:tentative="1">
+      <w:start w:val="1"/>
+      <w:numFmt w:val="bullet"/>
+      <w:lvlText w:val=""/>
+      <w:lvlJc w:val="left"/>
+      <w:pPr>
+        <w:tabs>
+          <w:tab w:val="num" w:pos="6480"/>
+        </w:tabs>
+        <w:ind w:left="6480" w:hanging="360"/>
+      </w:pPr>
+      <w:rPr>
+        <w:rFonts w:ascii="Wingdings" w:hAnsi="Wingdings" w:hint="default"/>
+        <w:sz w:val="20"/>
+      </w:rPr>
+    </w:lvl>
+  </w:abstractNum>
+  <w:abstractNum w:abstractNumId="12" w15:restartNumberingAfterBreak="0">
     <w:nsid w:val="67B843D5"/>
     <w:multiLevelType w:val="hybridMultilevel"/>
     <w:tmpl w:val="2934F868"/>
@@ -7648,7 +8696,7 @@
       </w:pPr>
     </w:lvl>
   </w:abstractNum>
-  <w:abstractNum w:abstractNumId="12" w15:restartNumberingAfterBreak="0">
+  <w:abstractNum w:abstractNumId="13" w15:restartNumberingAfterBreak="0">
     <w:nsid w:val="6A1E3CA5"/>
     <w:multiLevelType w:val="hybridMultilevel"/>
     <w:tmpl w:val="ED3E1E70"/>
@@ -7756,10 +8804,10 @@
     <w:abstractNumId w:val="7"/>
   </w:num>
   <w:num w:numId="7" w16cid:durableId="753816043">
-    <w:abstractNumId w:val="11"/>
+    <w:abstractNumId w:val="12"/>
   </w:num>
   <w:num w:numId="8" w16cid:durableId="1210456468">
-    <w:abstractNumId w:val="12"/>
+    <w:abstractNumId w:val="13"/>
   </w:num>
   <w:num w:numId="9" w16cid:durableId="1384138858">
     <w:abstractNumId w:val="9"/>
@@ -7775,6 +8823,9 @@
   </w:num>
   <w:num w:numId="13" w16cid:durableId="1768501321">
     <w:abstractNumId w:val="10"/>
+  </w:num>
+  <w:num w:numId="14" w16cid:durableId="649670395">
+    <w:abstractNumId w:val="11"/>
   </w:num>
 </w:numbering>
 </file>

</xml_diff>

<commit_message>
PRAKTIKUM 2 – Struktur Folder Testing
</commit_message>
<xml_diff>
--- a/Laporan/03_Ahmad Dzul Fadhli Jobsheet 18&19.docx
+++ b/Laporan/03_Ahmad Dzul Fadhli Jobsheet 18&19.docx
@@ -585,12 +585,21 @@
           <w:bCs/>
         </w:rPr>
       </w:pPr>
+      <w:proofErr w:type="gramStart"/>
       <w:r>
         <w:rPr>
           <w:b/>
           <w:bCs/>
         </w:rPr>
-        <w:t xml:space="preserve">Note : </w:t>
+        <w:t>Note :</w:t>
+      </w:r>
+      <w:proofErr w:type="gramEnd"/>
+      <w:r>
+        <w:rPr>
+          <w:b/>
+          <w:bCs/>
+        </w:rPr>
+        <w:t xml:space="preserve"> </w:t>
       </w:r>
       <w:proofErr w:type="spellStart"/>
       <w:r>
@@ -2555,6 +2564,7 @@
         <w:t xml:space="preserve"> JavaScript </w:t>
       </w:r>
       <w:proofErr w:type="spellStart"/>
+      <w:proofErr w:type="gramStart"/>
       <w:r>
         <w:rPr>
           <w:lang w:val="en-ID"/>
@@ -2562,11 +2572,19 @@
         <w:t>document.getElementById</w:t>
       </w:r>
       <w:proofErr w:type="spellEnd"/>
-      <w:r>
-        <w:rPr>
-          <w:lang w:val="en-ID"/>
-        </w:rPr>
-        <w:t>('title').</w:t>
+      <w:proofErr w:type="gramEnd"/>
+      <w:r>
+        <w:rPr>
+          <w:lang w:val="en-ID"/>
+        </w:rPr>
+        <w:t>('title'</w:t>
+      </w:r>
+      <w:proofErr w:type="gramStart"/>
+      <w:r>
+        <w:rPr>
+          <w:lang w:val="en-ID"/>
+        </w:rPr>
+        <w:t>).</w:t>
       </w:r>
       <w:proofErr w:type="spellStart"/>
       <w:r>
@@ -2576,6 +2594,7 @@
         <w:t>innerHTML</w:t>
       </w:r>
       <w:proofErr w:type="spellEnd"/>
+      <w:proofErr w:type="gramEnd"/>
       <w:r>
         <w:rPr>
           <w:lang w:val="en-ID"/>
@@ -3586,6 +3605,7 @@
         <w:t xml:space="preserve"> </w:t>
       </w:r>
       <w:proofErr w:type="spellStart"/>
+      <w:proofErr w:type="gramStart"/>
       <w:r>
         <w:rPr>
           <w:lang w:val="en-ID"/>
@@ -3607,6 +3627,7 @@
         <w:t>innerHTML</w:t>
       </w:r>
       <w:proofErr w:type="spellEnd"/>
+      <w:proofErr w:type="gramEnd"/>
       <w:r>
         <w:rPr>
           <w:lang w:val="en-ID"/>
@@ -4267,6 +4288,7 @@
         <w:t xml:space="preserve"> pada folder layouts/navbar dan </w:t>
       </w:r>
       <w:proofErr w:type="spellStart"/>
+      <w:proofErr w:type="gramStart"/>
       <w:r>
         <w:t>modifikasi</w:t>
       </w:r>
@@ -4274,6 +4296,7 @@
       <w:r>
         <w:t xml:space="preserve"> :</w:t>
       </w:r>
+      <w:proofErr w:type="gramEnd"/>
     </w:p>
     <w:p>
       <w:r>
@@ -5929,6 +5952,7 @@
         <w:t xml:space="preserve">Pada </w:t>
       </w:r>
       <w:proofErr w:type="spellStart"/>
+      <w:proofErr w:type="gramStart"/>
       <w:r>
         <w:rPr>
           <w:lang w:val="en-ID"/>
@@ -5936,6 +5960,7 @@
         <w:t>env.local</w:t>
       </w:r>
       <w:proofErr w:type="spellEnd"/>
+      <w:proofErr w:type="gramEnd"/>
       <w:r>
         <w:rPr>
           <w:lang w:val="en-ID"/>
@@ -8210,6 +8235,544 @@
       </w:r>
       <w:r>
         <w:t>Ahmad Dzul Fadhli Hannan | TI3F | 2341720106</w:t>
+      </w:r>
+    </w:p>
+    <w:p>
+      <w:pPr>
+        <w:pStyle w:val="Heading2"/>
+      </w:pPr>
+      <w:r>
+        <w:t>PRAKTIKUM 1 – Setup Jest di Next.js</w:t>
+      </w:r>
+    </w:p>
+    <w:p>
+      <w:pPr>
+        <w:pStyle w:val="Heading3"/>
+      </w:pPr>
+      <w:r>
+        <w:t xml:space="preserve">Langkah 1- </w:t>
+      </w:r>
+      <w:r>
+        <w:t>Install Dependencies</w:t>
+      </w:r>
+    </w:p>
+    <w:p>
+      <w:pPr>
+        <w:rPr>
+          <w:lang w:val="en-ID"/>
+        </w:rPr>
+      </w:pPr>
+      <w:proofErr w:type="spellStart"/>
+      <w:r>
+        <w:rPr>
+          <w:lang w:val="en-ID"/>
+        </w:rPr>
+        <w:t>Jalankan</w:t>
+      </w:r>
+      <w:proofErr w:type="spellEnd"/>
+      <w:r>
+        <w:rPr>
+          <w:lang w:val="en-ID"/>
+        </w:rPr>
+        <w:t>:</w:t>
+      </w:r>
+    </w:p>
+    <w:p>
+      <w:pPr>
+        <w:rPr>
+          <w:lang w:val="en-ID"/>
+        </w:rPr>
+      </w:pPr>
+      <w:proofErr w:type="spellStart"/>
+      <w:r>
+        <w:rPr>
+          <w:lang w:val="en-ID"/>
+        </w:rPr>
+        <w:t>npm</w:t>
+      </w:r>
+      <w:proofErr w:type="spellEnd"/>
+      <w:r>
+        <w:rPr>
+          <w:lang w:val="en-ID"/>
+        </w:rPr>
+        <w:t xml:space="preserve"> install jest jest-environment-</w:t>
+      </w:r>
+      <w:proofErr w:type="spellStart"/>
+      <w:r>
+        <w:rPr>
+          <w:lang w:val="en-ID"/>
+        </w:rPr>
+        <w:t>jsdom</w:t>
+      </w:r>
+      <w:proofErr w:type="spellEnd"/>
+      <w:r>
+        <w:rPr>
+          <w:lang w:val="en-ID"/>
+        </w:rPr>
+        <w:t xml:space="preserve"> @testing-library/react @testing</w:t>
+      </w:r>
+      <w:r>
+        <w:rPr>
+          <w:lang w:val="en-ID"/>
+        </w:rPr>
+        <w:t>-</w:t>
+      </w:r>
+      <w:r>
+        <w:rPr>
+          <w:lang w:val="en-ID"/>
+        </w:rPr>
+        <w:t xml:space="preserve">library/jest-dom --save-dev </w:t>
+      </w:r>
+      <w:r>
+        <w:rPr>
+          <w:lang w:val="en-ID"/>
+        </w:rPr>
+        <w:t>--</w:t>
+      </w:r>
+      <w:r>
+        <w:rPr>
+          <w:lang w:val="en-ID"/>
+        </w:rPr>
+        <w:t>force</w:t>
+      </w:r>
+    </w:p>
+    <w:p>
+      <w:r>
+        <w:drawing>
+          <wp:inline distT="0" distB="0" distL="0" distR="0" wp14:anchorId="6212003F" wp14:editId="048F20FD">
+            <wp:extent cx="2880000" cy="929846"/>
+            <wp:effectExtent l="0" t="0" r="0" b="3810"/>
+            <wp:docPr id="1291496841" name="Picture 1"/>
+            <wp:cNvGraphicFramePr>
+              <a:graphicFrameLocks xmlns:a="http://schemas.openxmlformats.org/drawingml/2006/main" noChangeAspect="1"/>
+            </wp:cNvGraphicFramePr>
+            <a:graphic xmlns:a="http://schemas.openxmlformats.org/drawingml/2006/main">
+              <a:graphicData uri="http://schemas.openxmlformats.org/drawingml/2006/picture">
+                <pic:pic xmlns:pic="http://schemas.openxmlformats.org/drawingml/2006/picture">
+                  <pic:nvPicPr>
+                    <pic:cNvPr id="1291496841" name=""/>
+                    <pic:cNvPicPr/>
+                  </pic:nvPicPr>
+                  <pic:blipFill>
+                    <a:blip r:embed="rId33"/>
+                    <a:stretch>
+                      <a:fillRect/>
+                    </a:stretch>
+                  </pic:blipFill>
+                  <pic:spPr>
+                    <a:xfrm>
+                      <a:off x="0" y="0"/>
+                      <a:ext cx="2880000" cy="929846"/>
+                    </a:xfrm>
+                    <a:prstGeom prst="rect">
+                      <a:avLst/>
+                    </a:prstGeom>
+                  </pic:spPr>
+                </pic:pic>
+              </a:graphicData>
+            </a:graphic>
+          </wp:inline>
+        </w:drawing>
+      </w:r>
+    </w:p>
+    <w:p>
+      <w:pPr>
+        <w:pStyle w:val="Heading3"/>
+        <w:rPr>
+          <w:lang w:val="en-ID"/>
+        </w:rPr>
+      </w:pPr>
+      <w:r>
+        <w:rPr>
+          <w:lang w:val="en-ID"/>
+        </w:rPr>
+        <w:t xml:space="preserve">Langkah 2 - Buat File </w:t>
+      </w:r>
+      <w:proofErr w:type="spellStart"/>
+      <w:r>
+        <w:rPr>
+          <w:lang w:val="en-ID"/>
+        </w:rPr>
+        <w:t>Konfigurasi</w:t>
+      </w:r>
+      <w:proofErr w:type="spellEnd"/>
+    </w:p>
+    <w:p>
+      <w:proofErr w:type="gramStart"/>
+      <w:r>
+        <w:t>Doc :</w:t>
+      </w:r>
+      <w:proofErr w:type="gramEnd"/>
+      <w:r>
+        <w:t xml:space="preserve"> </w:t>
+      </w:r>
+      <w:hyperlink r:id="rId34" w:history="1">
+        <w:r>
+          <w:rPr>
+            <w:rStyle w:val="Hyperlink"/>
+          </w:rPr>
+          <w:t>https://nextjs.org/docs/pages/guides/testing/jest</w:t>
+        </w:r>
+      </w:hyperlink>
+    </w:p>
+    <w:p>
+      <w:pPr>
+        <w:rPr>
+          <w:lang w:val="en-ID"/>
+        </w:rPr>
+      </w:pPr>
+      <w:r>
+        <w:rPr>
+          <w:lang w:val="en-ID"/>
+        </w:rPr>
+        <w:t>Buat file:</w:t>
+      </w:r>
+    </w:p>
+    <w:p>
+      <w:pPr>
+        <w:rPr>
+          <w:lang w:val="en-ID"/>
+        </w:rPr>
+      </w:pPr>
+      <w:r>
+        <w:rPr>
+          <w:lang w:val="en-ID"/>
+        </w:rPr>
+        <w:t xml:space="preserve">o </w:t>
+      </w:r>
+      <w:proofErr w:type="spellStart"/>
+      <w:r>
+        <w:rPr>
+          <w:lang w:val="en-ID"/>
+        </w:rPr>
+        <w:t>jest.config.mjs</w:t>
+      </w:r>
+      <w:proofErr w:type="spellEnd"/>
+    </w:p>
+    <w:p>
+      <w:r>
+        <w:t xml:space="preserve">Isi </w:t>
+      </w:r>
+      <w:proofErr w:type="spellStart"/>
+      <w:r>
+        <w:t>dengan</w:t>
+      </w:r>
+      <w:proofErr w:type="spellEnd"/>
+      <w:r>
+        <w:t>:</w:t>
+      </w:r>
+    </w:p>
+    <w:p>
+      <w:r>
+        <w:drawing>
+          <wp:inline distT="0" distB="0" distL="0" distR="0" wp14:anchorId="23BF5961" wp14:editId="52B98275">
+            <wp:extent cx="2880000" cy="1987692"/>
+            <wp:effectExtent l="0" t="0" r="0" b="0"/>
+            <wp:docPr id="456871254" name="Picture 1"/>
+            <wp:cNvGraphicFramePr>
+              <a:graphicFrameLocks xmlns:a="http://schemas.openxmlformats.org/drawingml/2006/main" noChangeAspect="1"/>
+            </wp:cNvGraphicFramePr>
+            <a:graphic xmlns:a="http://schemas.openxmlformats.org/drawingml/2006/main">
+              <a:graphicData uri="http://schemas.openxmlformats.org/drawingml/2006/picture">
+                <pic:pic xmlns:pic="http://schemas.openxmlformats.org/drawingml/2006/picture">
+                  <pic:nvPicPr>
+                    <pic:cNvPr id="456871254" name=""/>
+                    <pic:cNvPicPr/>
+                  </pic:nvPicPr>
+                  <pic:blipFill>
+                    <a:blip r:embed="rId35"/>
+                    <a:stretch>
+                      <a:fillRect/>
+                    </a:stretch>
+                  </pic:blipFill>
+                  <pic:spPr>
+                    <a:xfrm>
+                      <a:off x="0" y="0"/>
+                      <a:ext cx="2880000" cy="1987692"/>
+                    </a:xfrm>
+                    <a:prstGeom prst="rect">
+                      <a:avLst/>
+                    </a:prstGeom>
+                  </pic:spPr>
+                </pic:pic>
+              </a:graphicData>
+            </a:graphic>
+          </wp:inline>
+        </w:drawing>
+      </w:r>
+    </w:p>
+    <w:p>
+      <w:pPr>
+        <w:pStyle w:val="Heading3"/>
+        <w:rPr>
+          <w:lang w:val="en-ID"/>
+        </w:rPr>
+      </w:pPr>
+      <w:r>
+        <w:rPr>
+          <w:lang w:val="en-ID"/>
+        </w:rPr>
+        <w:t xml:space="preserve">Langkah 3 - </w:t>
+      </w:r>
+      <w:proofErr w:type="spellStart"/>
+      <w:r>
+        <w:rPr>
+          <w:lang w:val="en-ID"/>
+        </w:rPr>
+        <w:t>Tambahkan</w:t>
+      </w:r>
+      <w:proofErr w:type="spellEnd"/>
+      <w:r>
+        <w:rPr>
+          <w:lang w:val="en-ID"/>
+        </w:rPr>
+        <w:t xml:space="preserve"> Script di </w:t>
+      </w:r>
+      <w:proofErr w:type="spellStart"/>
+      <w:proofErr w:type="gramStart"/>
+      <w:r>
+        <w:rPr>
+          <w:lang w:val="en-ID"/>
+        </w:rPr>
+        <w:t>package.json</w:t>
+      </w:r>
+      <w:proofErr w:type="spellEnd"/>
+      <w:proofErr w:type="gramEnd"/>
+    </w:p>
+    <w:p>
+      <w:r>
+        <w:drawing>
+          <wp:inline distT="0" distB="0" distL="0" distR="0" wp14:anchorId="280D09F6" wp14:editId="575801D9">
+            <wp:extent cx="2880000" cy="869846"/>
+            <wp:effectExtent l="0" t="0" r="0" b="6985"/>
+            <wp:docPr id="355141447" name="Picture 1"/>
+            <wp:cNvGraphicFramePr>
+              <a:graphicFrameLocks xmlns:a="http://schemas.openxmlformats.org/drawingml/2006/main" noChangeAspect="1"/>
+            </wp:cNvGraphicFramePr>
+            <a:graphic xmlns:a="http://schemas.openxmlformats.org/drawingml/2006/main">
+              <a:graphicData uri="http://schemas.openxmlformats.org/drawingml/2006/picture">
+                <pic:pic xmlns:pic="http://schemas.openxmlformats.org/drawingml/2006/picture">
+                  <pic:nvPicPr>
+                    <pic:cNvPr id="355141447" name=""/>
+                    <pic:cNvPicPr/>
+                  </pic:nvPicPr>
+                  <pic:blipFill>
+                    <a:blip r:embed="rId36"/>
+                    <a:stretch>
+                      <a:fillRect/>
+                    </a:stretch>
+                  </pic:blipFill>
+                  <pic:spPr>
+                    <a:xfrm>
+                      <a:off x="0" y="0"/>
+                      <a:ext cx="2880000" cy="869846"/>
+                    </a:xfrm>
+                    <a:prstGeom prst="rect">
+                      <a:avLst/>
+                    </a:prstGeom>
+                  </pic:spPr>
+                </pic:pic>
+              </a:graphicData>
+            </a:graphic>
+          </wp:inline>
+        </w:drawing>
+      </w:r>
+    </w:p>
+    <w:p>
+      <w:pPr>
+        <w:pStyle w:val="Heading2"/>
+      </w:pPr>
+      <w:r>
+        <w:lastRenderedPageBreak/>
+        <w:t>PRAKTIKUM 2 – Struktur Folder Testing</w:t>
+      </w:r>
+    </w:p>
+    <w:p>
+      <w:proofErr w:type="spellStart"/>
+      <w:r>
+        <w:t>Buat</w:t>
+      </w:r>
+      <w:proofErr w:type="spellEnd"/>
+      <w:r>
+        <w:t xml:space="preserve"> folder:</w:t>
+      </w:r>
+    </w:p>
+    <w:p>
+      <w:proofErr w:type="spellStart"/>
+      <w:r>
+        <w:t>src</w:t>
+      </w:r>
+      <w:proofErr w:type="spellEnd"/>
+      <w:r>
+        <w:t>/__test__/</w:t>
+      </w:r>
+    </w:p>
+    <w:p>
+      <w:proofErr w:type="spellStart"/>
+      <w:r>
+        <w:t>Struktur</w:t>
+      </w:r>
+      <w:proofErr w:type="spellEnd"/>
+      <w:r>
+        <w:t xml:space="preserve"> </w:t>
+      </w:r>
+      <w:proofErr w:type="spellStart"/>
+      <w:r>
+        <w:t>contoh</w:t>
+      </w:r>
+      <w:proofErr w:type="spellEnd"/>
+      <w:r>
+        <w:t>:</w:t>
+      </w:r>
+    </w:p>
+    <w:p>
+      <w:proofErr w:type="spellStart"/>
+      <w:r>
+        <w:t>src</w:t>
+      </w:r>
+      <w:proofErr w:type="spellEnd"/>
+    </w:p>
+    <w:p>
+      <w:pPr>
+        <w:rPr>
+          <w:rFonts w:hint="eastAsia"/>
+        </w:rPr>
+      </w:pPr>
+      <w:r>
+        <w:rPr>
+          <w:rFonts w:hint="eastAsia"/>
+        </w:rPr>
+        <w:t>├──</w:t>
+      </w:r>
+      <w:r>
+        <w:rPr>
+          <w:rFonts w:hint="eastAsia"/>
+        </w:rPr>
+        <w:t xml:space="preserve"> pages</w:t>
+      </w:r>
+    </w:p>
+    <w:p>
+      <w:pPr>
+        <w:rPr>
+          <w:rFonts w:hint="eastAsia"/>
+        </w:rPr>
+      </w:pPr>
+      <w:r>
+        <w:rPr>
+          <w:rFonts w:hint="eastAsia"/>
+        </w:rPr>
+        <w:t>├──</w:t>
+      </w:r>
+      <w:r>
+        <w:rPr>
+          <w:rFonts w:hint="eastAsia"/>
+        </w:rPr>
+        <w:t xml:space="preserve"> components</w:t>
+      </w:r>
+    </w:p>
+    <w:p>
+      <w:pPr>
+        <w:rPr>
+          <w:rFonts w:hint="eastAsia"/>
+        </w:rPr>
+      </w:pPr>
+      <w:r>
+        <w:rPr>
+          <w:rFonts w:hint="eastAsia"/>
+        </w:rPr>
+        <w:t>├──</w:t>
+      </w:r>
+      <w:r>
+        <w:rPr>
+          <w:rFonts w:hint="eastAsia"/>
+        </w:rPr>
+        <w:t xml:space="preserve"> views</w:t>
+      </w:r>
+    </w:p>
+    <w:p>
+      <w:r>
+        <w:rPr>
+          <w:rFonts w:hint="eastAsia"/>
+        </w:rPr>
+        <w:t>└──</w:t>
+      </w:r>
+      <w:r>
+        <w:rPr>
+          <w:rFonts w:hint="eastAsia"/>
+        </w:rPr>
+        <w:t xml:space="preserve"> __test__</w:t>
+      </w:r>
+    </w:p>
+    <w:p>
+      <w:pPr>
+        <w:rPr>
+          <w:rFonts w:hint="eastAsia"/>
+        </w:rPr>
+      </w:pPr>
+      <w:r>
+        <w:rPr>
+          <w:rFonts w:hint="eastAsia"/>
+        </w:rPr>
+        <w:t>├──</w:t>
+      </w:r>
+      <w:r>
+        <w:rPr>
+          <w:rFonts w:hint="eastAsia"/>
+        </w:rPr>
+        <w:t xml:space="preserve"> pages</w:t>
+      </w:r>
+    </w:p>
+    <w:p>
+      <w:r>
+        <w:rPr>
+          <w:rFonts w:hint="eastAsia"/>
+        </w:rPr>
+        <w:t>└──</w:t>
+      </w:r>
+      <w:r>
+        <w:rPr>
+          <w:rFonts w:hint="eastAsia"/>
+        </w:rPr>
+        <w:t xml:space="preserve"> components</w:t>
+      </w:r>
+    </w:p>
+    <w:p>
+      <w:r>
+        <w:drawing>
+          <wp:inline distT="0" distB="0" distL="0" distR="0" wp14:anchorId="32E2923D" wp14:editId="55950F8C">
+            <wp:extent cx="1800000" cy="542609"/>
+            <wp:effectExtent l="0" t="0" r="0" b="0"/>
+            <wp:docPr id="1406615252" name="Picture 1"/>
+            <wp:cNvGraphicFramePr>
+              <a:graphicFrameLocks xmlns:a="http://schemas.openxmlformats.org/drawingml/2006/main" noChangeAspect="1"/>
+            </wp:cNvGraphicFramePr>
+            <a:graphic xmlns:a="http://schemas.openxmlformats.org/drawingml/2006/main">
+              <a:graphicData uri="http://schemas.openxmlformats.org/drawingml/2006/picture">
+                <pic:pic xmlns:pic="http://schemas.openxmlformats.org/drawingml/2006/picture">
+                  <pic:nvPicPr>
+                    <pic:cNvPr id="1406615252" name=""/>
+                    <pic:cNvPicPr/>
+                  </pic:nvPicPr>
+                  <pic:blipFill>
+                    <a:blip r:embed="rId37"/>
+                    <a:stretch>
+                      <a:fillRect/>
+                    </a:stretch>
+                  </pic:blipFill>
+                  <pic:spPr>
+                    <a:xfrm>
+                      <a:off x="0" y="0"/>
+                      <a:ext cx="1800000" cy="542609"/>
+                    </a:xfrm>
+                    <a:prstGeom prst="rect">
+                      <a:avLst/>
+                    </a:prstGeom>
+                  </pic:spPr>
+                </pic:pic>
+              </a:graphicData>
+            </a:graphic>
+          </wp:inline>
+        </w:drawing>
       </w:r>
     </w:p>
     <w:p/>

</xml_diff>

<commit_message>
Langkah 2 - Contoh Testing Snapshot. Pada about.spec.tsx tambahkan code berikut :
</commit_message>
<xml_diff>
--- a/Laporan/03_Ahmad Dzul Fadhli Jobsheet 18&19.docx
+++ b/Laporan/03_Ahmad Dzul Fadhli Jobsheet 18&19.docx
@@ -8739,10 +8739,10 @@
     <w:p>
       <w:r>
         <w:drawing>
-          <wp:inline distT="0" distB="0" distL="0" distR="0" wp14:anchorId="32E2923D" wp14:editId="55950F8C">
-            <wp:extent cx="1800000" cy="542609"/>
+          <wp:inline distT="0" distB="0" distL="0" distR="0" wp14:anchorId="3655DF85" wp14:editId="7CE7AF1E">
+            <wp:extent cx="1800000" cy="789928"/>
             <wp:effectExtent l="0" t="0" r="0" b="0"/>
-            <wp:docPr id="1406615252" name="Picture 1"/>
+            <wp:docPr id="763112532" name="Picture 1"/>
             <wp:cNvGraphicFramePr>
               <a:graphicFrameLocks xmlns:a="http://schemas.openxmlformats.org/drawingml/2006/main" noChangeAspect="1"/>
             </wp:cNvGraphicFramePr>
@@ -8750,7 +8750,7 @@
               <a:graphicData uri="http://schemas.openxmlformats.org/drawingml/2006/picture">
                 <pic:pic xmlns:pic="http://schemas.openxmlformats.org/drawingml/2006/picture">
                   <pic:nvPicPr>
-                    <pic:cNvPr id="1406615252" name=""/>
+                    <pic:cNvPr id="763112532" name=""/>
                     <pic:cNvPicPr/>
                   </pic:nvPicPr>
                   <pic:blipFill>
@@ -8762,7 +8762,195 @@
                   <pic:spPr>
                     <a:xfrm>
                       <a:off x="0" y="0"/>
-                      <a:ext cx="1800000" cy="542609"/>
+                      <a:ext cx="1800000" cy="789928"/>
+                    </a:xfrm>
+                    <a:prstGeom prst="rect">
+                      <a:avLst/>
+                    </a:prstGeom>
+                  </pic:spPr>
+                </pic:pic>
+              </a:graphicData>
+            </a:graphic>
+          </wp:inline>
+        </w:drawing>
+      </w:r>
+    </w:p>
+    <w:p>
+      <w:pPr>
+        <w:pStyle w:val="Heading2"/>
+      </w:pPr>
+      <w:r>
+        <w:t>PRAKTIKUM 3 – Testing Halaman About</w:t>
+      </w:r>
+    </w:p>
+    <w:p>
+      <w:pPr>
+        <w:pStyle w:val="Heading3"/>
+        <w:rPr>
+          <w:lang w:val="en-ID"/>
+        </w:rPr>
+      </w:pPr>
+      <w:r>
+        <w:rPr>
+          <w:lang w:val="en-ID"/>
+        </w:rPr>
+        <w:t>Langkah 1 - Buat File Testing</w:t>
+      </w:r>
+    </w:p>
+    <w:p>
+      <w:proofErr w:type="spellStart"/>
+      <w:r>
+        <w:t>src</w:t>
+      </w:r>
+      <w:proofErr w:type="spellEnd"/>
+      <w:r>
+        <w:t>/__test__/pages/</w:t>
+      </w:r>
+      <w:proofErr w:type="spellStart"/>
+      <w:r>
+        <w:t>about.spec.tsx</w:t>
+      </w:r>
+      <w:proofErr w:type="spellEnd"/>
+    </w:p>
+    <w:p>
+      <w:r>
+        <w:drawing>
+          <wp:inline distT="0" distB="0" distL="0" distR="0" wp14:anchorId="1488C9C4" wp14:editId="1EEEA7DF">
+            <wp:extent cx="1800000" cy="975701"/>
+            <wp:effectExtent l="0" t="0" r="0" b="0"/>
+            <wp:docPr id="1259389807" name="Picture 1"/>
+            <wp:cNvGraphicFramePr>
+              <a:graphicFrameLocks xmlns:a="http://schemas.openxmlformats.org/drawingml/2006/main" noChangeAspect="1"/>
+            </wp:cNvGraphicFramePr>
+            <a:graphic xmlns:a="http://schemas.openxmlformats.org/drawingml/2006/main">
+              <a:graphicData uri="http://schemas.openxmlformats.org/drawingml/2006/picture">
+                <pic:pic xmlns:pic="http://schemas.openxmlformats.org/drawingml/2006/picture">
+                  <pic:nvPicPr>
+                    <pic:cNvPr id="1259389807" name=""/>
+                    <pic:cNvPicPr/>
+                  </pic:nvPicPr>
+                  <pic:blipFill>
+                    <a:blip r:embed="rId38"/>
+                    <a:stretch>
+                      <a:fillRect/>
+                    </a:stretch>
+                  </pic:blipFill>
+                  <pic:spPr>
+                    <a:xfrm>
+                      <a:off x="0" y="0"/>
+                      <a:ext cx="1800000" cy="975701"/>
+                    </a:xfrm>
+                    <a:prstGeom prst="rect">
+                      <a:avLst/>
+                    </a:prstGeom>
+                  </pic:spPr>
+                </pic:pic>
+              </a:graphicData>
+            </a:graphic>
+          </wp:inline>
+        </w:drawing>
+      </w:r>
+    </w:p>
+    <w:p>
+      <w:pPr>
+        <w:pStyle w:val="Heading3"/>
+        <w:rPr>
+          <w:lang w:val="en-ID"/>
+        </w:rPr>
+      </w:pPr>
+      <w:r>
+        <w:rPr>
+          <w:lang w:val="en-ID"/>
+        </w:rPr>
+        <w:lastRenderedPageBreak/>
+        <w:t xml:space="preserve">Langkah 2 - </w:t>
+      </w:r>
+      <w:proofErr w:type="spellStart"/>
+      <w:r>
+        <w:rPr>
+          <w:lang w:val="en-ID"/>
+        </w:rPr>
+        <w:t>Contoh</w:t>
+      </w:r>
+      <w:proofErr w:type="spellEnd"/>
+      <w:r>
+        <w:rPr>
+          <w:lang w:val="en-ID"/>
+        </w:rPr>
+        <w:t xml:space="preserve"> Testing Snapshot. Pada </w:t>
+      </w:r>
+      <w:proofErr w:type="spellStart"/>
+      <w:r>
+        <w:rPr>
+          <w:lang w:val="en-ID"/>
+        </w:rPr>
+        <w:t>about.spec.tsx</w:t>
+      </w:r>
+      <w:proofErr w:type="spellEnd"/>
+      <w:r>
+        <w:rPr>
+          <w:lang w:val="en-ID"/>
+        </w:rPr>
+        <w:t xml:space="preserve"> </w:t>
+      </w:r>
+      <w:proofErr w:type="spellStart"/>
+      <w:r>
+        <w:rPr>
+          <w:lang w:val="en-ID"/>
+        </w:rPr>
+        <w:t>tambahkan</w:t>
+      </w:r>
+      <w:proofErr w:type="spellEnd"/>
+      <w:r>
+        <w:rPr>
+          <w:lang w:val="en-ID"/>
+        </w:rPr>
+        <w:t xml:space="preserve"> code </w:t>
+      </w:r>
+      <w:proofErr w:type="spellStart"/>
+      <w:proofErr w:type="gramStart"/>
+      <w:r>
+        <w:rPr>
+          <w:lang w:val="en-ID"/>
+        </w:rPr>
+        <w:t>berikut</w:t>
+      </w:r>
+      <w:proofErr w:type="spellEnd"/>
+      <w:r>
+        <w:rPr>
+          <w:lang w:val="en-ID"/>
+        </w:rPr>
+        <w:t xml:space="preserve"> :</w:t>
+      </w:r>
+      <w:proofErr w:type="gramEnd"/>
+    </w:p>
+    <w:p>
+      <w:r>
+        <w:drawing>
+          <wp:inline distT="0" distB="0" distL="0" distR="0" wp14:anchorId="2D3AC7B0" wp14:editId="641C7B7D">
+            <wp:extent cx="2880000" cy="1688615"/>
+            <wp:effectExtent l="0" t="0" r="0" b="6985"/>
+            <wp:docPr id="313060195" name="Picture 1"/>
+            <wp:cNvGraphicFramePr>
+              <a:graphicFrameLocks xmlns:a="http://schemas.openxmlformats.org/drawingml/2006/main" noChangeAspect="1"/>
+            </wp:cNvGraphicFramePr>
+            <a:graphic xmlns:a="http://schemas.openxmlformats.org/drawingml/2006/main">
+              <a:graphicData uri="http://schemas.openxmlformats.org/drawingml/2006/picture">
+                <pic:pic xmlns:pic="http://schemas.openxmlformats.org/drawingml/2006/picture">
+                  <pic:nvPicPr>
+                    <pic:cNvPr id="313060195" name=""/>
+                    <pic:cNvPicPr/>
+                  </pic:nvPicPr>
+                  <pic:blipFill>
+                    <a:blip r:embed="rId39"/>
+                    <a:stretch>
+                      <a:fillRect/>
+                    </a:stretch>
+                  </pic:blipFill>
+                  <pic:spPr>
+                    <a:xfrm>
+                      <a:off x="0" y="0"/>
+                      <a:ext cx="2880000" cy="1688615"/>
                     </a:xfrm>
                     <a:prstGeom prst="rect">
                       <a:avLst/>

</xml_diff>

<commit_message>
Langkah 3 - Jalankan Testing
</commit_message>
<xml_diff>
--- a/Laporan/03_Ahmad Dzul Fadhli Jobsheet 18&19.docx
+++ b/Laporan/03_Ahmad Dzul Fadhli Jobsheet 18&19.docx
@@ -8951,6 +8951,148 @@
                     <a:xfrm>
                       <a:off x="0" y="0"/>
                       <a:ext cx="2880000" cy="1688615"/>
+                    </a:xfrm>
+                    <a:prstGeom prst="rect">
+                      <a:avLst/>
+                    </a:prstGeom>
+                  </pic:spPr>
+                </pic:pic>
+              </a:graphicData>
+            </a:graphic>
+          </wp:inline>
+        </w:drawing>
+      </w:r>
+    </w:p>
+    <w:p>
+      <w:pPr>
+        <w:pStyle w:val="Heading3"/>
+        <w:rPr>
+          <w:lang w:val="en-ID"/>
+        </w:rPr>
+      </w:pPr>
+      <w:r>
+        <w:rPr>
+          <w:lang w:val="en-ID"/>
+        </w:rPr>
+        <w:t xml:space="preserve">Langkah 3 - </w:t>
+      </w:r>
+      <w:proofErr w:type="spellStart"/>
+      <w:r>
+        <w:rPr>
+          <w:lang w:val="en-ID"/>
+        </w:rPr>
+        <w:t>Jalankan</w:t>
+      </w:r>
+      <w:proofErr w:type="spellEnd"/>
+      <w:r>
+        <w:rPr>
+          <w:lang w:val="en-ID"/>
+        </w:rPr>
+        <w:t xml:space="preserve"> Testing</w:t>
+      </w:r>
+    </w:p>
+    <w:p>
+      <w:pPr>
+        <w:rPr>
+          <w:lang w:val="en-ID"/>
+        </w:rPr>
+      </w:pPr>
+      <w:r>
+        <w:rPr>
+          <w:lang w:val="en-ID"/>
+        </w:rPr>
+        <w:t xml:space="preserve">• </w:t>
+      </w:r>
+      <w:proofErr w:type="spellStart"/>
+      <w:r>
+        <w:rPr>
+          <w:lang w:val="en-ID"/>
+        </w:rPr>
+        <w:t>npm</w:t>
+      </w:r>
+      <w:proofErr w:type="spellEnd"/>
+      <w:r>
+        <w:rPr>
+          <w:lang w:val="en-ID"/>
+        </w:rPr>
+        <w:t xml:space="preserve"> run test</w:t>
+      </w:r>
+    </w:p>
+    <w:p>
+      <w:pPr>
+        <w:rPr>
+          <w:lang w:val="en-ID"/>
+        </w:rPr>
+      </w:pPr>
+      <w:r>
+        <w:rPr>
+          <w:lang w:val="en-ID"/>
+        </w:rPr>
+        <w:t xml:space="preserve">• Jika </w:t>
+      </w:r>
+      <w:proofErr w:type="spellStart"/>
+      <w:r>
+        <w:rPr>
+          <w:lang w:val="en-ID"/>
+        </w:rPr>
+        <w:t>berhasil</w:t>
+      </w:r>
+      <w:proofErr w:type="spellEnd"/>
+      <w:r>
+        <w:rPr>
+          <w:lang w:val="en-ID"/>
+        </w:rPr>
+        <w:t>:</w:t>
+      </w:r>
+    </w:p>
+    <w:p>
+      <w:pPr>
+        <w:rPr>
+          <w:lang w:val="en-ID"/>
+        </w:rPr>
+      </w:pPr>
+      <w:r>
+        <w:rPr>
+          <w:lang w:val="en-ID"/>
+        </w:rPr>
+        <w:t xml:space="preserve">• PASS </w:t>
+      </w:r>
+      <w:proofErr w:type="spellStart"/>
+      <w:r>
+        <w:rPr>
+          <w:lang w:val="en-ID"/>
+        </w:rPr>
+        <w:t>about.spec.tsx</w:t>
+      </w:r>
+      <w:proofErr w:type="spellEnd"/>
+    </w:p>
+    <w:p>
+      <w:r>
+        <w:drawing>
+          <wp:inline distT="0" distB="0" distL="0" distR="0" wp14:anchorId="57EB122B" wp14:editId="07B6A24D">
+            <wp:extent cx="2880000" cy="2090866"/>
+            <wp:effectExtent l="0" t="0" r="0" b="5080"/>
+            <wp:docPr id="1700957272" name="Picture 1"/>
+            <wp:cNvGraphicFramePr>
+              <a:graphicFrameLocks xmlns:a="http://schemas.openxmlformats.org/drawingml/2006/main" noChangeAspect="1"/>
+            </wp:cNvGraphicFramePr>
+            <a:graphic xmlns:a="http://schemas.openxmlformats.org/drawingml/2006/main">
+              <a:graphicData uri="http://schemas.openxmlformats.org/drawingml/2006/picture">
+                <pic:pic xmlns:pic="http://schemas.openxmlformats.org/drawingml/2006/picture">
+                  <pic:nvPicPr>
+                    <pic:cNvPr id="1700957272" name=""/>
+                    <pic:cNvPicPr/>
+                  </pic:nvPicPr>
+                  <pic:blipFill>
+                    <a:blip r:embed="rId40"/>
+                    <a:stretch>
+                      <a:fillRect/>
+                    </a:stretch>
+                  </pic:blipFill>
+                  <pic:spPr>
+                    <a:xfrm>
+                      <a:off x="0" y="0"/>
+                      <a:ext cx="2880000" cy="2090866"/>
                     </a:xfrm>
                     <a:prstGeom prst="rect">
                       <a:avLst/>

</xml_diff>

<commit_message>
PRAKTIKUM 4 – Coverage Report
</commit_message>
<xml_diff>
--- a/Laporan/03_Ahmad Dzul Fadhli Jobsheet 18&19.docx
+++ b/Laporan/03_Ahmad Dzul Fadhli Jobsheet 18&19.docx
@@ -9105,6 +9105,335 @@
         </w:drawing>
       </w:r>
     </w:p>
+    <w:p>
+      <w:pPr>
+        <w:pStyle w:val="Heading2"/>
+      </w:pPr>
+      <w:r>
+        <w:t>PRAKTIKUM 4 – Coverage Report</w:t>
+      </w:r>
+    </w:p>
+    <w:p>
+      <w:pPr>
+        <w:rPr>
+          <w:lang w:val="en-ID"/>
+        </w:rPr>
+      </w:pPr>
+      <w:proofErr w:type="spellStart"/>
+      <w:r>
+        <w:rPr>
+          <w:lang w:val="en-ID"/>
+        </w:rPr>
+        <w:t>Jalankan</w:t>
+      </w:r>
+      <w:proofErr w:type="spellEnd"/>
+      <w:r>
+        <w:rPr>
+          <w:lang w:val="en-ID"/>
+        </w:rPr>
+        <w:t>:</w:t>
+      </w:r>
+    </w:p>
+    <w:p>
+      <w:pPr>
+        <w:rPr>
+          <w:lang w:val="en-ID"/>
+        </w:rPr>
+      </w:pPr>
+      <w:r>
+        <w:rPr>
+          <w:lang w:val="en-ID"/>
+        </w:rPr>
+        <w:t xml:space="preserve">o </w:t>
+      </w:r>
+      <w:proofErr w:type="spellStart"/>
+      <w:r>
+        <w:rPr>
+          <w:lang w:val="en-ID"/>
+        </w:rPr>
+        <w:t>npm</w:t>
+      </w:r>
+      <w:proofErr w:type="spellEnd"/>
+      <w:r>
+        <w:rPr>
+          <w:lang w:val="en-ID"/>
+        </w:rPr>
+        <w:t xml:space="preserve"> run </w:t>
+      </w:r>
+      <w:proofErr w:type="spellStart"/>
+      <w:proofErr w:type="gramStart"/>
+      <w:r>
+        <w:rPr>
+          <w:lang w:val="en-ID"/>
+        </w:rPr>
+        <w:t>test:coverage</w:t>
+      </w:r>
+      <w:proofErr w:type="spellEnd"/>
+      <w:proofErr w:type="gramEnd"/>
+    </w:p>
+    <w:p>
+      <w:r>
+        <w:drawing>
+          <wp:inline distT="0" distB="0" distL="0" distR="0" wp14:anchorId="269E619A" wp14:editId="458EE294">
+            <wp:extent cx="2880000" cy="1654462"/>
+            <wp:effectExtent l="0" t="0" r="0" b="3175"/>
+            <wp:docPr id="1179347584" name="Picture 1"/>
+            <wp:cNvGraphicFramePr>
+              <a:graphicFrameLocks xmlns:a="http://schemas.openxmlformats.org/drawingml/2006/main" noChangeAspect="1"/>
+            </wp:cNvGraphicFramePr>
+            <a:graphic xmlns:a="http://schemas.openxmlformats.org/drawingml/2006/main">
+              <a:graphicData uri="http://schemas.openxmlformats.org/drawingml/2006/picture">
+                <pic:pic xmlns:pic="http://schemas.openxmlformats.org/drawingml/2006/picture">
+                  <pic:nvPicPr>
+                    <pic:cNvPr id="1179347584" name=""/>
+                    <pic:cNvPicPr/>
+                  </pic:nvPicPr>
+                  <pic:blipFill>
+                    <a:blip r:embed="rId41"/>
+                    <a:stretch>
+                      <a:fillRect/>
+                    </a:stretch>
+                  </pic:blipFill>
+                  <pic:spPr>
+                    <a:xfrm>
+                      <a:off x="0" y="0"/>
+                      <a:ext cx="2880000" cy="1654462"/>
+                    </a:xfrm>
+                    <a:prstGeom prst="rect">
+                      <a:avLst/>
+                    </a:prstGeom>
+                  </pic:spPr>
+                </pic:pic>
+              </a:graphicData>
+            </a:graphic>
+          </wp:inline>
+        </w:drawing>
+      </w:r>
+    </w:p>
+    <w:p>
+      <w:pPr>
+        <w:rPr>
+          <w:lang w:val="en-ID"/>
+        </w:rPr>
+      </w:pPr>
+      <w:r>
+        <w:rPr>
+          <w:lang w:val="en-ID"/>
+        </w:rPr>
+        <w:lastRenderedPageBreak/>
+        <w:t xml:space="preserve">Akan </w:t>
+      </w:r>
+      <w:proofErr w:type="spellStart"/>
+      <w:r>
+        <w:rPr>
+          <w:lang w:val="en-ID"/>
+        </w:rPr>
+        <w:t>muncul</w:t>
+      </w:r>
+      <w:proofErr w:type="spellEnd"/>
+      <w:r>
+        <w:rPr>
+          <w:lang w:val="en-ID"/>
+        </w:rPr>
+        <w:t xml:space="preserve"> folder:</w:t>
+      </w:r>
+    </w:p>
+    <w:p>
+      <w:pPr>
+        <w:rPr>
+          <w:lang w:val="en-ID"/>
+        </w:rPr>
+      </w:pPr>
+      <w:r>
+        <w:rPr>
+          <w:lang w:val="en-ID"/>
+        </w:rPr>
+        <w:t>o coverage/</w:t>
+      </w:r>
+    </w:p>
+    <w:p>
+      <w:pPr>
+        <w:rPr>
+          <w:lang w:val="en-ID"/>
+        </w:rPr>
+      </w:pPr>
+      <w:r>
+        <w:rPr>
+          <w:lang w:val="en-ID"/>
+        </w:rPr>
+        <w:t>o Buka:</w:t>
+      </w:r>
+    </w:p>
+    <w:p>
+      <w:pPr>
+        <w:rPr>
+          <w:lang w:val="en-ID"/>
+        </w:rPr>
+      </w:pPr>
+      <w:r>
+        <w:rPr>
+          <w:lang w:val="en-ID"/>
+        </w:rPr>
+        <w:t>▪ coverage/</w:t>
+      </w:r>
+      <w:proofErr w:type="spellStart"/>
+      <w:r>
+        <w:rPr>
+          <w:lang w:val="en-ID"/>
+        </w:rPr>
+        <w:t>lcov</w:t>
+      </w:r>
+      <w:proofErr w:type="spellEnd"/>
+      <w:r>
+        <w:rPr>
+          <w:lang w:val="en-ID"/>
+        </w:rPr>
+        <w:t xml:space="preserve">-report/index.html </w:t>
+      </w:r>
+      <w:proofErr w:type="gramStart"/>
+      <w:r>
+        <w:rPr>
+          <w:lang w:val="en-ID"/>
+        </w:rPr>
+        <w:t xml:space="preserve">( </w:t>
+      </w:r>
+      <w:proofErr w:type="spellStart"/>
+      <w:r>
+        <w:rPr>
+          <w:lang w:val="en-ID"/>
+        </w:rPr>
+        <w:t>buka</w:t>
+      </w:r>
+      <w:proofErr w:type="spellEnd"/>
+      <w:proofErr w:type="gramEnd"/>
+      <w:r>
+        <w:rPr>
+          <w:lang w:val="en-ID"/>
+        </w:rPr>
+        <w:t xml:space="preserve"> di </w:t>
+      </w:r>
+      <w:proofErr w:type="spellStart"/>
+      <w:r>
+        <w:rPr>
+          <w:lang w:val="en-ID"/>
+        </w:rPr>
+        <w:t>melalui</w:t>
+      </w:r>
+      <w:proofErr w:type="spellEnd"/>
+      <w:r>
+        <w:rPr>
+          <w:lang w:val="en-ID"/>
+        </w:rPr>
+        <w:t xml:space="preserve"> explorer)</w:t>
+      </w:r>
+    </w:p>
+    <w:p>
+      <w:r>
+        <w:drawing>
+          <wp:inline distT="0" distB="0" distL="0" distR="0" wp14:anchorId="441B45E4" wp14:editId="1BB88E8F">
+            <wp:extent cx="1800000" cy="1272414"/>
+            <wp:effectExtent l="0" t="0" r="0" b="4445"/>
+            <wp:docPr id="401909381" name="Picture 1"/>
+            <wp:cNvGraphicFramePr>
+              <a:graphicFrameLocks xmlns:a="http://schemas.openxmlformats.org/drawingml/2006/main" noChangeAspect="1"/>
+            </wp:cNvGraphicFramePr>
+            <a:graphic xmlns:a="http://schemas.openxmlformats.org/drawingml/2006/main">
+              <a:graphicData uri="http://schemas.openxmlformats.org/drawingml/2006/picture">
+                <pic:pic xmlns:pic="http://schemas.openxmlformats.org/drawingml/2006/picture">
+                  <pic:nvPicPr>
+                    <pic:cNvPr id="401909381" name=""/>
+                    <pic:cNvPicPr/>
+                  </pic:nvPicPr>
+                  <pic:blipFill>
+                    <a:blip r:embed="rId42"/>
+                    <a:stretch>
+                      <a:fillRect/>
+                    </a:stretch>
+                  </pic:blipFill>
+                  <pic:spPr>
+                    <a:xfrm>
+                      <a:off x="0" y="0"/>
+                      <a:ext cx="1800000" cy="1272414"/>
+                    </a:xfrm>
+                    <a:prstGeom prst="rect">
+                      <a:avLst/>
+                    </a:prstGeom>
+                  </pic:spPr>
+                </pic:pic>
+              </a:graphicData>
+            </a:graphic>
+          </wp:inline>
+        </w:drawing>
+      </w:r>
+    </w:p>
+    <w:p>
+      <w:r>
+        <w:t xml:space="preserve">Target </w:t>
+      </w:r>
+      <w:proofErr w:type="spellStart"/>
+      <w:r>
+        <w:t>perusahaan</w:t>
+      </w:r>
+      <w:proofErr w:type="spellEnd"/>
+      <w:r>
+        <w:t xml:space="preserve"> </w:t>
+      </w:r>
+      <w:proofErr w:type="spellStart"/>
+      <w:r>
+        <w:t>biasanya</w:t>
+      </w:r>
+      <w:proofErr w:type="spellEnd"/>
+      <w:r>
+        <w:t>:</w:t>
+      </w:r>
+    </w:p>
+    <w:p>
+      <w:r>
+        <w:drawing>
+          <wp:inline distT="0" distB="0" distL="0" distR="0" wp14:anchorId="2A68520B" wp14:editId="44DB4BAA">
+            <wp:extent cx="2880000" cy="637846"/>
+            <wp:effectExtent l="0" t="0" r="0" b="0"/>
+            <wp:docPr id="1191734443" name="Picture 1"/>
+            <wp:cNvGraphicFramePr>
+              <a:graphicFrameLocks xmlns:a="http://schemas.openxmlformats.org/drawingml/2006/main" noChangeAspect="1"/>
+            </wp:cNvGraphicFramePr>
+            <a:graphic xmlns:a="http://schemas.openxmlformats.org/drawingml/2006/main">
+              <a:graphicData uri="http://schemas.openxmlformats.org/drawingml/2006/picture">
+                <pic:pic xmlns:pic="http://schemas.openxmlformats.org/drawingml/2006/picture">
+                  <pic:nvPicPr>
+                    <pic:cNvPr id="1191734443" name=""/>
+                    <pic:cNvPicPr/>
+                  </pic:nvPicPr>
+                  <pic:blipFill>
+                    <a:blip r:embed="rId43"/>
+                    <a:stretch>
+                      <a:fillRect/>
+                    </a:stretch>
+                  </pic:blipFill>
+                  <pic:spPr>
+                    <a:xfrm>
+                      <a:off x="0" y="0"/>
+                      <a:ext cx="2880000" cy="637846"/>
+                    </a:xfrm>
+                    <a:prstGeom prst="rect">
+                      <a:avLst/>
+                    </a:prstGeom>
+                  </pic:spPr>
+                </pic:pic>
+              </a:graphicData>
+            </a:graphic>
+          </wp:inline>
+        </w:drawing>
+      </w:r>
+    </w:p>
+    <w:p>
+      <w:r>
+        <w:t>Minimum 80% coverage</w:t>
+      </w:r>
+    </w:p>
+    <w:p/>
+    <w:p/>
+    <w:p/>
     <w:p/>
     <w:sectPr>
       <w:pgSz w:w="12240" w:h="15840"/>

</xml_diff>

<commit_message>
PRAKTIKUM 5 – Konfigurasi Coverage Lengkap
</commit_message>
<xml_diff>
--- a/Laporan/03_Ahmad Dzul Fadhli Jobsheet 18&19.docx
+++ b/Laporan/03_Ahmad Dzul Fadhli Jobsheet 18&19.docx
@@ -9429,6 +9429,211 @@
     <w:p>
       <w:r>
         <w:t>Minimum 80% coverage</w:t>
+      </w:r>
+    </w:p>
+    <w:p>
+      <w:pPr>
+        <w:pStyle w:val="Heading2"/>
+        <w:rPr>
+          <w:lang w:val="en-ID"/>
+        </w:rPr>
+      </w:pPr>
+      <w:r>
+        <w:rPr>
+          <w:lang w:val="en-ID"/>
+        </w:rPr>
+        <w:t xml:space="preserve">PRAKTIKUM 5 – </w:t>
+      </w:r>
+      <w:proofErr w:type="spellStart"/>
+      <w:r>
+        <w:rPr>
+          <w:lang w:val="en-ID"/>
+        </w:rPr>
+        <w:t>Konfigurasi</w:t>
+      </w:r>
+      <w:proofErr w:type="spellEnd"/>
+      <w:r>
+        <w:rPr>
+          <w:lang w:val="en-ID"/>
+        </w:rPr>
+        <w:t xml:space="preserve"> Coverage Lengkap</w:t>
+      </w:r>
+    </w:p>
+    <w:p>
+      <w:r>
+        <w:t xml:space="preserve">Update </w:t>
+      </w:r>
+      <w:proofErr w:type="spellStart"/>
+      <w:r>
+        <w:t>jest.config.mjs</w:t>
+      </w:r>
+      <w:proofErr w:type="spellEnd"/>
+      <w:r>
+        <w:t>:</w:t>
+      </w:r>
+    </w:p>
+    <w:p>
+      <w:r>
+        <w:lastRenderedPageBreak/>
+        <w:drawing>
+          <wp:inline distT="0" distB="0" distL="0" distR="0" wp14:anchorId="6DDC6B63" wp14:editId="1475C231">
+            <wp:extent cx="2880000" cy="3732923"/>
+            <wp:effectExtent l="0" t="0" r="0" b="1270"/>
+            <wp:docPr id="923912147" name="Picture 1"/>
+            <wp:cNvGraphicFramePr>
+              <a:graphicFrameLocks xmlns:a="http://schemas.openxmlformats.org/drawingml/2006/main" noChangeAspect="1"/>
+            </wp:cNvGraphicFramePr>
+            <a:graphic xmlns:a="http://schemas.openxmlformats.org/drawingml/2006/main">
+              <a:graphicData uri="http://schemas.openxmlformats.org/drawingml/2006/picture">
+                <pic:pic xmlns:pic="http://schemas.openxmlformats.org/drawingml/2006/picture">
+                  <pic:nvPicPr>
+                    <pic:cNvPr id="923912147" name=""/>
+                    <pic:cNvPicPr/>
+                  </pic:nvPicPr>
+                  <pic:blipFill>
+                    <a:blip r:embed="rId44"/>
+                    <a:stretch>
+                      <a:fillRect/>
+                    </a:stretch>
+                  </pic:blipFill>
+                  <pic:spPr>
+                    <a:xfrm>
+                      <a:off x="0" y="0"/>
+                      <a:ext cx="2880000" cy="3732923"/>
+                    </a:xfrm>
+                    <a:prstGeom prst="rect">
+                      <a:avLst/>
+                    </a:prstGeom>
+                  </pic:spPr>
+                </pic:pic>
+              </a:graphicData>
+            </a:graphic>
+          </wp:inline>
+        </w:drawing>
+      </w:r>
+    </w:p>
+    <w:p>
+      <w:proofErr w:type="spellStart"/>
+      <w:r>
+        <w:t>Jalankan</w:t>
+      </w:r>
+      <w:proofErr w:type="spellEnd"/>
+      <w:r>
+        <w:t xml:space="preserve"> </w:t>
+      </w:r>
+      <w:proofErr w:type="spellStart"/>
+      <w:r>
+        <w:t>npm</w:t>
+      </w:r>
+      <w:proofErr w:type="spellEnd"/>
+      <w:r>
+        <w:t xml:space="preserve"> run </w:t>
+      </w:r>
+      <w:proofErr w:type="spellStart"/>
+      <w:proofErr w:type="gramStart"/>
+      <w:r>
+        <w:t>test:coverage</w:t>
+      </w:r>
+      <w:proofErr w:type="spellEnd"/>
+      <w:proofErr w:type="gramEnd"/>
+    </w:p>
+    <w:p>
+      <w:r>
+        <w:drawing>
+          <wp:inline distT="0" distB="0" distL="0" distR="0" wp14:anchorId="41F727C8" wp14:editId="0F9430F4">
+            <wp:extent cx="2880000" cy="3826769"/>
+            <wp:effectExtent l="0" t="0" r="0" b="2540"/>
+            <wp:docPr id="1815948597" name="Picture 1"/>
+            <wp:cNvGraphicFramePr>
+              <a:graphicFrameLocks xmlns:a="http://schemas.openxmlformats.org/drawingml/2006/main" noChangeAspect="1"/>
+            </wp:cNvGraphicFramePr>
+            <a:graphic xmlns:a="http://schemas.openxmlformats.org/drawingml/2006/main">
+              <a:graphicData uri="http://schemas.openxmlformats.org/drawingml/2006/picture">
+                <pic:pic xmlns:pic="http://schemas.openxmlformats.org/drawingml/2006/picture">
+                  <pic:nvPicPr>
+                    <pic:cNvPr id="1815948597" name=""/>
+                    <pic:cNvPicPr/>
+                  </pic:nvPicPr>
+                  <pic:blipFill>
+                    <a:blip r:embed="rId45"/>
+                    <a:stretch>
+                      <a:fillRect/>
+                    </a:stretch>
+                  </pic:blipFill>
+                  <pic:spPr>
+                    <a:xfrm>
+                      <a:off x="0" y="0"/>
+                      <a:ext cx="2880000" cy="3826769"/>
+                    </a:xfrm>
+                    <a:prstGeom prst="rect">
+                      <a:avLst/>
+                    </a:prstGeom>
+                  </pic:spPr>
+                </pic:pic>
+              </a:graphicData>
+            </a:graphic>
+          </wp:inline>
+        </w:drawing>
+      </w:r>
+    </w:p>
+    <w:p>
+      <w:r>
+        <w:lastRenderedPageBreak/>
+        <w:t xml:space="preserve">Jika </w:t>
+      </w:r>
+      <w:proofErr w:type="spellStart"/>
+      <w:r>
+        <w:t>dilihat</w:t>
+      </w:r>
+      <w:proofErr w:type="spellEnd"/>
+      <w:r>
+        <w:t xml:space="preserve"> di </w:t>
+      </w:r>
+      <w:proofErr w:type="spellStart"/>
+      <w:proofErr w:type="gramStart"/>
+      <w:r>
+        <w:t>index.htmlnya</w:t>
+      </w:r>
+      <w:proofErr w:type="spellEnd"/>
+      <w:proofErr w:type="gramEnd"/>
+    </w:p>
+    <w:p>
+      <w:r>
+        <w:drawing>
+          <wp:inline distT="0" distB="0" distL="0" distR="0" wp14:anchorId="79D922A2" wp14:editId="2AD9E154">
+            <wp:extent cx="2880000" cy="1552615"/>
+            <wp:effectExtent l="0" t="0" r="0" b="0"/>
+            <wp:docPr id="1253264570" name="Picture 1"/>
+            <wp:cNvGraphicFramePr>
+              <a:graphicFrameLocks xmlns:a="http://schemas.openxmlformats.org/drawingml/2006/main" noChangeAspect="1"/>
+            </wp:cNvGraphicFramePr>
+            <a:graphic xmlns:a="http://schemas.openxmlformats.org/drawingml/2006/main">
+              <a:graphicData uri="http://schemas.openxmlformats.org/drawingml/2006/picture">
+                <pic:pic xmlns:pic="http://schemas.openxmlformats.org/drawingml/2006/picture">
+                  <pic:nvPicPr>
+                    <pic:cNvPr id="1253264570" name=""/>
+                    <pic:cNvPicPr/>
+                  </pic:nvPicPr>
+                  <pic:blipFill>
+                    <a:blip r:embed="rId46"/>
+                    <a:stretch>
+                      <a:fillRect/>
+                    </a:stretch>
+                  </pic:blipFill>
+                  <pic:spPr>
+                    <a:xfrm>
+                      <a:off x="0" y="0"/>
+                      <a:ext cx="2880000" cy="1552615"/>
+                    </a:xfrm>
+                    <a:prstGeom prst="rect">
+                      <a:avLst/>
+                    </a:prstGeom>
+                  </pic:spPr>
+                </pic:pic>
+              </a:graphicData>
+            </a:graphic>
+          </wp:inline>
+        </w:drawing>
       </w:r>
     </w:p>
     <w:p/>

</xml_diff>